<commit_message>
Enhances document processing with tour data
Improves the document generation process by fetching and utilizing tour data, including city names and tour titles, to populate document templates.

This change allows for more dynamic and accurate information in generated documents, enhancing the user experience and reducing manual input.

It also addresses a specific user request for `TOUR NAME` and `CITY NAMES` tags replacement in the generated documents.

The logic now prioritizes actual tour data for generating selected cities and tour names, falling back to legacy methods if the data is unavailable.
</commit_message>
<xml_diff>
--- a/ucv-fe/public/IUC_Invoice VAT_UNIVERSITY_template.docx
+++ b/ucv-fe/public/IUC_Invoice VAT_UNIVERSITY_template.docx
@@ -1149,6 +1149,11 @@
             <w:r>
               <w:t>UCV School Tour</w:t>
             </w:r>
+            <w:r>
+              <w:t xml:space="preserve"> ([CITY NAMES])</w:t>
+            </w:r>
+            <w:bookmarkStart w:id="0" w:name="_GoBack"/>
+            <w:bookmarkEnd w:id="0"/>
           </w:p>
           <w:p>
             <w:pPr>
@@ -1220,7 +1225,6 @@
             <w:r>
               <w:rPr>
                 <w:color w:val="000000"/>
-                <w:sz w:val="24"/>
               </w:rPr>
               <w:t>[FINAL PRICE]</w:t>
             </w:r>
@@ -1251,7 +1255,6 @@
             <w:r>
               <w:rPr>
                 <w:color w:val="000000"/>
-                <w:sz w:val="24"/>
               </w:rPr>
               <w:t>[FINAL PRICE]</w:t>
             </w:r>
@@ -1335,7 +1338,6 @@
             <w:r>
               <w:rPr>
                 <w:color w:val="000000"/>
-                <w:sz w:val="28"/>
               </w:rPr>
               <w:t xml:space="preserve">[FINAL PRICE] </w:t>
             </w:r>
@@ -1447,8 +1449,6 @@
                 <w:tab w:val="left" w:pos="1660"/>
               </w:tabs>
             </w:pPr>
-            <w:bookmarkStart w:id="0" w:name="_GoBack"/>
-            <w:bookmarkEnd w:id="0"/>
           </w:p>
         </w:tc>
         <w:tc>
@@ -1547,6 +1547,233 @@
       </w:pPr>
       <w:bookmarkStart w:id="1" w:name="_heading=h.gjdgxs" w:colFirst="0" w:colLast="0"/>
       <w:bookmarkEnd w:id="1"/>
+    </w:p>
+    <w:p>
+      <w:pPr>
+        <w:spacing w:after="0" w:line="240" w:lineRule="auto"/>
+        <w:ind w:firstLine="360"/>
+        <w:textDirection w:val="btLr"/>
+      </w:pPr>
+      <w:r>
+        <w:rPr>
+          <w:b/>
+          <w:color w:val="000000"/>
+          <w:sz w:val="28"/>
+        </w:rPr>
+        <w:t>Bank transfer:</w:t>
+      </w:r>
+    </w:p>
+    <w:p>
+      <w:pPr>
+        <w:pStyle w:val="ListParagraph"/>
+        <w:numPr>
+          <w:ilvl w:val="0"/>
+          <w:numId w:val="2"/>
+        </w:numPr>
+        <w:spacing w:after="0" w:line="240" w:lineRule="auto"/>
+        <w:textDirection w:val="btLr"/>
+      </w:pPr>
+      <w:r>
+        <w:rPr>
+          <w:b/>
+          <w:color w:val="000000"/>
+        </w:rPr>
+        <w:t>Bank:</w:t>
+      </w:r>
+      <w:r>
+        <w:rPr>
+          <w:color w:val="000000"/>
+        </w:rPr>
+        <w:t xml:space="preserve"> Vietcombank (Joint Stock Commercial Bank for Foreign Trade of Vietnam)</w:t>
+      </w:r>
+    </w:p>
+    <w:p>
+      <w:pPr>
+        <w:pStyle w:val="ListParagraph"/>
+        <w:numPr>
+          <w:ilvl w:val="0"/>
+          <w:numId w:val="2"/>
+        </w:numPr>
+        <w:spacing w:after="0" w:line="240" w:lineRule="auto"/>
+        <w:textDirection w:val="btLr"/>
+      </w:pPr>
+      <w:r>
+        <w:rPr>
+          <w:b/>
+          <w:color w:val="000000"/>
+        </w:rPr>
+        <w:t>Branch:</w:t>
+      </w:r>
+      <w:r>
+        <w:rPr>
+          <w:color w:val="000000"/>
+        </w:rPr>
+        <w:t xml:space="preserve"> </w:t>
+      </w:r>
+      <w:r>
+        <w:rPr>
+          <w:color w:val="202124"/>
+          <w:highlight w:val="white"/>
+        </w:rPr>
+        <w:t>Phòng Giao Dịch Hội An</w:t>
+      </w:r>
+    </w:p>
+    <w:p>
+      <w:pPr>
+        <w:pStyle w:val="ListParagraph"/>
+        <w:numPr>
+          <w:ilvl w:val="0"/>
+          <w:numId w:val="2"/>
+        </w:numPr>
+        <w:spacing w:after="0" w:line="240" w:lineRule="auto"/>
+        <w:textDirection w:val="btLr"/>
+      </w:pPr>
+      <w:r>
+        <w:rPr>
+          <w:b/>
+          <w:color w:val="000000"/>
+        </w:rPr>
+        <w:t>Bank Acc Name</w:t>
+      </w:r>
+      <w:r>
+        <w:rPr>
+          <w:b/>
+          <w:color w:val="000000"/>
+        </w:rPr>
+        <w:t>:</w:t>
+      </w:r>
+      <w:r>
+        <w:rPr>
+          <w:color w:val="000000"/>
+        </w:rPr>
+        <w:t xml:space="preserve"> Cong Ty TNHH Universal Connect VN</w:t>
+      </w:r>
+    </w:p>
+    <w:p>
+      <w:pPr>
+        <w:pStyle w:val="ListParagraph"/>
+        <w:numPr>
+          <w:ilvl w:val="0"/>
+          <w:numId w:val="2"/>
+        </w:numPr>
+        <w:spacing w:after="0" w:line="240" w:lineRule="auto"/>
+        <w:textDirection w:val="btLr"/>
+        <w:rPr>
+          <w:color w:val="202124"/>
+          <w:highlight w:val="white"/>
+        </w:rPr>
+      </w:pPr>
+      <w:r>
+        <w:rPr>
+          <w:b/>
+          <w:color w:val="000000"/>
+        </w:rPr>
+        <w:t>Bank Address:</w:t>
+      </w:r>
+      <w:r>
+        <w:rPr>
+          <w:color w:val="000000"/>
+        </w:rPr>
+        <w:t xml:space="preserve"> </w:t>
+      </w:r>
+      <w:r>
+        <w:rPr>
+          <w:color w:val="202124"/>
+          <w:highlight w:val="white"/>
+        </w:rPr>
+        <w:t>02, Đường Trần Cao Vân, Phường Cẩm Phô, Thành Phố Hội An,</w:t>
+      </w:r>
+    </w:p>
+    <w:p>
+      <w:pPr>
+        <w:pStyle w:val="ListParagraph"/>
+        <w:numPr>
+          <w:ilvl w:val="0"/>
+          <w:numId w:val="2"/>
+        </w:numPr>
+        <w:spacing w:after="0" w:line="240" w:lineRule="auto"/>
+        <w:textDirection w:val="btLr"/>
+      </w:pPr>
+      <w:r>
+        <w:rPr>
+          <w:color w:val="202124"/>
+          <w:highlight w:val="white"/>
+        </w:rPr>
+        <w:t>Phường Minh An, Hội An, Quảng Nam</w:t>
+      </w:r>
+    </w:p>
+    <w:p>
+      <w:pPr>
+        <w:pStyle w:val="ListParagraph"/>
+        <w:numPr>
+          <w:ilvl w:val="0"/>
+          <w:numId w:val="2"/>
+        </w:numPr>
+        <w:spacing w:after="0" w:line="240" w:lineRule="auto"/>
+        <w:textDirection w:val="btLr"/>
+      </w:pPr>
+      <w:r>
+        <w:rPr>
+          <w:b/>
+          <w:color w:val="000000"/>
+        </w:rPr>
+        <w:t>Bank Acc Number:</w:t>
+      </w:r>
+      <w:r>
+        <w:rPr>
+          <w:color w:val="000000"/>
+        </w:rPr>
+        <w:t xml:space="preserve"> 1034923884</w:t>
+      </w:r>
+    </w:p>
+    <w:p>
+      <w:pPr>
+        <w:pStyle w:val="ListParagraph"/>
+        <w:numPr>
+          <w:ilvl w:val="0"/>
+          <w:numId w:val="2"/>
+        </w:numPr>
+        <w:spacing w:after="0" w:line="240" w:lineRule="auto"/>
+        <w:textDirection w:val="btLr"/>
+      </w:pPr>
+      <w:r>
+        <w:rPr>
+          <w:b/>
+          <w:color w:val="000000"/>
+        </w:rPr>
+        <w:t>SWIFT:</w:t>
+      </w:r>
+      <w:r>
+        <w:rPr>
+          <w:color w:val="000000"/>
+        </w:rPr>
+        <w:t xml:space="preserve"> BFTVVNVX</w:t>
+      </w:r>
+    </w:p>
+    <w:p>
+      <w:pPr>
+        <w:tabs>
+          <w:tab w:val="left" w:pos="1660"/>
+        </w:tabs>
+      </w:pPr>
+    </w:p>
+    <w:p>
+      <w:pPr>
+        <w:tabs>
+          <w:tab w:val="left" w:pos="1660"/>
+        </w:tabs>
+      </w:pPr>
+    </w:p>
+    <w:p>
+      <w:pPr>
+        <w:spacing w:line="258" w:lineRule="auto"/>
+        <w:ind w:firstLine="360"/>
+        <w:textDirection w:val="btLr"/>
+        <w:rPr>
+          <w:color w:val="000000"/>
+          <w:sz w:val="28"/>
+        </w:rPr>
+      </w:pPr>
       <w:r>
         <w:rPr>
           <w:noProof/>
@@ -1554,754 +1781,13 @@
         <mc:AlternateContent>
           <mc:Choice Requires="wps">
             <w:drawing>
-              <wp:anchor distT="45720" distB="45720" distL="114300" distR="114300" simplePos="0" relativeHeight="251669504" behindDoc="0" locked="0" layoutInCell="1" hidden="0" allowOverlap="1" wp14:anchorId="19A0AFF6" wp14:editId="448B372D">
+              <wp:anchor distT="45720" distB="45720" distL="114300" distR="114300" simplePos="0" relativeHeight="251670528" behindDoc="0" locked="0" layoutInCell="1" hidden="0" allowOverlap="1" wp14:anchorId="06B8548E" wp14:editId="689084E7">
                 <wp:simplePos x="0" y="0"/>
                 <wp:positionH relativeFrom="column">
-                  <wp:posOffset>342900</wp:posOffset>
+                  <wp:posOffset>3987800</wp:posOffset>
                 </wp:positionH>
                 <wp:positionV relativeFrom="paragraph">
-                  <wp:posOffset>2228850</wp:posOffset>
-                </wp:positionV>
-                <wp:extent cx="2438400" cy="998220"/>
-                <wp:effectExtent l="0" t="0" r="0" b="0"/>
-                <wp:wrapSquare wrapText="bothSides" distT="45720" distB="45720" distL="114300" distR="114300"/>
-                <wp:docPr id="232" name="Rectangle 232"/>
-                <wp:cNvGraphicFramePr/>
-                <a:graphic xmlns:a="http://schemas.openxmlformats.org/drawingml/2006/main">
-                  <a:graphicData uri="http://schemas.microsoft.com/office/word/2010/wordprocessingShape">
-                    <wps:wsp>
-                      <wps:cNvSpPr/>
-                      <wps:spPr>
-                        <a:xfrm>
-                          <a:off x="0" y="0"/>
-                          <a:ext cx="2438400" cy="998220"/>
-                        </a:xfrm>
-                        <a:prstGeom prst="rect">
-                          <a:avLst/>
-                        </a:prstGeom>
-                        <a:solidFill>
-                          <a:srgbClr val="FFFFFF"/>
-                        </a:solidFill>
-                        <a:ln>
-                          <a:noFill/>
-                        </a:ln>
-                      </wps:spPr>
-                      <wps:txbx>
-                        <w:txbxContent>
-                          <w:p>
-                            <w:pPr>
-                              <w:spacing w:line="258" w:lineRule="auto"/>
-                              <w:textDirection w:val="btLr"/>
-                            </w:pPr>
-                            <w:r>
-                              <w:rPr>
-                                <w:color w:val="000000"/>
-                                <w:sz w:val="28"/>
-                              </w:rPr>
-                              <w:t>Thank you for trusting us in supporting you!</w:t>
-                            </w:r>
-                          </w:p>
-                        </w:txbxContent>
-                      </wps:txbx>
-                      <wps:bodyPr spcFirstLastPara="1" wrap="square" lIns="91425" tIns="45700" rIns="91425" bIns="45700" anchor="t" anchorCtr="0">
-                        <a:noAutofit/>
-                      </wps:bodyPr>
-                    </wps:wsp>
-                  </a:graphicData>
-                </a:graphic>
-                <wp14:sizeRelH relativeFrom="margin">
-                  <wp14:pctWidth>0</wp14:pctWidth>
-                </wp14:sizeRelH>
-                <wp14:sizeRelV relativeFrom="margin">
-                  <wp14:pctHeight>0</wp14:pctHeight>
-                </wp14:sizeRelV>
-              </wp:anchor>
-            </w:drawing>
-          </mc:Choice>
-          <mc:Fallback>
-            <w:pict>
-              <v:rect w14:anchorId="19A0AFF6" id="Rectangle 232" o:spid="_x0000_s1031" style="position:absolute;margin-left:27pt;margin-top:175.5pt;width:192pt;height:78.6pt;z-index:251669504;visibility:visible;mso-wrap-style:square;mso-width-percent:0;mso-height-percent:0;mso-wrap-distance-left:9pt;mso-wrap-distance-top:3.6pt;mso-wrap-distance-right:9pt;mso-wrap-distance-bottom:3.6pt;mso-position-horizontal:absolute;mso-position-horizontal-relative:text;mso-position-vertical:absolute;mso-position-vertical-relative:text;mso-width-percent:0;mso-height-percent:0;mso-width-relative:margin;mso-height-relative:margin;v-text-anchor:top" o:gfxdata="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" stroked="f">
-                <v:textbox inset="2.53958mm,1.2694mm,2.53958mm,1.2694mm">
-                  <w:txbxContent>
-                    <w:p>
-                      <w:pPr>
-                        <w:spacing w:line="258" w:lineRule="auto"/>
-                        <w:textDirection w:val="btLr"/>
-                      </w:pPr>
-                      <w:r>
-                        <w:rPr>
-                          <w:color w:val="000000"/>
-                          <w:sz w:val="28"/>
-                        </w:rPr>
-                        <w:t>Thank you for trusting us in supporting you!</w:t>
-                      </w:r>
-                    </w:p>
-                  </w:txbxContent>
-                </v:textbox>
-                <w10:wrap type="square"/>
-              </v:rect>
-            </w:pict>
-          </mc:Fallback>
-        </mc:AlternateContent>
-      </w:r>
-      <w:r>
-        <w:rPr>
-          <w:noProof/>
-        </w:rPr>
-        <mc:AlternateContent>
-          <mc:Choice Requires="wps">
-            <w:drawing>
-              <wp:anchor distT="0" distB="0" distL="114300" distR="114300" simplePos="0" relativeHeight="251666432" behindDoc="0" locked="0" layoutInCell="1" hidden="0" allowOverlap="1" wp14:anchorId="55014CA7" wp14:editId="2DE68859">
-                <wp:simplePos x="0" y="0"/>
-                <wp:positionH relativeFrom="column">
-                  <wp:posOffset>4140200</wp:posOffset>
-                </wp:positionH>
-                <wp:positionV relativeFrom="paragraph">
-                  <wp:posOffset>2565400</wp:posOffset>
-                </wp:positionV>
-                <wp:extent cx="0" cy="19050"/>
-                <wp:effectExtent l="0" t="0" r="0" b="0"/>
-                <wp:wrapNone/>
-                <wp:docPr id="242" name="Straight Arrow Connector 242"/>
-                <wp:cNvGraphicFramePr/>
-                <a:graphic xmlns:a="http://schemas.openxmlformats.org/drawingml/2006/main">
-                  <a:graphicData uri="http://schemas.microsoft.com/office/word/2010/wordprocessingShape">
-                    <wps:wsp>
-                      <wps:cNvCnPr/>
-                      <wps:spPr>
-                        <a:xfrm>
-                          <a:off x="4568125" y="3780000"/>
-                          <a:ext cx="1555750" cy="0"/>
-                        </a:xfrm>
-                        <a:prstGeom prst="straightConnector1">
-                          <a:avLst/>
-                        </a:prstGeom>
-                        <a:noFill/>
-                        <a:ln w="19050" cap="flat" cmpd="sng">
-                          <a:solidFill>
-                            <a:srgbClr val="0070C0"/>
-                          </a:solidFill>
-                          <a:prstDash val="solid"/>
-                          <a:miter lim="800000"/>
-                          <a:headEnd type="none" w="sm" len="sm"/>
-                          <a:tailEnd type="none" w="sm" len="sm"/>
-                        </a:ln>
-                      </wps:spPr>
-                      <wps:bodyPr/>
-                    </wps:wsp>
-                  </a:graphicData>
-                </a:graphic>
-              </wp:anchor>
-            </w:drawing>
-          </mc:Choice>
-          <mc:Fallback xmlns:cr="http://schemas.microsoft.com/office/comments/2020/reactions" xmlns="http://schemas.microsoft.com/office/tasks/2019/documenttasks" xmlns:w16cid="http://schemas.microsoft.com/office/word/2016/wordml/cid" xmlns:w16cex="http://schemas.microsoft.com/office/word/2018/wordml/cex" xmlns:w16="http://schemas.microsoft.com/office/word/2018/wordml" xmlns:dgm="http://schemas.openxmlformats.org/drawingml/2006/diagram" xmlns:lc="http://schemas.openxmlformats.org/drawingml/2006/lockedCanvas" xmlns:c="http://schemas.openxmlformats.org/drawingml/2006/chart" xmlns:pic="http://schemas.openxmlformats.org/drawingml/2006/picture" xmlns:a="http://schemas.openxmlformats.org/drawingml/2006/main" xmlns:sl="http://schemas.openxmlformats.org/schemaLibrary/2006/main">
-            <w:drawing>
-              <wp:anchor allowOverlap="1" behindDoc="0" distB="0" distT="0" distL="114300" distR="114300" hidden="0" layoutInCell="1" locked="0" relativeHeight="0" simplePos="0">
-                <wp:simplePos x="0" y="0"/>
-                <wp:positionH relativeFrom="column">
-                  <wp:posOffset>4140200</wp:posOffset>
-                </wp:positionH>
-                <wp:positionV relativeFrom="paragraph">
-                  <wp:posOffset>2565400</wp:posOffset>
-                </wp:positionV>
-                <wp:extent cx="0" cy="19050"/>
-                <wp:effectExtent b="0" l="0" r="0" t="0"/>
-                <wp:wrapNone/>
-                <wp:docPr id="242" name="image13.png"/>
-                <a:graphic>
-                  <a:graphicData uri="http://schemas.openxmlformats.org/drawingml/2006/picture">
-                    <pic:pic>
-                      <pic:nvPicPr>
-                        <pic:cNvPr id="0" name="image13.png"/>
-                        <pic:cNvPicPr preferRelativeResize="0"/>
-                      </pic:nvPicPr>
-                      <pic:blipFill>
-                        <a:blip r:embed="rId7"/>
-                        <a:srcRect/>
-                        <a:stretch>
-                          <a:fillRect/>
-                        </a:stretch>
-                      </pic:blipFill>
-                      <pic:spPr>
-                        <a:xfrm>
-                          <a:off x="0" y="0"/>
-                          <a:ext cx="0" cy="19050"/>
-                        </a:xfrm>
-                        <a:prstGeom prst="rect"/>
-                        <a:ln/>
-                      </pic:spPr>
-                    </pic:pic>
-                  </a:graphicData>
-                </a:graphic>
-              </wp:anchor>
-            </w:drawing>
-          </mc:Fallback>
-        </mc:AlternateContent>
-      </w:r>
-      <w:r>
-        <w:rPr>
-          <w:noProof/>
-        </w:rPr>
-        <mc:AlternateContent>
-          <mc:Choice Requires="wps">
-            <w:drawing>
-              <wp:anchor distT="0" distB="0" distL="114300" distR="114300" simplePos="0" relativeHeight="251667456" behindDoc="0" locked="0" layoutInCell="1" hidden="0" allowOverlap="1" wp14:anchorId="00098478" wp14:editId="082BA3AC">
-                <wp:simplePos x="0" y="0"/>
-                <wp:positionH relativeFrom="column">
-                  <wp:posOffset>-914399</wp:posOffset>
-                </wp:positionH>
-                <wp:positionV relativeFrom="paragraph">
-                  <wp:posOffset>3454400</wp:posOffset>
-                </wp:positionV>
-                <wp:extent cx="7829550" cy="647700"/>
-                <wp:effectExtent l="0" t="0" r="0" b="0"/>
-                <wp:wrapNone/>
-                <wp:docPr id="238" name="Rectangle 238"/>
-                <wp:cNvGraphicFramePr/>
-                <a:graphic xmlns:a="http://schemas.openxmlformats.org/drawingml/2006/main">
-                  <a:graphicData uri="http://schemas.microsoft.com/office/word/2010/wordprocessingShape">
-                    <wps:wsp>
-                      <wps:cNvSpPr/>
-                      <wps:spPr>
-                        <a:xfrm>
-                          <a:off x="1443925" y="3468850"/>
-                          <a:ext cx="7804150" cy="622300"/>
-                        </a:xfrm>
-                        <a:prstGeom prst="rect">
-                          <a:avLst/>
-                        </a:prstGeom>
-                        <a:solidFill>
-                          <a:srgbClr val="0070C0"/>
-                        </a:solidFill>
-                        <a:ln w="12700" cap="flat" cmpd="sng">
-                          <a:solidFill>
-                            <a:srgbClr val="42719B"/>
-                          </a:solidFill>
-                          <a:prstDash val="solid"/>
-                          <a:miter lim="800000"/>
-                          <a:headEnd type="none" w="sm" len="sm"/>
-                          <a:tailEnd type="none" w="sm" len="sm"/>
-                        </a:ln>
-                      </wps:spPr>
-                      <wps:txbx>
-                        <w:txbxContent>
-                          <w:p>
-                            <w:pPr>
-                              <w:spacing w:after="0" w:line="240" w:lineRule="auto"/>
-                              <w:textDirection w:val="btLr"/>
-                            </w:pPr>
-                          </w:p>
-                        </w:txbxContent>
-                      </wps:txbx>
-                      <wps:bodyPr spcFirstLastPara="1" wrap="square" lIns="91425" tIns="91425" rIns="91425" bIns="91425" anchor="ctr" anchorCtr="0">
-                        <a:noAutofit/>
-                      </wps:bodyPr>
-                    </wps:wsp>
-                  </a:graphicData>
-                </a:graphic>
-              </wp:anchor>
-            </w:drawing>
-          </mc:Choice>
-          <mc:Fallback>
-            <w:pict>
-              <v:rect w14:anchorId="00098478" id="Rectangle 238" o:spid="_x0000_s1032" style="position:absolute;margin-left:-1in;margin-top:272pt;width:616.5pt;height:51pt;z-index:251667456;visibility:visible;mso-wrap-style:square;mso-wrap-distance-left:9pt;mso-wrap-distance-top:0;mso-wrap-distance-right:9pt;mso-wrap-distance-bottom:0;mso-position-horizontal:absolute;mso-position-horizontal-relative:text;mso-position-vertical:absolute;mso-position-vertical-relative:text;v-text-anchor:middle" o:gfxdata="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" fillcolor="#0070c0" strokecolor="#42719b" strokeweight="1pt">
-                <v:stroke startarrowwidth="narrow" startarrowlength="short" endarrowwidth="narrow" endarrowlength="short"/>
-                <v:textbox inset="2.53958mm,2.53958mm,2.53958mm,2.53958mm">
-                  <w:txbxContent>
-                    <w:p>
-                      <w:pPr>
-                        <w:spacing w:after="0" w:line="240" w:lineRule="auto"/>
-                        <w:textDirection w:val="btLr"/>
-                      </w:pPr>
-                    </w:p>
-                  </w:txbxContent>
-                </v:textbox>
-              </v:rect>
-            </w:pict>
-          </mc:Fallback>
-        </mc:AlternateContent>
-      </w:r>
-      <w:r>
-        <w:rPr>
-          <w:noProof/>
-        </w:rPr>
-        <mc:AlternateContent>
-          <mc:Choice Requires="wps">
-            <w:drawing>
-              <wp:anchor distT="45720" distB="45720" distL="114300" distR="114300" simplePos="0" relativeHeight="251668480" behindDoc="0" locked="0" layoutInCell="1" hidden="0" allowOverlap="1" wp14:anchorId="0D32BA2E" wp14:editId="6E1D3CC9">
-                <wp:simplePos x="0" y="0"/>
-                <wp:positionH relativeFrom="column">
-                  <wp:posOffset>171450</wp:posOffset>
-                </wp:positionH>
-                <wp:positionV relativeFrom="paragraph">
-                  <wp:posOffset>95868</wp:posOffset>
-                </wp:positionV>
-                <wp:extent cx="5753100" cy="1752600"/>
-                <wp:effectExtent l="0" t="0" r="0" b="0"/>
-                <wp:wrapSquare wrapText="bothSides" distT="45720" distB="45720" distL="114300" distR="114300"/>
-                <wp:docPr id="235" name="Rectangle 235"/>
-                <wp:cNvGraphicFramePr/>
-                <a:graphic xmlns:a="http://schemas.openxmlformats.org/drawingml/2006/main">
-                  <a:graphicData uri="http://schemas.microsoft.com/office/word/2010/wordprocessingShape">
-                    <wps:wsp>
-                      <wps:cNvSpPr/>
-                      <wps:spPr>
-                        <a:xfrm>
-                          <a:off x="2478975" y="2913225"/>
-                          <a:ext cx="5734050" cy="1733550"/>
-                        </a:xfrm>
-                        <a:prstGeom prst="rect">
-                          <a:avLst/>
-                        </a:prstGeom>
-                        <a:solidFill>
-                          <a:srgbClr val="FFFFFF"/>
-                        </a:solidFill>
-                        <a:ln>
-                          <a:noFill/>
-                        </a:ln>
-                      </wps:spPr>
-                      <wps:txbx>
-                        <w:txbxContent>
-                          <w:p>
-                            <w:pPr>
-                              <w:spacing w:after="0" w:line="240" w:lineRule="auto"/>
-                              <w:textDirection w:val="btLr"/>
-                            </w:pPr>
-                            <w:r>
-                              <w:rPr>
-                                <w:b/>
-                                <w:color w:val="000000"/>
-                                <w:sz w:val="28"/>
-                              </w:rPr>
-                              <w:t>Bank transfer:</w:t>
-                            </w:r>
-                          </w:p>
-                          <w:p>
-                            <w:pPr>
-                              <w:pStyle w:val="ListParagraph"/>
-                              <w:numPr>
-                                <w:ilvl w:val="0"/>
-                                <w:numId w:val="2"/>
-                              </w:numPr>
-                              <w:spacing w:after="0" w:line="240" w:lineRule="auto"/>
-                              <w:textDirection w:val="btLr"/>
-                            </w:pPr>
-                            <w:r>
-                              <w:rPr>
-                                <w:b/>
-                                <w:color w:val="000000"/>
-                              </w:rPr>
-                              <w:t>Bank:</w:t>
-                            </w:r>
-                            <w:r>
-                              <w:rPr>
-                                <w:color w:val="000000"/>
-                              </w:rPr>
-                              <w:t xml:space="preserve"> Vietcombank (Joint Stock Commercial Bank for Foreign Trade of Vietnam)</w:t>
-                            </w:r>
-                          </w:p>
-                          <w:p>
-                            <w:pPr>
-                              <w:pStyle w:val="ListParagraph"/>
-                              <w:numPr>
-                                <w:ilvl w:val="0"/>
-                                <w:numId w:val="2"/>
-                              </w:numPr>
-                              <w:spacing w:after="0" w:line="240" w:lineRule="auto"/>
-                              <w:textDirection w:val="btLr"/>
-                            </w:pPr>
-                            <w:r>
-                              <w:rPr>
-                                <w:b/>
-                                <w:color w:val="000000"/>
-                              </w:rPr>
-                              <w:t>Branch:</w:t>
-                            </w:r>
-                            <w:r>
-                              <w:rPr>
-                                <w:color w:val="000000"/>
-                              </w:rPr>
-                              <w:t xml:space="preserve"> </w:t>
-                            </w:r>
-                            <w:r>
-                              <w:rPr>
-                                <w:color w:val="202124"/>
-                                <w:highlight w:val="white"/>
-                              </w:rPr>
-                              <w:t>Phòng Giao Dịch Hội An</w:t>
-                            </w:r>
-                          </w:p>
-                          <w:p>
-                            <w:pPr>
-                              <w:pStyle w:val="ListParagraph"/>
-                              <w:numPr>
-                                <w:ilvl w:val="0"/>
-                                <w:numId w:val="2"/>
-                              </w:numPr>
-                              <w:spacing w:after="0" w:line="240" w:lineRule="auto"/>
-                              <w:textDirection w:val="btLr"/>
-                            </w:pPr>
-                            <w:r>
-                              <w:rPr>
-                                <w:b/>
-                                <w:color w:val="000000"/>
-                              </w:rPr>
-                              <w:t>Bank Acc Name:</w:t>
-                            </w:r>
-                            <w:r>
-                              <w:rPr>
-                                <w:color w:val="000000"/>
-                              </w:rPr>
-                              <w:t xml:space="preserve"> Cong Ty TNHH Universal Connect VN</w:t>
-                            </w:r>
-                          </w:p>
-                          <w:p>
-                            <w:pPr>
-                              <w:pStyle w:val="ListParagraph"/>
-                              <w:numPr>
-                                <w:ilvl w:val="0"/>
-                                <w:numId w:val="2"/>
-                              </w:numPr>
-                              <w:spacing w:after="0" w:line="240" w:lineRule="auto"/>
-                              <w:textDirection w:val="btLr"/>
-                              <w:rPr>
-                                <w:color w:val="202124"/>
-                                <w:highlight w:val="white"/>
-                              </w:rPr>
-                            </w:pPr>
-                            <w:r>
-                              <w:rPr>
-                                <w:b/>
-                                <w:color w:val="000000"/>
-                              </w:rPr>
-                              <w:t>Bank Address:</w:t>
-                            </w:r>
-                            <w:r>
-                              <w:rPr>
-                                <w:color w:val="000000"/>
-                              </w:rPr>
-                              <w:t xml:space="preserve"> </w:t>
-                            </w:r>
-                            <w:r>
-                              <w:rPr>
-                                <w:color w:val="202124"/>
-                                <w:highlight w:val="white"/>
-                              </w:rPr>
-                              <w:t>02, Đường Trần Cao Vân, Phường Cẩm Phô, Thành Phố Hộ</w:t>
-                            </w:r>
-                            <w:r>
-                              <w:rPr>
-                                <w:color w:val="202124"/>
-                                <w:highlight w:val="white"/>
-                              </w:rPr>
-                              <w:t>i An,</w:t>
-                            </w:r>
-                          </w:p>
-                          <w:p>
-                            <w:pPr>
-                              <w:pStyle w:val="ListParagraph"/>
-                              <w:numPr>
-                                <w:ilvl w:val="0"/>
-                                <w:numId w:val="2"/>
-                              </w:numPr>
-                              <w:spacing w:after="0" w:line="240" w:lineRule="auto"/>
-                              <w:textDirection w:val="btLr"/>
-                            </w:pPr>
-                            <w:r>
-                              <w:rPr>
-                                <w:color w:val="202124"/>
-                                <w:highlight w:val="white"/>
-                              </w:rPr>
-                              <w:t>Phường Minh An, Hội An, Quảng Nam</w:t>
-                            </w:r>
-                          </w:p>
-                          <w:p>
-                            <w:pPr>
-                              <w:pStyle w:val="ListParagraph"/>
-                              <w:numPr>
-                                <w:ilvl w:val="0"/>
-                                <w:numId w:val="2"/>
-                              </w:numPr>
-                              <w:spacing w:after="0" w:line="240" w:lineRule="auto"/>
-                              <w:textDirection w:val="btLr"/>
-                            </w:pPr>
-                            <w:r>
-                              <w:rPr>
-                                <w:b/>
-                                <w:color w:val="000000"/>
-                              </w:rPr>
-                              <w:t>Bank Acc Number:</w:t>
-                            </w:r>
-                            <w:r>
-                              <w:rPr>
-                                <w:color w:val="000000"/>
-                              </w:rPr>
-                              <w:t xml:space="preserve"> 1034923884</w:t>
-                            </w:r>
-                          </w:p>
-                          <w:p>
-                            <w:pPr>
-                              <w:pStyle w:val="ListParagraph"/>
-                              <w:numPr>
-                                <w:ilvl w:val="0"/>
-                                <w:numId w:val="2"/>
-                              </w:numPr>
-                              <w:spacing w:after="0" w:line="240" w:lineRule="auto"/>
-                              <w:textDirection w:val="btLr"/>
-                            </w:pPr>
-                            <w:r>
-                              <w:rPr>
-                                <w:b/>
-                                <w:color w:val="000000"/>
-                              </w:rPr>
-                              <w:t>SWIFT:</w:t>
-                            </w:r>
-                            <w:r>
-                              <w:rPr>
-                                <w:color w:val="000000"/>
-                              </w:rPr>
-                              <w:t xml:space="preserve"> BFTVVNVX</w:t>
-                            </w:r>
-                          </w:p>
-                        </w:txbxContent>
-                      </wps:txbx>
-                      <wps:bodyPr spcFirstLastPara="1" wrap="square" lIns="91425" tIns="45700" rIns="91425" bIns="45700" anchor="t" anchorCtr="0">
-                        <a:noAutofit/>
-                      </wps:bodyPr>
-                    </wps:wsp>
-                  </a:graphicData>
-                </a:graphic>
-              </wp:anchor>
-            </w:drawing>
-          </mc:Choice>
-          <mc:Fallback>
-            <w:pict>
-              <v:rect w14:anchorId="0D32BA2E" id="Rectangle 235" o:spid="_x0000_s1033" style="position:absolute;margin-left:13.5pt;margin-top:7.55pt;width:453pt;height:138pt;z-index:251668480;visibility:visible;mso-wrap-style:square;mso-wrap-distance-left:9pt;mso-wrap-distance-top:3.6pt;mso-wrap-distance-right:9pt;mso-wrap-distance-bottom:3.6pt;mso-position-horizontal:absolute;mso-position-horizontal-relative:text;mso-position-vertical:absolute;mso-position-vertical-relative:text;v-text-anchor:top" o:gfxdata="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" stroked="f">
-                <v:textbox inset="2.53958mm,1.2694mm,2.53958mm,1.2694mm">
-                  <w:txbxContent>
-                    <w:p>
-                      <w:pPr>
-                        <w:spacing w:after="0" w:line="240" w:lineRule="auto"/>
-                        <w:textDirection w:val="btLr"/>
-                      </w:pPr>
-                      <w:r>
-                        <w:rPr>
-                          <w:b/>
-                          <w:color w:val="000000"/>
-                          <w:sz w:val="28"/>
-                        </w:rPr>
-                        <w:t>Bank transfer:</w:t>
-                      </w:r>
-                    </w:p>
-                    <w:p>
-                      <w:pPr>
-                        <w:pStyle w:val="ListParagraph"/>
-                        <w:numPr>
-                          <w:ilvl w:val="0"/>
-                          <w:numId w:val="2"/>
-                        </w:numPr>
-                        <w:spacing w:after="0" w:line="240" w:lineRule="auto"/>
-                        <w:textDirection w:val="btLr"/>
-                      </w:pPr>
-                      <w:r>
-                        <w:rPr>
-                          <w:b/>
-                          <w:color w:val="000000"/>
-                        </w:rPr>
-                        <w:t>Bank:</w:t>
-                      </w:r>
-                      <w:r>
-                        <w:rPr>
-                          <w:color w:val="000000"/>
-                        </w:rPr>
-                        <w:t xml:space="preserve"> Vietcombank (Joint Stock Commercial Bank for Foreign Trade of Vietnam)</w:t>
-                      </w:r>
-                    </w:p>
-                    <w:p>
-                      <w:pPr>
-                        <w:pStyle w:val="ListParagraph"/>
-                        <w:numPr>
-                          <w:ilvl w:val="0"/>
-                          <w:numId w:val="2"/>
-                        </w:numPr>
-                        <w:spacing w:after="0" w:line="240" w:lineRule="auto"/>
-                        <w:textDirection w:val="btLr"/>
-                      </w:pPr>
-                      <w:r>
-                        <w:rPr>
-                          <w:b/>
-                          <w:color w:val="000000"/>
-                        </w:rPr>
-                        <w:t>Branch:</w:t>
-                      </w:r>
-                      <w:r>
-                        <w:rPr>
-                          <w:color w:val="000000"/>
-                        </w:rPr>
-                        <w:t xml:space="preserve"> </w:t>
-                      </w:r>
-                      <w:r>
-                        <w:rPr>
-                          <w:color w:val="202124"/>
-                          <w:highlight w:val="white"/>
-                        </w:rPr>
-                        <w:t>Phòng Giao Dịch Hội An</w:t>
-                      </w:r>
-                    </w:p>
-                    <w:p>
-                      <w:pPr>
-                        <w:pStyle w:val="ListParagraph"/>
-                        <w:numPr>
-                          <w:ilvl w:val="0"/>
-                          <w:numId w:val="2"/>
-                        </w:numPr>
-                        <w:spacing w:after="0" w:line="240" w:lineRule="auto"/>
-                        <w:textDirection w:val="btLr"/>
-                      </w:pPr>
-                      <w:r>
-                        <w:rPr>
-                          <w:b/>
-                          <w:color w:val="000000"/>
-                        </w:rPr>
-                        <w:t>Bank Acc Name:</w:t>
-                      </w:r>
-                      <w:r>
-                        <w:rPr>
-                          <w:color w:val="000000"/>
-                        </w:rPr>
-                        <w:t xml:space="preserve"> Cong Ty TNHH Universal Connect VN</w:t>
-                      </w:r>
-                    </w:p>
-                    <w:p>
-                      <w:pPr>
-                        <w:pStyle w:val="ListParagraph"/>
-                        <w:numPr>
-                          <w:ilvl w:val="0"/>
-                          <w:numId w:val="2"/>
-                        </w:numPr>
-                        <w:spacing w:after="0" w:line="240" w:lineRule="auto"/>
-                        <w:textDirection w:val="btLr"/>
-                        <w:rPr>
-                          <w:color w:val="202124"/>
-                          <w:highlight w:val="white"/>
-                        </w:rPr>
-                      </w:pPr>
-                      <w:r>
-                        <w:rPr>
-                          <w:b/>
-                          <w:color w:val="000000"/>
-                        </w:rPr>
-                        <w:t>Bank Address:</w:t>
-                      </w:r>
-                      <w:r>
-                        <w:rPr>
-                          <w:color w:val="000000"/>
-                        </w:rPr>
-                        <w:t xml:space="preserve"> </w:t>
-                      </w:r>
-                      <w:r>
-                        <w:rPr>
-                          <w:color w:val="202124"/>
-                          <w:highlight w:val="white"/>
-                        </w:rPr>
-                        <w:t>02, Đường Trần Cao Vân, Phường Cẩm Phô, Thành Phố Hộ</w:t>
-                      </w:r>
-                      <w:r>
-                        <w:rPr>
-                          <w:color w:val="202124"/>
-                          <w:highlight w:val="white"/>
-                        </w:rPr>
-                        <w:t>i An,</w:t>
-                      </w:r>
-                    </w:p>
-                    <w:p>
-                      <w:pPr>
-                        <w:pStyle w:val="ListParagraph"/>
-                        <w:numPr>
-                          <w:ilvl w:val="0"/>
-                          <w:numId w:val="2"/>
-                        </w:numPr>
-                        <w:spacing w:after="0" w:line="240" w:lineRule="auto"/>
-                        <w:textDirection w:val="btLr"/>
-                      </w:pPr>
-                      <w:r>
-                        <w:rPr>
-                          <w:color w:val="202124"/>
-                          <w:highlight w:val="white"/>
-                        </w:rPr>
-                        <w:t>Phường Minh An, Hội An, Quảng Nam</w:t>
-                      </w:r>
-                    </w:p>
-                    <w:p>
-                      <w:pPr>
-                        <w:pStyle w:val="ListParagraph"/>
-                        <w:numPr>
-                          <w:ilvl w:val="0"/>
-                          <w:numId w:val="2"/>
-                        </w:numPr>
-                        <w:spacing w:after="0" w:line="240" w:lineRule="auto"/>
-                        <w:textDirection w:val="btLr"/>
-                      </w:pPr>
-                      <w:r>
-                        <w:rPr>
-                          <w:b/>
-                          <w:color w:val="000000"/>
-                        </w:rPr>
-                        <w:t>Bank Acc Number:</w:t>
-                      </w:r>
-                      <w:r>
-                        <w:rPr>
-                          <w:color w:val="000000"/>
-                        </w:rPr>
-                        <w:t xml:space="preserve"> 1034923884</w:t>
-                      </w:r>
-                    </w:p>
-                    <w:p>
-                      <w:pPr>
-                        <w:pStyle w:val="ListParagraph"/>
-                        <w:numPr>
-                          <w:ilvl w:val="0"/>
-                          <w:numId w:val="2"/>
-                        </w:numPr>
-                        <w:spacing w:after="0" w:line="240" w:lineRule="auto"/>
-                        <w:textDirection w:val="btLr"/>
-                      </w:pPr>
-                      <w:r>
-                        <w:rPr>
-                          <w:b/>
-                          <w:color w:val="000000"/>
-                        </w:rPr>
-                        <w:t>SWIFT:</w:t>
-                      </w:r>
-                      <w:r>
-                        <w:rPr>
-                          <w:color w:val="000000"/>
-                        </w:rPr>
-                        <w:t xml:space="preserve"> BFTVVNVX</w:t>
-                      </w:r>
-                    </w:p>
-                  </w:txbxContent>
-                </v:textbox>
-                <w10:wrap type="square"/>
-              </v:rect>
-            </w:pict>
-          </mc:Fallback>
-        </mc:AlternateContent>
-      </w:r>
-      <w:r>
-        <w:rPr>
-          <w:noProof/>
-        </w:rPr>
-        <mc:AlternateContent>
-          <mc:Choice Requires="wps">
-            <w:drawing>
-              <wp:anchor distT="45720" distB="45720" distL="114300" distR="114300" simplePos="0" relativeHeight="251670528" behindDoc="0" locked="0" layoutInCell="1" hidden="0" allowOverlap="1">
-                <wp:simplePos x="0" y="0"/>
-                <wp:positionH relativeFrom="column">
-                  <wp:posOffset>4025900</wp:posOffset>
-                </wp:positionH>
-                <wp:positionV relativeFrom="paragraph">
-                  <wp:posOffset>2230120</wp:posOffset>
+                  <wp:posOffset>5080</wp:posOffset>
                 </wp:positionV>
                 <wp:extent cx="1746250" cy="685800"/>
                 <wp:effectExtent l="0" t="0" r="0" b="0"/>
@@ -2314,8 +1800,8 @@
                       <wps:cNvSpPr/>
                       <wps:spPr>
                         <a:xfrm>
-                          <a:off x="4482400" y="3446625"/>
-                          <a:ext cx="1727200" cy="666750"/>
+                          <a:off x="0" y="0"/>
+                          <a:ext cx="1746250" cy="685800"/>
                         </a:xfrm>
                         <a:prstGeom prst="rect">
                           <a:avLst/>
@@ -2377,7 +1863,7 @@
           </mc:Choice>
           <mc:Fallback>
             <w:pict>
-              <v:rect id="Rectangle 231" o:spid="_x0000_s1034" style="position:absolute;margin-left:317pt;margin-top:175.6pt;width:137.5pt;height:54pt;z-index:251670528;visibility:visible;mso-wrap-style:square;mso-wrap-distance-left:9pt;mso-wrap-distance-top:3.6pt;mso-wrap-distance-right:9pt;mso-wrap-distance-bottom:3.6pt;mso-position-horizontal:absolute;mso-position-horizontal-relative:text;mso-position-vertical:absolute;mso-position-vertical-relative:text;v-text-anchor:top" o:gfxdata="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" stroked="f">
+              <v:rect w14:anchorId="06B8548E" id="Rectangle 231" o:spid="_x0000_s1031" style="position:absolute;left:0;text-align:left;margin-left:314pt;margin-top:.4pt;width:137.5pt;height:54pt;z-index:251670528;visibility:visible;mso-wrap-style:square;mso-wrap-distance-left:9pt;mso-wrap-distance-top:3.6pt;mso-wrap-distance-right:9pt;mso-wrap-distance-bottom:3.6pt;mso-position-horizontal:absolute;mso-position-horizontal-relative:text;mso-position-vertical:absolute;mso-position-vertical-relative:text;v-text-anchor:top" o:gfxdata="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" stroked="f">
                 <v:textbox inset="2.53958mm,1.2694mm,2.53958mm,1.2694mm">
                   <w:txbxContent>
                     <w:p>
@@ -2423,6 +1909,180 @@
           </mc:Fallback>
         </mc:AlternateContent>
       </w:r>
+      <w:r>
+        <w:rPr>
+          <w:color w:val="000000"/>
+          <w:sz w:val="28"/>
+        </w:rPr>
+        <w:t xml:space="preserve">Thank you for trusting us in </w:t>
+      </w:r>
+    </w:p>
+    <w:p>
+      <w:pPr>
+        <w:spacing w:line="258" w:lineRule="auto"/>
+        <w:ind w:firstLine="360"/>
+        <w:textDirection w:val="btLr"/>
+      </w:pPr>
+      <w:r>
+        <w:rPr>
+          <w:color w:val="000000"/>
+          <w:sz w:val="28"/>
+        </w:rPr>
+        <w:t>supporting you!</w:t>
+      </w:r>
+    </w:p>
+    <w:p>
+      <w:pPr>
+        <w:tabs>
+          <w:tab w:val="left" w:pos="1660"/>
+        </w:tabs>
+      </w:pPr>
+      <w:r>
+        <w:rPr>
+          <w:noProof/>
+        </w:rPr>
+        <mc:AlternateContent>
+          <mc:Choice Requires="wps">
+            <w:drawing>
+              <wp:anchor distT="0" distB="0" distL="114300" distR="114300" simplePos="0" relativeHeight="251666432" behindDoc="0" locked="0" layoutInCell="1" hidden="0" allowOverlap="1" wp14:anchorId="70101B50" wp14:editId="34F4C6CC">
+                <wp:simplePos x="0" y="0"/>
+                <wp:positionH relativeFrom="column">
+                  <wp:posOffset>4140200</wp:posOffset>
+                </wp:positionH>
+                <wp:positionV relativeFrom="paragraph">
+                  <wp:posOffset>2565400</wp:posOffset>
+                </wp:positionV>
+                <wp:extent cx="0" cy="19050"/>
+                <wp:effectExtent l="0" t="0" r="0" b="0"/>
+                <wp:wrapNone/>
+                <wp:docPr id="242" name="Straight Arrow Connector 242"/>
+                <wp:cNvGraphicFramePr/>
+                <a:graphic xmlns:a="http://schemas.openxmlformats.org/drawingml/2006/main">
+                  <a:graphicData uri="http://schemas.microsoft.com/office/word/2010/wordprocessingShape">
+                    <wps:wsp>
+                      <wps:cNvCnPr/>
+                      <wps:spPr>
+                        <a:xfrm>
+                          <a:off x="4568125" y="3780000"/>
+                          <a:ext cx="1555750" cy="0"/>
+                        </a:xfrm>
+                        <a:prstGeom prst="straightConnector1">
+                          <a:avLst/>
+                        </a:prstGeom>
+                        <a:noFill/>
+                        <a:ln w="19050" cap="flat" cmpd="sng">
+                          <a:solidFill>
+                            <a:srgbClr val="0070C0"/>
+                          </a:solidFill>
+                          <a:prstDash val="solid"/>
+                          <a:miter lim="800000"/>
+                          <a:headEnd type="none" w="sm" len="sm"/>
+                          <a:tailEnd type="none" w="sm" len="sm"/>
+                        </a:ln>
+                      </wps:spPr>
+                      <wps:bodyPr/>
+                    </wps:wsp>
+                  </a:graphicData>
+                </a:graphic>
+              </wp:anchor>
+            </w:drawing>
+          </mc:Choice>
+          <mc:Fallback>
+            <w:pict>
+              <v:shapetype w14:anchorId="38A4D164" id="_x0000_t32" coordsize="21600,21600" o:spt="32" o:oned="t" path="m,l21600,21600e" filled="f">
+                <v:path arrowok="t" fillok="f" o:connecttype="none"/>
+                <o:lock v:ext="edit" shapetype="t"/>
+              </v:shapetype>
+              <v:shape id="Straight Arrow Connector 242" o:spid="_x0000_s1026" type="#_x0000_t32" style="position:absolute;margin-left:326pt;margin-top:202pt;width:0;height:1.5pt;z-index:251666432;visibility:visible;mso-wrap-style:square;mso-wrap-distance-left:9pt;mso-wrap-distance-top:0;mso-wrap-distance-right:9pt;mso-wrap-distance-bottom:0;mso-position-horizontal:absolute;mso-position-horizontal-relative:text;mso-position-vertical:absolute;mso-position-vertical-relative:text" o:gfxdata="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" strokecolor="#0070c0" strokeweight="1.5pt">
+                <v:stroke startarrowwidth="narrow" startarrowlength="short" endarrowwidth="narrow" endarrowlength="short" joinstyle="miter"/>
+              </v:shape>
+            </w:pict>
+          </mc:Fallback>
+        </mc:AlternateContent>
+      </w:r>
+      <w:r>
+        <w:rPr>
+          <w:noProof/>
+        </w:rPr>
+        <mc:AlternateContent>
+          <mc:Choice Requires="wps">
+            <w:drawing>
+              <wp:anchor distT="0" distB="0" distL="114300" distR="114300" simplePos="0" relativeHeight="251667456" behindDoc="0" locked="0" layoutInCell="1" hidden="0" allowOverlap="1" wp14:anchorId="2D7B47F8" wp14:editId="6D84AFFC">
+                <wp:simplePos x="0" y="0"/>
+                <wp:positionH relativeFrom="column">
+                  <wp:posOffset>-914399</wp:posOffset>
+                </wp:positionH>
+                <wp:positionV relativeFrom="paragraph">
+                  <wp:posOffset>3454400</wp:posOffset>
+                </wp:positionV>
+                <wp:extent cx="7829550" cy="647700"/>
+                <wp:effectExtent l="0" t="0" r="0" b="0"/>
+                <wp:wrapNone/>
+                <wp:docPr id="238" name="Rectangle 238"/>
+                <wp:cNvGraphicFramePr/>
+                <a:graphic xmlns:a="http://schemas.openxmlformats.org/drawingml/2006/main">
+                  <a:graphicData uri="http://schemas.microsoft.com/office/word/2010/wordprocessingShape">
+                    <wps:wsp>
+                      <wps:cNvSpPr/>
+                      <wps:spPr>
+                        <a:xfrm>
+                          <a:off x="1443925" y="3468850"/>
+                          <a:ext cx="7804150" cy="622300"/>
+                        </a:xfrm>
+                        <a:prstGeom prst="rect">
+                          <a:avLst/>
+                        </a:prstGeom>
+                        <a:solidFill>
+                          <a:srgbClr val="0070C0"/>
+                        </a:solidFill>
+                        <a:ln w="12700" cap="flat" cmpd="sng">
+                          <a:solidFill>
+                            <a:srgbClr val="42719B"/>
+                          </a:solidFill>
+                          <a:prstDash val="solid"/>
+                          <a:miter lim="800000"/>
+                          <a:headEnd type="none" w="sm" len="sm"/>
+                          <a:tailEnd type="none" w="sm" len="sm"/>
+                        </a:ln>
+                      </wps:spPr>
+                      <wps:txbx>
+                        <w:txbxContent>
+                          <w:p>
+                            <w:pPr>
+                              <w:spacing w:after="0" w:line="240" w:lineRule="auto"/>
+                              <w:textDirection w:val="btLr"/>
+                            </w:pPr>
+                          </w:p>
+                        </w:txbxContent>
+                      </wps:txbx>
+                      <wps:bodyPr spcFirstLastPara="1" wrap="square" lIns="91425" tIns="91425" rIns="91425" bIns="91425" anchor="ctr" anchorCtr="0">
+                        <a:noAutofit/>
+                      </wps:bodyPr>
+                    </wps:wsp>
+                  </a:graphicData>
+                </a:graphic>
+              </wp:anchor>
+            </w:drawing>
+          </mc:Choice>
+          <mc:Fallback>
+            <w:pict>
+              <v:rect w14:anchorId="2D7B47F8" id="Rectangle 238" o:spid="_x0000_s1032" style="position:absolute;margin-left:-1in;margin-top:272pt;width:616.5pt;height:51pt;z-index:251667456;visibility:visible;mso-wrap-style:square;mso-wrap-distance-left:9pt;mso-wrap-distance-top:0;mso-wrap-distance-right:9pt;mso-wrap-distance-bottom:0;mso-position-horizontal:absolute;mso-position-horizontal-relative:text;mso-position-vertical:absolute;mso-position-vertical-relative:text;v-text-anchor:middle" o:gfxdata="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" fillcolor="#0070c0" strokecolor="#42719b" strokeweight="1pt">
+                <v:stroke startarrowwidth="narrow" startarrowlength="short" endarrowwidth="narrow" endarrowlength="short"/>
+                <v:textbox inset="2.53958mm,2.53958mm,2.53958mm,2.53958mm">
+                  <w:txbxContent>
+                    <w:p>
+                      <w:pPr>
+                        <w:spacing w:after="0" w:line="240" w:lineRule="auto"/>
+                        <w:textDirection w:val="btLr"/>
+                      </w:pPr>
+                    </w:p>
+                  </w:txbxContent>
+                </v:textbox>
+              </v:rect>
+            </w:pict>
+          </mc:Fallback>
+        </mc:AlternateContent>
+      </w:r>
     </w:p>
     <w:sectPr>
       <w:pgSz w:w="12240" w:h="15840"/>
@@ -2559,7 +2219,7 @@
       <w:lvlText w:val=""/>
       <w:lvlJc w:val="left"/>
       <w:pPr>
-        <w:ind w:left="720" w:hanging="360"/>
+        <w:ind w:left="1080" w:hanging="360"/>
       </w:pPr>
       <w:rPr>
         <w:rFonts w:ascii="Symbol" w:hAnsi="Symbol" w:hint="default"/>
@@ -2571,7 +2231,7 @@
       <w:lvlText w:val="o"/>
       <w:lvlJc w:val="left"/>
       <w:pPr>
-        <w:ind w:left="1440" w:hanging="360"/>
+        <w:ind w:left="1800" w:hanging="360"/>
       </w:pPr>
       <w:rPr>
         <w:rFonts w:ascii="Courier New" w:hAnsi="Courier New" w:cs="Courier New" w:hint="default"/>
@@ -2583,7 +2243,7 @@
       <w:lvlText w:val=""/>
       <w:lvlJc w:val="left"/>
       <w:pPr>
-        <w:ind w:left="2160" w:hanging="360"/>
+        <w:ind w:left="2520" w:hanging="360"/>
       </w:pPr>
       <w:rPr>
         <w:rFonts w:ascii="Wingdings" w:hAnsi="Wingdings" w:hint="default"/>
@@ -2595,7 +2255,7 @@
       <w:lvlText w:val=""/>
       <w:lvlJc w:val="left"/>
       <w:pPr>
-        <w:ind w:left="2880" w:hanging="360"/>
+        <w:ind w:left="3240" w:hanging="360"/>
       </w:pPr>
       <w:rPr>
         <w:rFonts w:ascii="Symbol" w:hAnsi="Symbol" w:hint="default"/>
@@ -2607,7 +2267,7 @@
       <w:lvlText w:val="o"/>
       <w:lvlJc w:val="left"/>
       <w:pPr>
-        <w:ind w:left="3600" w:hanging="360"/>
+        <w:ind w:left="3960" w:hanging="360"/>
       </w:pPr>
       <w:rPr>
         <w:rFonts w:ascii="Courier New" w:hAnsi="Courier New" w:cs="Courier New" w:hint="default"/>
@@ -2619,7 +2279,7 @@
       <w:lvlText w:val=""/>
       <w:lvlJc w:val="left"/>
       <w:pPr>
-        <w:ind w:left="4320" w:hanging="360"/>
+        <w:ind w:left="4680" w:hanging="360"/>
       </w:pPr>
       <w:rPr>
         <w:rFonts w:ascii="Wingdings" w:hAnsi="Wingdings" w:hint="default"/>
@@ -2631,7 +2291,7 @@
       <w:lvlText w:val=""/>
       <w:lvlJc w:val="left"/>
       <w:pPr>
-        <w:ind w:left="5040" w:hanging="360"/>
+        <w:ind w:left="5400" w:hanging="360"/>
       </w:pPr>
       <w:rPr>
         <w:rFonts w:ascii="Symbol" w:hAnsi="Symbol" w:hint="default"/>
@@ -2643,7 +2303,7 @@
       <w:lvlText w:val="o"/>
       <w:lvlJc w:val="left"/>
       <w:pPr>
-        <w:ind w:left="5760" w:hanging="360"/>
+        <w:ind w:left="6120" w:hanging="360"/>
       </w:pPr>
       <w:rPr>
         <w:rFonts w:ascii="Courier New" w:hAnsi="Courier New" w:cs="Courier New" w:hint="default"/>
@@ -2655,7 +2315,7 @@
       <w:lvlText w:val=""/>
       <w:lvlJc w:val="left"/>
       <w:pPr>
-        <w:ind w:left="6480" w:hanging="360"/>
+        <w:ind w:left="6840" w:hanging="360"/>
       </w:pPr>
       <w:rPr>
         <w:rFonts w:ascii="Wingdings" w:hAnsi="Wingdings" w:hint="default"/>

</xml_diff>

<commit_message>
Improves tour customization and signup process
Enhances the tour edit modal with drag-and-drop reordering and editing of customize options, improving the admin experience.

Updates the signup form to handle mutually exclusive tour segments (e.g., "grandTotal"), ensuring accurate data capture.

Updates document generation to include tour-specific pricing and dates, leading to more accurate invoices.
</commit_message>
<xml_diff>
--- a/ucv-fe/public/IUC_Invoice VAT_UNIVERSITY_template.docx
+++ b/ucv-fe/public/IUC_Invoice VAT_UNIVERSITY_template.docx
@@ -1,6 +1,6 @@
 
 <file path=word/document.xml><?xml version="1.0" encoding="utf-8"?>
-<w:document xmlns:wpc="http://schemas.microsoft.com/office/word/2010/wordprocessingCanvas" xmlns:cx="http://schemas.microsoft.com/office/drawing/2014/chartex" xmlns:mc="http://schemas.openxmlformats.org/markup-compatibility/2006" xmlns:o="urn:schemas-microsoft-com:office:office" xmlns:r="http://schemas.openxmlformats.org/officeDocument/2006/relationships" xmlns:m="http://schemas.openxmlformats.org/officeDocument/2006/math" xmlns:v="urn:schemas-microsoft-com:vml" xmlns:wp14="http://schemas.microsoft.com/office/word/2010/wordprocessingDrawing" xmlns:wp="http://schemas.openxmlformats.org/drawingml/2006/wordprocessingDrawing" xmlns:w10="urn:schemas-microsoft-com:office:word" xmlns:w="http://schemas.openxmlformats.org/wordprocessingml/2006/main" xmlns:w14="http://schemas.microsoft.com/office/word/2010/wordml" xmlns:w15="http://schemas.microsoft.com/office/word/2012/wordml" xmlns:w16se="http://schemas.microsoft.com/office/word/2015/wordml/symex" xmlns:wpg="http://schemas.microsoft.com/office/word/2010/wordprocessingGroup" xmlns:wpi="http://schemas.microsoft.com/office/word/2010/wordprocessingInk" xmlns:wne="http://schemas.microsoft.com/office/word/2006/wordml" xmlns:wps="http://schemas.microsoft.com/office/word/2010/wordprocessingShape" mc:Ignorable="w14 w15 w16se wp14">
+<w:document xmlns:wpc="http://schemas.microsoft.com/office/word/2010/wordprocessingCanvas" xmlns:cx="http://schemas.microsoft.com/office/drawing/2014/chartex" xmlns:cx1="http://schemas.microsoft.com/office/drawing/2015/9/8/chartex" xmlns:cx2="http://schemas.microsoft.com/office/drawing/2015/10/21/chartex" xmlns:cx3="http://schemas.microsoft.com/office/drawing/2016/5/9/chartex" xmlns:cx4="http://schemas.microsoft.com/office/drawing/2016/5/10/chartex" xmlns:cx5="http://schemas.microsoft.com/office/drawing/2016/5/11/chartex" xmlns:cx6="http://schemas.microsoft.com/office/drawing/2016/5/12/chartex" xmlns:cx7="http://schemas.microsoft.com/office/drawing/2016/5/13/chartex" xmlns:cx8="http://schemas.microsoft.com/office/drawing/2016/5/14/chartex" xmlns:mc="http://schemas.openxmlformats.org/markup-compatibility/2006" xmlns:aink="http://schemas.microsoft.com/office/drawing/2016/ink" xmlns:am3d="http://schemas.microsoft.com/office/drawing/2017/model3d" xmlns:o="urn:schemas-microsoft-com:office:office" xmlns:oel="http://schemas.microsoft.com/office/2019/extlst" xmlns:r="http://schemas.openxmlformats.org/officeDocument/2006/relationships" xmlns:m="http://schemas.openxmlformats.org/officeDocument/2006/math" xmlns:v="urn:schemas-microsoft-com:vml" xmlns:wp14="http://schemas.microsoft.com/office/word/2010/wordprocessingDrawing" xmlns:wp="http://schemas.openxmlformats.org/drawingml/2006/wordprocessingDrawing" xmlns:w10="urn:schemas-microsoft-com:office:word" xmlns:w="http://schemas.openxmlformats.org/wordprocessingml/2006/main" xmlns:w14="http://schemas.microsoft.com/office/word/2010/wordml" xmlns:w15="http://schemas.microsoft.com/office/word/2012/wordml" xmlns:w16cex="http://schemas.microsoft.com/office/word/2018/wordml/cex" xmlns:w16cid="http://schemas.microsoft.com/office/word/2016/wordml/cid" xmlns:w16="http://schemas.microsoft.com/office/word/2018/wordml" xmlns:w16du="http://schemas.microsoft.com/office/word/2023/wordml/word16du" xmlns:w16sdtdh="http://schemas.microsoft.com/office/word/2020/wordml/sdtdatahash" xmlns:w16sdtfl="http://schemas.microsoft.com/office/word/2024/wordml/sdtformatlock" xmlns:w16se="http://schemas.microsoft.com/office/word/2015/wordml/symex" xmlns:wpg="http://schemas.microsoft.com/office/word/2010/wordprocessingGroup" xmlns:wpi="http://schemas.microsoft.com/office/word/2010/wordprocessingInk" xmlns:wne="http://schemas.microsoft.com/office/word/2006/wordml" xmlns:wps="http://schemas.microsoft.com/office/word/2010/wordprocessingShape" mc:Ignorable="w14 w15 w16se w16cid w16 w16cex w16sdtdh w16sdtfl w16du wp14">
   <w:body>
     <w:p>
       <w:pPr>
@@ -22,216 +22,18 @@
         <mc:AlternateContent>
           <mc:Choice Requires="wps">
             <w:drawing>
-              <wp:anchor distT="45720" distB="45720" distL="114300" distR="114300" simplePos="0" relativeHeight="251658240" behindDoc="0" locked="0" layoutInCell="1" hidden="0" allowOverlap="1">
+              <wp:anchor distT="45720" distB="45720" distL="114300" distR="114300" simplePos="0" relativeHeight="251658240" behindDoc="0" locked="0" layoutInCell="1" allowOverlap="1" wp14:anchorId="5C85B335" wp14:editId="1038EFB1">
                 <wp:simplePos x="0" y="0"/>
                 <wp:positionH relativeFrom="column">
-                  <wp:posOffset>342900</wp:posOffset>
+                  <wp:posOffset>330200</wp:posOffset>
                 </wp:positionH>
                 <wp:positionV relativeFrom="paragraph">
-                  <wp:posOffset>1290320</wp:posOffset>
+                  <wp:posOffset>7620</wp:posOffset>
                 </wp:positionV>
-                <wp:extent cx="2997200" cy="1493843"/>
+                <wp:extent cx="2562225" cy="736600"/>
                 <wp:effectExtent l="0" t="0" r="0" b="0"/>
-                <wp:wrapSquare wrapText="bothSides" distT="45720" distB="45720" distL="114300" distR="114300"/>
-                <wp:docPr id="239" name="Rectangle 239"/>
-                <wp:cNvGraphicFramePr/>
-                <a:graphic xmlns:a="http://schemas.openxmlformats.org/drawingml/2006/main">
-                  <a:graphicData uri="http://schemas.microsoft.com/office/word/2010/wordprocessingShape">
-                    <wps:wsp>
-                      <wps:cNvSpPr/>
-                      <wps:spPr>
-                        <a:xfrm>
-                          <a:off x="3856925" y="3043400"/>
-                          <a:ext cx="2978150" cy="1473200"/>
-                        </a:xfrm>
-                        <a:prstGeom prst="rect">
-                          <a:avLst/>
-                        </a:prstGeom>
-                        <a:solidFill>
-                          <a:srgbClr val="FFFFFF"/>
-                        </a:solidFill>
-                        <a:ln w="9525" cap="flat" cmpd="sng">
-                          <a:solidFill>
-                            <a:srgbClr val="0070C0"/>
-                          </a:solidFill>
-                          <a:prstDash val="solid"/>
-                          <a:miter lim="800000"/>
-                          <a:headEnd type="none" w="sm" len="sm"/>
-                          <a:tailEnd type="none" w="sm" len="sm"/>
-                        </a:ln>
-                      </wps:spPr>
-                      <wps:txbx>
-                        <w:txbxContent>
-                          <w:p>
-                            <w:pPr>
-                              <w:spacing w:line="258" w:lineRule="auto"/>
-                              <w:textDirection w:val="btLr"/>
-                            </w:pPr>
-                            <w:r>
-                              <w:rPr>
-                                <w:color w:val="000000"/>
-                              </w:rPr>
-                              <w:t>Billed To:</w:t>
-                            </w:r>
-                          </w:p>
-                          <w:p>
-                            <w:pPr>
-                              <w:spacing w:line="258" w:lineRule="auto"/>
-                              <w:textDirection w:val="btLr"/>
-                            </w:pPr>
-                            <w:r>
-                              <w:rPr>
-                                <w:color w:val="000000"/>
-                                <w:sz w:val="28"/>
-                              </w:rPr>
-                              <w:t>[</w:t>
-                            </w:r>
-                            <w:r>
-                              <w:rPr>
-                                <w:color w:val="000000"/>
-                                <w:sz w:val="28"/>
-                              </w:rPr>
-                              <w:t>UNIVERSITY NAME</w:t>
-                            </w:r>
-                            <w:r>
-                              <w:rPr>
-                                <w:color w:val="000000"/>
-                                <w:sz w:val="28"/>
-                              </w:rPr>
-                              <w:t>]</w:t>
-                            </w:r>
-                          </w:p>
-                          <w:p>
-                            <w:pPr>
-                              <w:spacing w:line="258" w:lineRule="auto"/>
-                              <w:textDirection w:val="btLr"/>
-                            </w:pPr>
-                            <w:r>
-                              <w:rPr>
-                                <w:color w:val="000000"/>
-                              </w:rPr>
-                              <w:t>Address:</w:t>
-                            </w:r>
-                            <w:r>
-                              <w:rPr>
-                                <w:color w:val="000000"/>
-                              </w:rPr>
-                              <w:t xml:space="preserve"> </w:t>
-                            </w:r>
-                            <w:r>
-                              <w:rPr>
-                                <w:color w:val="000000"/>
-                              </w:rPr>
-                              <w:t>[Head office address]</w:t>
-                            </w:r>
-                          </w:p>
-                        </w:txbxContent>
-                      </wps:txbx>
-                      <wps:bodyPr spcFirstLastPara="1" wrap="square" lIns="91425" tIns="45700" rIns="91425" bIns="45700" anchor="t" anchorCtr="0">
-                        <a:noAutofit/>
-                      </wps:bodyPr>
-                    </wps:wsp>
-                  </a:graphicData>
-                </a:graphic>
-              </wp:anchor>
-            </w:drawing>
-          </mc:Choice>
-          <mc:Fallback>
-            <w:pict>
-              <v:rect id="Rectangle 239" o:spid="_x0000_s1026" style="position:absolute;margin-left:27pt;margin-top:101.6pt;width:236pt;height:117.65pt;z-index:251658240;visibility:visible;mso-wrap-style:square;mso-wrap-distance-left:9pt;mso-wrap-distance-top:3.6pt;mso-wrap-distance-right:9pt;mso-wrap-distance-bottom:3.6pt;mso-position-horizontal:absolute;mso-position-horizontal-relative:text;mso-position-vertical:absolute;mso-position-vertical-relative:text;v-text-anchor:top" o:gfxdata="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" strokecolor="#0070c0">
-                <v:stroke startarrowwidth="narrow" startarrowlength="short" endarrowwidth="narrow" endarrowlength="short"/>
-                <v:textbox inset="2.53958mm,1.2694mm,2.53958mm,1.2694mm">
-                  <w:txbxContent>
-                    <w:p>
-                      <w:pPr>
-                        <w:spacing w:line="258" w:lineRule="auto"/>
-                        <w:textDirection w:val="btLr"/>
-                      </w:pPr>
-                      <w:r>
-                        <w:rPr>
-                          <w:color w:val="000000"/>
-                        </w:rPr>
-                        <w:t>Billed To:</w:t>
-                      </w:r>
-                    </w:p>
-                    <w:p>
-                      <w:pPr>
-                        <w:spacing w:line="258" w:lineRule="auto"/>
-                        <w:textDirection w:val="btLr"/>
-                      </w:pPr>
-                      <w:r>
-                        <w:rPr>
-                          <w:color w:val="000000"/>
-                          <w:sz w:val="28"/>
-                        </w:rPr>
-                        <w:t>[</w:t>
-                      </w:r>
-                      <w:r>
-                        <w:rPr>
-                          <w:color w:val="000000"/>
-                          <w:sz w:val="28"/>
-                        </w:rPr>
-                        <w:t>UNIVERSITY NAME</w:t>
-                      </w:r>
-                      <w:r>
-                        <w:rPr>
-                          <w:color w:val="000000"/>
-                          <w:sz w:val="28"/>
-                        </w:rPr>
-                        <w:t>]</w:t>
-                      </w:r>
-                    </w:p>
-                    <w:p>
-                      <w:pPr>
-                        <w:spacing w:line="258" w:lineRule="auto"/>
-                        <w:textDirection w:val="btLr"/>
-                      </w:pPr>
-                      <w:r>
-                        <w:rPr>
-                          <w:color w:val="000000"/>
-                        </w:rPr>
-                        <w:t>Address:</w:t>
-                      </w:r>
-                      <w:r>
-                        <w:rPr>
-                          <w:color w:val="000000"/>
-                        </w:rPr>
-                        <w:t xml:space="preserve"> </w:t>
-                      </w:r>
-                      <w:r>
-                        <w:rPr>
-                          <w:color w:val="000000"/>
-                        </w:rPr>
-                        <w:t>[Head office address]</w:t>
-                      </w:r>
-                    </w:p>
-                  </w:txbxContent>
-                </v:textbox>
-                <w10:wrap type="square"/>
-              </v:rect>
-            </w:pict>
-          </mc:Fallback>
-        </mc:AlternateContent>
-      </w:r>
-      <w:r>
-        <w:rPr>
-          <w:noProof/>
-        </w:rPr>
-        <mc:AlternateContent>
-          <mc:Choice Requires="wps">
-            <w:drawing>
-              <wp:anchor distT="45720" distB="45720" distL="114300" distR="114300" simplePos="0" relativeHeight="251659264" behindDoc="0" locked="0" layoutInCell="1" hidden="0" allowOverlap="1">
-                <wp:simplePos x="0" y="0"/>
-                <wp:positionH relativeFrom="column">
-                  <wp:posOffset>342900</wp:posOffset>
-                </wp:positionH>
-                <wp:positionV relativeFrom="paragraph">
-                  <wp:posOffset>7621</wp:posOffset>
-                </wp:positionV>
-                <wp:extent cx="2552700" cy="727075"/>
-                <wp:effectExtent l="0" t="0" r="0" b="0"/>
-                <wp:wrapSquare wrapText="bothSides" distT="45720" distB="45720" distL="114300" distR="114300"/>
-                <wp:docPr id="241" name="Rectangle 241"/>
+                <wp:wrapNone/>
+                <wp:docPr id="245" name="Rectangles 245"/>
                 <wp:cNvGraphicFramePr/>
                 <a:graphic xmlns:a="http://schemas.openxmlformats.org/drawingml/2006/main">
                   <a:graphicData uri="http://schemas.microsoft.com/office/word/2010/wordprocessingShape">
@@ -257,7 +59,6 @@
                           <w:p>
                             <w:pPr>
                               <w:spacing w:line="258" w:lineRule="auto"/>
-                              <w:textDirection w:val="btLr"/>
                             </w:pPr>
                             <w:r>
                               <w:rPr>
@@ -281,13 +82,12 @@
           </mc:Choice>
           <mc:Fallback>
             <w:pict>
-              <v:rect id="Rectangle 241" o:spid="_x0000_s1027" style="position:absolute;margin-left:27pt;margin-top:.6pt;width:201pt;height:57.25pt;z-index:251659264;visibility:visible;mso-wrap-style:square;mso-wrap-distance-left:9pt;mso-wrap-distance-top:3.6pt;mso-wrap-distance-right:9pt;mso-wrap-distance-bottom:3.6pt;mso-position-horizontal:absolute;mso-position-horizontal-relative:text;mso-position-vertical:absolute;mso-position-vertical-relative:text;v-text-anchor:top" o:gfxdata="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" stroked="f">
+              <v:rect w14:anchorId="5C85B335" id="Rectangles 245" o:spid="_x0000_s1026" style="position:absolute;margin-left:26pt;margin-top:.6pt;width:201.75pt;height:58pt;z-index:251658240;visibility:visible;mso-wrap-style:square;mso-wrap-distance-left:9pt;mso-wrap-distance-top:3.6pt;mso-wrap-distance-right:9pt;mso-wrap-distance-bottom:3.6pt;mso-position-horizontal:absolute;mso-position-horizontal-relative:text;mso-position-vertical:absolute;mso-position-vertical-relative:text;v-text-anchor:top" o:gfxdata="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" stroked="f">
                 <v:textbox inset="2.53958mm,1.2694mm,2.53958mm,1.2694mm">
                   <w:txbxContent>
                     <w:p>
                       <w:pPr>
                         <w:spacing w:line="258" w:lineRule="auto"/>
-                        <w:textDirection w:val="btLr"/>
                       </w:pPr>
                       <w:r>
                         <w:rPr>
@@ -300,7 +100,6 @@
                     </w:p>
                   </w:txbxContent>
                 </v:textbox>
-                <w10:wrap type="square"/>
               </v:rect>
             </w:pict>
           </mc:Fallback>
@@ -313,18 +112,18 @@
         <mc:AlternateContent>
           <mc:Choice Requires="wps">
             <w:drawing>
-              <wp:anchor distT="0" distB="0" distL="114300" distR="114300" simplePos="0" relativeHeight="251660288" behindDoc="0" locked="0" layoutInCell="1" hidden="0" allowOverlap="1">
+              <wp:anchor distT="0" distB="0" distL="114300" distR="114300" simplePos="0" relativeHeight="251659264" behindDoc="0" locked="0" layoutInCell="1" allowOverlap="1" wp14:anchorId="7350214E" wp14:editId="641A9C87">
                 <wp:simplePos x="0" y="0"/>
                 <wp:positionH relativeFrom="column">
-                  <wp:posOffset>-914399</wp:posOffset>
+                  <wp:posOffset>-913765</wp:posOffset>
                 </wp:positionH>
                 <wp:positionV relativeFrom="paragraph">
-                  <wp:posOffset>177800</wp:posOffset>
+                  <wp:posOffset>165100</wp:posOffset>
                 </wp:positionV>
-                <wp:extent cx="984250" cy="493395"/>
+                <wp:extent cx="996950" cy="506095"/>
                 <wp:effectExtent l="0" t="0" r="0" b="0"/>
                 <wp:wrapNone/>
-                <wp:docPr id="240" name="Rectangle 240"/>
+                <wp:docPr id="244" name="Rectangles 244"/>
                 <wp:cNvGraphicFramePr/>
                 <a:graphic xmlns:a="http://schemas.openxmlformats.org/drawingml/2006/main">
                   <a:graphicData uri="http://schemas.microsoft.com/office/word/2010/wordprocessingShape">
@@ -356,7 +155,6 @@
                           <w:p>
                             <w:pPr>
                               <w:spacing w:after="0" w:line="240" w:lineRule="auto"/>
-                              <w:textDirection w:val="btLr"/>
                             </w:pPr>
                           </w:p>
                         </w:txbxContent>
@@ -372,14 +170,13 @@
           </mc:Choice>
           <mc:Fallback>
             <w:pict>
-              <v:rect id="Rectangle 240" o:spid="_x0000_s1028" style="position:absolute;margin-left:-1in;margin-top:14pt;width:77.5pt;height:38.85pt;z-index:251660288;visibility:visible;mso-wrap-style:square;mso-wrap-distance-left:9pt;mso-wrap-distance-top:0;mso-wrap-distance-right:9pt;mso-wrap-distance-bottom:0;mso-position-horizontal:absolute;mso-position-horizontal-relative:text;mso-position-vertical:absolute;mso-position-vertical-relative:text;v-text-anchor:middle" o:gfxdata="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" fillcolor="#0070c0" strokecolor="#42719b" strokeweight="1pt">
+              <v:rect w14:anchorId="7350214E" id="Rectangles 244" o:spid="_x0000_s1027" style="position:absolute;margin-left:-71.95pt;margin-top:13pt;width:78.5pt;height:39.85pt;z-index:251659264;visibility:visible;mso-wrap-style:square;mso-wrap-distance-left:9pt;mso-wrap-distance-top:0;mso-wrap-distance-right:9pt;mso-wrap-distance-bottom:0;mso-position-horizontal:absolute;mso-position-horizontal-relative:text;mso-position-vertical:absolute;mso-position-vertical-relative:text;v-text-anchor:middle" o:gfxdata="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" fillcolor="#0070c0" strokecolor="#42719b" strokeweight="1pt">
                 <v:stroke startarrowwidth="narrow" startarrowlength="short" endarrowwidth="narrow" endarrowlength="short"/>
                 <v:textbox inset="2.53958mm,2.53958mm,2.53958mm,2.53958mm">
                   <w:txbxContent>
                     <w:p>
                       <w:pPr>
                         <w:spacing w:after="0" w:line="240" w:lineRule="auto"/>
-                        <w:textDirection w:val="btLr"/>
                       </w:pPr>
                     </w:p>
                   </w:txbxContent>
@@ -390,157 +187,7 @@
         </mc:AlternateContent>
       </w:r>
     </w:p>
-    <w:p>
-      <w:r>
-        <w:rPr>
-          <w:noProof/>
-        </w:rPr>
-        <mc:AlternateContent>
-          <mc:Choice Requires="wps">
-            <w:drawing>
-              <wp:anchor distT="45720" distB="45720" distL="114300" distR="114300" simplePos="0" relativeHeight="251661312" behindDoc="0" locked="0" layoutInCell="1" hidden="0" allowOverlap="1">
-                <wp:simplePos x="0" y="0"/>
-                <wp:positionH relativeFrom="column">
-                  <wp:posOffset>4838700</wp:posOffset>
-                </wp:positionH>
-                <wp:positionV relativeFrom="paragraph">
-                  <wp:posOffset>169545</wp:posOffset>
-                </wp:positionV>
-                <wp:extent cx="1482725" cy="1416192"/>
-                <wp:effectExtent l="0" t="0" r="0" b="0"/>
-                <wp:wrapSquare wrapText="bothSides" distT="45720" distB="45720" distL="114300" distR="114300"/>
-                <wp:docPr id="237" name="Rectangle 237"/>
-                <wp:cNvGraphicFramePr/>
-                <a:graphic xmlns:a="http://schemas.openxmlformats.org/drawingml/2006/main">
-                  <a:graphicData uri="http://schemas.microsoft.com/office/word/2010/wordprocessingShape">
-                    <wps:wsp>
-                      <wps:cNvSpPr/>
-                      <wps:spPr>
-                        <a:xfrm>
-                          <a:off x="4614163" y="3077690"/>
-                          <a:ext cx="1463675" cy="1404620"/>
-                        </a:xfrm>
-                        <a:prstGeom prst="rect">
-                          <a:avLst/>
-                        </a:prstGeom>
-                        <a:noFill/>
-                        <a:ln>
-                          <a:noFill/>
-                        </a:ln>
-                      </wps:spPr>
-                      <wps:txbx>
-                        <w:txbxContent>
-                          <w:p>
-                            <w:pPr>
-                              <w:spacing w:after="0" w:line="240" w:lineRule="auto"/>
-                              <w:textDirection w:val="btLr"/>
-                            </w:pPr>
-                            <w:r>
-                              <w:rPr>
-                                <w:b/>
-                                <w:color w:val="000000"/>
-                              </w:rPr>
-                              <w:t>Universal Connect VN</w:t>
-                            </w:r>
-                          </w:p>
-                          <w:p>
-                            <w:pPr>
-                              <w:spacing w:after="0" w:line="240" w:lineRule="auto"/>
-                              <w:textDirection w:val="btLr"/>
-                            </w:pPr>
-                          </w:p>
-                        </w:txbxContent>
-                      </wps:txbx>
-                      <wps:bodyPr spcFirstLastPara="1" wrap="square" lIns="91425" tIns="45700" rIns="91425" bIns="45700" anchor="t" anchorCtr="0">
-                        <a:noAutofit/>
-                      </wps:bodyPr>
-                    </wps:wsp>
-                  </a:graphicData>
-                </a:graphic>
-              </wp:anchor>
-            </w:drawing>
-          </mc:Choice>
-          <mc:Fallback>
-            <w:pict>
-              <v:rect id="Rectangle 237" o:spid="_x0000_s1029" style="position:absolute;margin-left:381pt;margin-top:13.35pt;width:116.75pt;height:111.5pt;z-index:251661312;visibility:visible;mso-wrap-style:square;mso-wrap-distance-left:9pt;mso-wrap-distance-top:3.6pt;mso-wrap-distance-right:9pt;mso-wrap-distance-bottom:3.6pt;mso-position-horizontal:absolute;mso-position-horizontal-relative:text;mso-position-vertical:absolute;mso-position-vertical-relative:text;v-text-anchor:top" o:gfxdata="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" filled="f" stroked="f">
-                <v:textbox inset="2.53958mm,1.2694mm,2.53958mm,1.2694mm">
-                  <w:txbxContent>
-                    <w:p>
-                      <w:pPr>
-                        <w:spacing w:after="0" w:line="240" w:lineRule="auto"/>
-                        <w:textDirection w:val="btLr"/>
-                      </w:pPr>
-                      <w:r>
-                        <w:rPr>
-                          <w:b/>
-                          <w:color w:val="000000"/>
-                        </w:rPr>
-                        <w:t>Universal Connect VN</w:t>
-                      </w:r>
-                    </w:p>
-                    <w:p>
-                      <w:pPr>
-                        <w:spacing w:after="0" w:line="240" w:lineRule="auto"/>
-                        <w:textDirection w:val="btLr"/>
-                      </w:pPr>
-                    </w:p>
-                  </w:txbxContent>
-                </v:textbox>
-                <w10:wrap type="square"/>
-              </v:rect>
-            </w:pict>
-          </mc:Fallback>
-        </mc:AlternateContent>
-      </w:r>
-      <w:r>
-        <w:rPr>
-          <w:noProof/>
-        </w:rPr>
-        <w:drawing>
-          <wp:anchor distT="0" distB="0" distL="114300" distR="114300" simplePos="0" relativeHeight="251662336" behindDoc="0" locked="0" layoutInCell="1" hidden="0" allowOverlap="1">
-            <wp:simplePos x="0" y="0"/>
-            <wp:positionH relativeFrom="column">
-              <wp:posOffset>4229100</wp:posOffset>
-            </wp:positionH>
-            <wp:positionV relativeFrom="paragraph">
-              <wp:posOffset>77118</wp:posOffset>
-            </wp:positionV>
-            <wp:extent cx="628650" cy="366395"/>
-            <wp:effectExtent l="0" t="0" r="0" b="0"/>
-            <wp:wrapSquare wrapText="bothSides" distT="0" distB="0" distL="114300" distR="114300"/>
-            <wp:docPr id="243" name="image1.png"/>
-            <wp:cNvGraphicFramePr/>
-            <a:graphic xmlns:a="http://schemas.openxmlformats.org/drawingml/2006/main">
-              <a:graphicData uri="http://schemas.openxmlformats.org/drawingml/2006/picture">
-                <pic:pic xmlns:pic="http://schemas.openxmlformats.org/drawingml/2006/picture">
-                  <pic:nvPicPr>
-                    <pic:cNvPr id="0" name="image1.png"/>
-                    <pic:cNvPicPr preferRelativeResize="0"/>
-                  </pic:nvPicPr>
-                  <pic:blipFill>
-                    <a:blip r:embed="rId6"/>
-                    <a:srcRect/>
-                    <a:stretch>
-                      <a:fillRect/>
-                    </a:stretch>
-                  </pic:blipFill>
-                  <pic:spPr>
-                    <a:xfrm>
-                      <a:off x="0" y="0"/>
-                      <a:ext cx="628650" cy="366395"/>
-                    </a:xfrm>
-                    <a:prstGeom prst="rect">
-                      <a:avLst/>
-                    </a:prstGeom>
-                    <a:ln/>
-                  </pic:spPr>
-                </pic:pic>
-              </a:graphicData>
-            </a:graphic>
-          </wp:anchor>
-        </w:drawing>
-      </w:r>
-    </w:p>
+    <w:p/>
     <w:p/>
     <w:p>
       <w:r>
@@ -550,10 +197,10 @@
         <mc:AlternateContent>
           <mc:Choice Requires="wps">
             <w:drawing>
-              <wp:anchor distT="0" distB="0" distL="114300" distR="114300" simplePos="0" relativeHeight="251663360" behindDoc="0" locked="0" layoutInCell="1" hidden="0" allowOverlap="1">
+              <wp:anchor distT="0" distB="0" distL="114300" distR="114300" simplePos="0" relativeHeight="251660288" behindDoc="0" locked="0" layoutInCell="1" allowOverlap="1" wp14:anchorId="6BF3D629" wp14:editId="046BCB0D">
                 <wp:simplePos x="0" y="0"/>
                 <wp:positionH relativeFrom="column">
-                  <wp:posOffset>152400</wp:posOffset>
+                  <wp:posOffset>139700</wp:posOffset>
                 </wp:positionH>
                 <wp:positionV relativeFrom="paragraph">
                   <wp:posOffset>165100</wp:posOffset>
@@ -561,7 +208,7 @@
                 <wp:extent cx="0" cy="19050"/>
                 <wp:effectExtent l="0" t="0" r="0" b="0"/>
                 <wp:wrapNone/>
-                <wp:docPr id="234" name="Straight Arrow Connector 234"/>
+                <wp:docPr id="247" name="Straight Arrow Connector 247"/>
                 <wp:cNvGraphicFramePr/>
                 <a:graphic xmlns:a="http://schemas.openxmlformats.org/drawingml/2006/main">
                   <a:graphicData uri="http://schemas.microsoft.com/office/word/2010/wordprocessingShape">
@@ -593,47 +240,15 @@
               </wp:anchor>
             </w:drawing>
           </mc:Choice>
-          <mc:Fallback xmlns:cr="http://schemas.microsoft.com/office/comments/2020/reactions" xmlns="http://schemas.microsoft.com/office/tasks/2019/documenttasks" xmlns:w16cid="http://schemas.microsoft.com/office/word/2016/wordml/cid" xmlns:w16cex="http://schemas.microsoft.com/office/word/2018/wordml/cex" xmlns:w16="http://schemas.microsoft.com/office/word/2018/wordml" xmlns:dgm="http://schemas.openxmlformats.org/drawingml/2006/diagram" xmlns:lc="http://schemas.openxmlformats.org/drawingml/2006/lockedCanvas" xmlns:c="http://schemas.openxmlformats.org/drawingml/2006/chart" xmlns:pic="http://schemas.openxmlformats.org/drawingml/2006/picture" xmlns:a="http://schemas.openxmlformats.org/drawingml/2006/main" xmlns:sl="http://schemas.openxmlformats.org/schemaLibrary/2006/main">
-            <w:drawing>
-              <wp:anchor allowOverlap="1" behindDoc="0" distB="0" distT="0" distL="114300" distR="114300" hidden="0" layoutInCell="1" locked="0" relativeHeight="0" simplePos="0">
-                <wp:simplePos x="0" y="0"/>
-                <wp:positionH relativeFrom="column">
-                  <wp:posOffset>152400</wp:posOffset>
-                </wp:positionH>
-                <wp:positionV relativeFrom="paragraph">
-                  <wp:posOffset>165100</wp:posOffset>
-                </wp:positionV>
-                <wp:extent cx="0" cy="19050"/>
-                <wp:effectExtent b="0" l="0" r="0" t="0"/>
-                <wp:wrapNone/>
-                <wp:docPr id="234" name="image5.png"/>
-                <a:graphic>
-                  <a:graphicData uri="http://schemas.openxmlformats.org/drawingml/2006/picture">
-                    <pic:pic>
-                      <pic:nvPicPr>
-                        <pic:cNvPr id="0" name="image5.png"/>
-                        <pic:cNvPicPr preferRelativeResize="0"/>
-                      </pic:nvPicPr>
-                      <pic:blipFill>
-                        <a:blip r:embed="rId7"/>
-                        <a:srcRect/>
-                        <a:stretch>
-                          <a:fillRect/>
-                        </a:stretch>
-                      </pic:blipFill>
-                      <pic:spPr>
-                        <a:xfrm>
-                          <a:off x="0" y="0"/>
-                          <a:ext cx="0" cy="19050"/>
-                        </a:xfrm>
-                        <a:prstGeom prst="rect"/>
-                        <a:ln/>
-                      </pic:spPr>
-                    </pic:pic>
-                  </a:graphicData>
-                </a:graphic>
-              </wp:anchor>
-            </w:drawing>
+          <mc:Fallback xmlns:wpsCustomData="http://www.wps.cn/officeDocument/2013/wpsCustomData">
+            <w:pict>
+              <v:shape id="_x0000_s1026" o:spid="_x0000_s1026" o:spt="32" type="#_x0000_t32" style="position:absolute;left:0pt;margin-left:11pt;margin-top:13pt;height:1.5pt;width:0pt;z-index:0;mso-width-relative:page;mso-height-relative:page;" filled="f" stroked="t" coordsize="21600,21600" o:gfxdata="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">
+                <v:fill on="f" focussize="0,0"/>
+                <v:stroke weight="1.5pt" color="#0070C0" miterlimit="8" joinstyle="miter" startarrowwidth="narrow" startarrowlength="short" endarrowwidth="narrow" endarrowlength="short"/>
+                <v:imagedata o:title=""/>
+                <o:lock v:ext="edit" aspectratio="f"/>
+              </v:shape>
+            </w:pict>
           </mc:Fallback>
         </mc:AlternateContent>
       </w:r>
@@ -646,27 +261,31 @@
         <mc:AlternateContent>
           <mc:Choice Requires="wps">
             <w:drawing>
-              <wp:anchor distT="45720" distB="45720" distL="114300" distR="114300" simplePos="0" relativeHeight="251664384" behindDoc="0" locked="0" layoutInCell="1" hidden="0" allowOverlap="1">
+              <wp:anchor distT="45720" distB="45720" distL="114300" distR="114300" simplePos="0" relativeHeight="251669504" behindDoc="0" locked="0" layoutInCell="1" allowOverlap="1" wp14:anchorId="684FDDEA" wp14:editId="1D449B3A">
                 <wp:simplePos x="0" y="0"/>
                 <wp:positionH relativeFrom="column">
-                  <wp:posOffset>3947160</wp:posOffset>
+                  <wp:posOffset>238125</wp:posOffset>
                 </wp:positionH>
                 <wp:positionV relativeFrom="paragraph">
-                  <wp:posOffset>283210</wp:posOffset>
+                  <wp:posOffset>277495</wp:posOffset>
                 </wp:positionV>
-                <wp:extent cx="2690495" cy="1404620"/>
-                <wp:effectExtent l="0" t="0" r="0" b="5080"/>
-                <wp:wrapSquare wrapText="bothSides" distT="45720" distB="45720" distL="114300" distR="114300"/>
-                <wp:docPr id="233" name="Rectangle 233"/>
-                <wp:cNvGraphicFramePr/>
+                <wp:extent cx="2360930" cy="1409700"/>
+                <wp:effectExtent l="0" t="0" r="22860" b="19050"/>
+                <wp:wrapSquare wrapText="bothSides"/>
+                <wp:docPr id="1941324353" name="Text Box 2"/>
+                <wp:cNvGraphicFramePr>
+                  <a:graphicFrameLocks xmlns:a="http://schemas.openxmlformats.org/drawingml/2006/main"/>
+                </wp:cNvGraphicFramePr>
                 <a:graphic xmlns:a="http://schemas.openxmlformats.org/drawingml/2006/main">
                   <a:graphicData uri="http://schemas.microsoft.com/office/word/2010/wordprocessingShape">
                     <wps:wsp>
-                      <wps:cNvSpPr/>
-                      <wps:spPr>
+                      <wps:cNvSpPr txBox="1">
+                        <a:spLocks noChangeArrowheads="1"/>
+                      </wps:cNvSpPr>
+                      <wps:spPr bwMode="auto">
                         <a:xfrm>
                           <a:off x="0" y="0"/>
-                          <a:ext cx="2690495" cy="1404620"/>
+                          <a:ext cx="2360930" cy="1409700"/>
                         </a:xfrm>
                         <a:prstGeom prst="rect">
                           <a:avLst/>
@@ -674,8 +293,203 @@
                         <a:solidFill>
                           <a:srgbClr val="FFFFFF"/>
                         </a:solidFill>
-                        <a:ln>
+                        <a:ln w="9525">
+                          <a:solidFill>
+                            <a:srgbClr val="0070C0"/>
+                          </a:solidFill>
+                          <a:miter lim="800000"/>
+                          <a:headEnd/>
+                          <a:tailEnd/>
+                        </a:ln>
+                      </wps:spPr>
+                      <wps:txbx>
+                        <w:txbxContent>
+                          <w:p>
+                            <w:pPr>
+                              <w:widowControl w:val="0"/>
+                              <w:spacing w:line="258" w:lineRule="auto"/>
+                              <w:rPr>
+                                <w:b/>
+                                <w:bCs/>
+                              </w:rPr>
+                            </w:pPr>
+                            <w:r>
+                              <w:rPr>
+                                <w:b/>
+                                <w:bCs/>
+                              </w:rPr>
+                              <w:t>Billed To:</w:t>
+                            </w:r>
+                          </w:p>
+                          <w:p>
+                            <w:pPr>
+                              <w:widowControl w:val="0"/>
+                              <w:spacing w:line="258" w:lineRule="auto"/>
+                              <w:rPr>
+                                <w:sz w:val="28"/>
+                                <w:szCs w:val="28"/>
+                              </w:rPr>
+                            </w:pPr>
+                            <w:r>
+                              <w:rPr>
+                                <w:sz w:val="28"/>
+                                <w:szCs w:val="28"/>
+                              </w:rPr>
+                              <w:t>[UNIVERSITY NAME]</w:t>
+                            </w:r>
+                          </w:p>
+                          <w:p>
+                            <w:pPr>
+                              <w:rPr>
+                                <w:b/>
+                                <w:bCs/>
+                              </w:rPr>
+                            </w:pPr>
+                            <w:r>
+                              <w:rPr>
+                                <w:b/>
+                                <w:bCs/>
+                              </w:rPr>
+                              <w:t xml:space="preserve">Address: </w:t>
+                            </w:r>
+                          </w:p>
+                          <w:p>
+                            <w:r>
+                              <w:t>[Head office address]</w:t>
+                            </w:r>
+                          </w:p>
+                        </w:txbxContent>
+                      </wps:txbx>
+                      <wps:bodyPr rot="0" vert="horz" wrap="square" lIns="91440" tIns="45720" rIns="91440" bIns="45720" anchor="t" anchorCtr="0">
+                        <a:noAutofit/>
+                      </wps:bodyPr>
+                    </wps:wsp>
+                  </a:graphicData>
+                </a:graphic>
+                <wp14:sizeRelH relativeFrom="margin">
+                  <wp14:pctWidth>40000</wp14:pctWidth>
+                </wp14:sizeRelH>
+                <wp14:sizeRelV relativeFrom="margin">
+                  <wp14:pctHeight>0</wp14:pctHeight>
+                </wp14:sizeRelV>
+              </wp:anchor>
+            </w:drawing>
+          </mc:Choice>
+          <mc:Fallback>
+            <w:pict>
+              <v:shapetype w14:anchorId="684FDDEA" id="_x0000_t202" coordsize="21600,21600" o:spt="202" path="m,l,21600r21600,l21600,xe">
+                <v:stroke joinstyle="miter"/>
+                <v:path gradientshapeok="t" o:connecttype="rect"/>
+              </v:shapetype>
+              <v:shape id="Text Box 2" o:spid="_x0000_s1028" type="#_x0000_t202" style="position:absolute;margin-left:18.75pt;margin-top:21.85pt;width:185.9pt;height:111pt;z-index:251669504;visibility:visible;mso-wrap-style:square;mso-width-percent:400;mso-height-percent:0;mso-wrap-distance-left:9pt;mso-wrap-distance-top:3.6pt;mso-wrap-distance-right:9pt;mso-wrap-distance-bottom:3.6pt;mso-position-horizontal:absolute;mso-position-horizontal-relative:text;mso-position-vertical:absolute;mso-position-vertical-relative:text;mso-width-percent:400;mso-height-percent:0;mso-width-relative:margin;mso-height-relative:margin;v-text-anchor:top" o:gfxdata="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" strokecolor="#0070c0">
+                <v:textbox>
+                  <w:txbxContent>
+                    <w:p>
+                      <w:pPr>
+                        <w:widowControl w:val="0"/>
+                        <w:spacing w:line="258" w:lineRule="auto"/>
+                        <w:rPr>
+                          <w:b/>
+                          <w:bCs/>
+                        </w:rPr>
+                      </w:pPr>
+                      <w:r>
+                        <w:rPr>
+                          <w:b/>
+                          <w:bCs/>
+                        </w:rPr>
+                        <w:t>Billed To:</w:t>
+                      </w:r>
+                    </w:p>
+                    <w:p>
+                      <w:pPr>
+                        <w:widowControl w:val="0"/>
+                        <w:spacing w:line="258" w:lineRule="auto"/>
+                        <w:rPr>
+                          <w:sz w:val="28"/>
+                          <w:szCs w:val="28"/>
+                        </w:rPr>
+                      </w:pPr>
+                      <w:r>
+                        <w:rPr>
+                          <w:sz w:val="28"/>
+                          <w:szCs w:val="28"/>
+                        </w:rPr>
+                        <w:t>[UNIVERSITY NAME]</w:t>
+                      </w:r>
+                    </w:p>
+                    <w:p>
+                      <w:pPr>
+                        <w:rPr>
+                          <w:b/>
+                          <w:bCs/>
+                        </w:rPr>
+                      </w:pPr>
+                      <w:r>
+                        <w:rPr>
+                          <w:b/>
+                          <w:bCs/>
+                        </w:rPr>
+                        <w:t xml:space="preserve">Address: </w:t>
+                      </w:r>
+                    </w:p>
+                    <w:p>
+                      <w:r>
+                        <w:t>[Head office address]</w:t>
+                      </w:r>
+                    </w:p>
+                  </w:txbxContent>
+                </v:textbox>
+                <w10:wrap type="square"/>
+              </v:shape>
+            </w:pict>
+          </mc:Fallback>
+        </mc:AlternateContent>
+      </w:r>
+      <w:r>
+        <w:rPr>
+          <w:noProof/>
+        </w:rPr>
+        <mc:AlternateContent>
+          <mc:Choice Requires="wps">
+            <w:drawing>
+              <wp:anchor distT="45720" distB="45720" distL="114300" distR="114300" simplePos="0" relativeHeight="251667456" behindDoc="0" locked="0" layoutInCell="1" allowOverlap="1" wp14:anchorId="2A63FE6B" wp14:editId="5D34DF6A">
+                <wp:simplePos x="0" y="0"/>
+                <wp:positionH relativeFrom="column">
+                  <wp:posOffset>3543300</wp:posOffset>
+                </wp:positionH>
+                <wp:positionV relativeFrom="paragraph">
+                  <wp:posOffset>267970</wp:posOffset>
+                </wp:positionV>
+                <wp:extent cx="2647950" cy="1419225"/>
+                <wp:effectExtent l="0" t="0" r="0" b="9525"/>
+                <wp:wrapSquare wrapText="bothSides"/>
+                <wp:docPr id="217" name="Text Box 2"/>
+                <wp:cNvGraphicFramePr>
+                  <a:graphicFrameLocks xmlns:a="http://schemas.openxmlformats.org/drawingml/2006/main"/>
+                </wp:cNvGraphicFramePr>
+                <a:graphic xmlns:a="http://schemas.openxmlformats.org/drawingml/2006/main">
+                  <a:graphicData uri="http://schemas.microsoft.com/office/word/2010/wordprocessingShape">
+                    <wps:wsp>
+                      <wps:cNvSpPr txBox="1">
+                        <a:spLocks noChangeArrowheads="1"/>
+                      </wps:cNvSpPr>
+                      <wps:spPr bwMode="auto">
+                        <a:xfrm>
+                          <a:off x="0" y="0"/>
+                          <a:ext cx="2647950" cy="1419225"/>
+                        </a:xfrm>
+                        <a:prstGeom prst="rect">
+                          <a:avLst/>
+                        </a:prstGeom>
+                        <a:solidFill>
+                          <a:srgbClr val="FFFFFF"/>
+                        </a:solidFill>
+                        <a:ln w="9525">
                           <a:noFill/>
+                          <a:miter lim="800000"/>
+                          <a:headEnd/>
+                          <a:tailEnd/>
                         </a:ln>
                       </wps:spPr>
                       <wps:txbx>
@@ -683,7 +497,6 @@
                           <w:p>
                             <w:pPr>
                               <w:spacing w:after="0" w:line="240" w:lineRule="auto"/>
-                              <w:textDirection w:val="btLr"/>
                             </w:pPr>
                             <w:r>
                               <w:rPr>
@@ -695,7 +508,6 @@
                           <w:p>
                             <w:pPr>
                               <w:spacing w:after="0" w:line="240" w:lineRule="auto"/>
-                              <w:textDirection w:val="btLr"/>
                             </w:pPr>
                             <w:r>
                               <w:rPr>
@@ -703,7 +515,7 @@
                                 <w:color w:val="000000"/>
                                 <w:sz w:val="44"/>
                               </w:rPr>
-                              <w:t>$</w:t>
+                              <w:t>$[FINAL PRICE</w:t>
                             </w:r>
                             <w:r>
                               <w:rPr>
@@ -711,7 +523,7 @@
                                 <w:color w:val="000000"/>
                                 <w:sz w:val="44"/>
                               </w:rPr>
-                              <w:t>[FINAL PRICE]</w:t>
+                              <w:t xml:space="preserve"> * 108%</w:t>
                             </w:r>
                             <w:r>
                               <w:rPr>
@@ -719,38 +531,29 @@
                                 <w:color w:val="000000"/>
                                 <w:sz w:val="44"/>
                               </w:rPr>
-                              <w:t xml:space="preserve"> (USD)</w:t>
+                              <w:t>] (USD)</w:t>
                             </w:r>
                           </w:p>
                           <w:p>
                             <w:pPr>
                               <w:spacing w:after="0" w:line="240" w:lineRule="auto"/>
-                              <w:textDirection w:val="btLr"/>
                             </w:pPr>
                           </w:p>
                           <w:p>
                             <w:pPr>
                               <w:spacing w:after="0" w:line="240" w:lineRule="auto"/>
-                              <w:textDirection w:val="btLr"/>
                             </w:pPr>
                             <w:r>
                               <w:rPr>
                                 <w:b/>
                                 <w:color w:val="000000"/>
                               </w:rPr>
-                              <w:t xml:space="preserve">No: </w:t>
-                            </w:r>
-                            <w:r>
-                              <w:rPr>
-                                <w:b/>
-                                <w:color w:val="000000"/>
-                              </w:rPr>
-                              <w:t>[NO]</w:t>
+                              <w:t>No: [NO]</w:t>
                             </w:r>
                           </w:p>
                           <w:p>
                             <w:pPr>
-                              <w:textDirection w:val="btLr"/>
+                              <w:spacing w:line="258" w:lineRule="auto"/>
                             </w:pPr>
                             <w:r>
                               <w:rPr>
@@ -763,24 +566,13 @@
                               <w:rPr>
                                 <w:color w:val="000000"/>
                               </w:rPr>
-                              <w:t xml:space="preserve"> </w:t>
-                            </w:r>
-                            <w:r>
-                              <w:rPr>
-                                <w:color w:val="000000"/>
-                              </w:rPr>
-                              <w:t>[TODAY]</w:t>
+                              <w:t xml:space="preserve"> [TODAY]</w:t>
                             </w:r>
                           </w:p>
-                          <w:p>
-                            <w:pPr>
-                              <w:spacing w:after="0" w:line="240" w:lineRule="auto"/>
-                              <w:textDirection w:val="btLr"/>
-                            </w:pPr>
-                          </w:p>
+                          <w:p/>
                         </w:txbxContent>
                       </wps:txbx>
-                      <wps:bodyPr spcFirstLastPara="1" wrap="square" lIns="91425" tIns="45700" rIns="91425" bIns="45700" anchor="t" anchorCtr="0">
+                      <wps:bodyPr rot="0" vert="horz" wrap="square" lIns="91440" tIns="45720" rIns="91440" bIns="45720" anchor="t" anchorCtr="0">
                         <a:noAutofit/>
                       </wps:bodyPr>
                     </wps:wsp>
@@ -797,13 +589,16 @@
           </mc:Choice>
           <mc:Fallback>
             <w:pict>
-              <v:rect id="Rectangle 233" o:spid="_x0000_s1030" style="position:absolute;margin-left:310.8pt;margin-top:22.3pt;width:211.85pt;height:110.6pt;z-index:251664384;visibility:visible;mso-wrap-style:square;mso-width-percent:0;mso-height-percent:0;mso-wrap-distance-left:9pt;mso-wrap-distance-top:3.6pt;mso-wrap-distance-right:9pt;mso-wrap-distance-bottom:3.6pt;mso-position-horizontal:absolute;mso-position-horizontal-relative:text;mso-position-vertical:absolute;mso-position-vertical-relative:text;mso-width-percent:0;mso-height-percent:0;mso-width-relative:margin;mso-height-relative:margin;v-text-anchor:top" o:gfxdata="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" stroked="f">
-                <v:textbox inset="2.53958mm,1.2694mm,2.53958mm,1.2694mm">
+              <v:shapetype w14:anchorId="2A63FE6B" id="_x0000_t202" coordsize="21600,21600" o:spt="202" path="m,l,21600r21600,l21600,xe">
+                <v:stroke joinstyle="miter"/>
+                <v:path gradientshapeok="t" o:connecttype="rect"/>
+              </v:shapetype>
+              <v:shape id="_x0000_s1029" type="#_x0000_t202" style="position:absolute;margin-left:279pt;margin-top:21.1pt;width:208.5pt;height:111.75pt;z-index:251667456;visibility:visible;mso-wrap-style:square;mso-width-percent:0;mso-height-percent:0;mso-wrap-distance-left:9pt;mso-wrap-distance-top:3.6pt;mso-wrap-distance-right:9pt;mso-wrap-distance-bottom:3.6pt;mso-position-horizontal:absolute;mso-position-horizontal-relative:text;mso-position-vertical:absolute;mso-position-vertical-relative:text;mso-width-percent:0;mso-height-percent:0;mso-width-relative:margin;mso-height-relative:margin;v-text-anchor:top" o:gfxdata="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" stroked="f">
+                <v:textbox>
                   <w:txbxContent>
                     <w:p>
                       <w:pPr>
                         <w:spacing w:after="0" w:line="240" w:lineRule="auto"/>
-                        <w:textDirection w:val="btLr"/>
                       </w:pPr>
                       <w:r>
                         <w:rPr>
@@ -815,7 +610,6 @@
                     <w:p>
                       <w:pPr>
                         <w:spacing w:after="0" w:line="240" w:lineRule="auto"/>
-                        <w:textDirection w:val="btLr"/>
                       </w:pPr>
                       <w:r>
                         <w:rPr>
@@ -823,7 +617,7 @@
                           <w:color w:val="000000"/>
                           <w:sz w:val="44"/>
                         </w:rPr>
-                        <w:t>$</w:t>
+                        <w:t>$[FINAL PRICE</w:t>
                       </w:r>
                       <w:r>
                         <w:rPr>
@@ -831,7 +625,7 @@
                           <w:color w:val="000000"/>
                           <w:sz w:val="44"/>
                         </w:rPr>
-                        <w:t>[FINAL PRICE]</w:t>
+                        <w:t xml:space="preserve"> * 108%</w:t>
                       </w:r>
                       <w:r>
                         <w:rPr>
@@ -839,38 +633,29 @@
                           <w:color w:val="000000"/>
                           <w:sz w:val="44"/>
                         </w:rPr>
-                        <w:t xml:space="preserve"> (USD)</w:t>
+                        <w:t>] (USD)</w:t>
                       </w:r>
                     </w:p>
                     <w:p>
                       <w:pPr>
                         <w:spacing w:after="0" w:line="240" w:lineRule="auto"/>
-                        <w:textDirection w:val="btLr"/>
                       </w:pPr>
                     </w:p>
                     <w:p>
                       <w:pPr>
                         <w:spacing w:after="0" w:line="240" w:lineRule="auto"/>
-                        <w:textDirection w:val="btLr"/>
                       </w:pPr>
                       <w:r>
                         <w:rPr>
                           <w:b/>
                           <w:color w:val="000000"/>
                         </w:rPr>
-                        <w:t xml:space="preserve">No: </w:t>
-                      </w:r>
-                      <w:r>
-                        <w:rPr>
-                          <w:b/>
-                          <w:color w:val="000000"/>
-                        </w:rPr>
-                        <w:t>[NO]</w:t>
+                        <w:t>No: [NO]</w:t>
                       </w:r>
                     </w:p>
                     <w:p>
                       <w:pPr>
-                        <w:textDirection w:val="btLr"/>
+                        <w:spacing w:line="258" w:lineRule="auto"/>
                       </w:pPr>
                       <w:r>
                         <w:rPr>
@@ -883,25 +668,14 @@
                         <w:rPr>
                           <w:color w:val="000000"/>
                         </w:rPr>
-                        <w:t xml:space="preserve"> </w:t>
-                      </w:r>
-                      <w:r>
-                        <w:rPr>
-                          <w:color w:val="000000"/>
-                        </w:rPr>
-                        <w:t>[TODAY]</w:t>
+                        <w:t xml:space="preserve"> [TODAY]</w:t>
                       </w:r>
                     </w:p>
-                    <w:p>
-                      <w:pPr>
-                        <w:spacing w:after="0" w:line="240" w:lineRule="auto"/>
-                        <w:textDirection w:val="btLr"/>
-                      </w:pPr>
-                    </w:p>
+                    <w:p/>
                   </w:txbxContent>
                 </v:textbox>
                 <w10:wrap type="square"/>
-              </v:rect>
+              </v:shape>
             </w:pict>
           </mc:Fallback>
         </mc:AlternateContent>
@@ -917,10 +691,10 @@
         <mc:AlternateContent>
           <mc:Choice Requires="wps">
             <w:drawing>
-              <wp:anchor distT="0" distB="0" distL="114300" distR="114300" simplePos="0" relativeHeight="251665408" behindDoc="0" locked="0" layoutInCell="1" hidden="0" allowOverlap="1">
+              <wp:anchor distT="0" distB="0" distL="114300" distR="114300" simplePos="0" relativeHeight="251662336" behindDoc="0" locked="0" layoutInCell="1" allowOverlap="1" wp14:anchorId="492B75C8" wp14:editId="23525811">
                 <wp:simplePos x="0" y="0"/>
                 <wp:positionH relativeFrom="column">
-                  <wp:posOffset>4368800</wp:posOffset>
+                  <wp:posOffset>4356100</wp:posOffset>
                 </wp:positionH>
                 <wp:positionV relativeFrom="paragraph">
                   <wp:posOffset>88900</wp:posOffset>
@@ -928,7 +702,7 @@
                 <wp:extent cx="0" cy="19050"/>
                 <wp:effectExtent l="0" t="0" r="0" b="0"/>
                 <wp:wrapNone/>
-                <wp:docPr id="236" name="Straight Arrow Connector 236"/>
+                <wp:docPr id="251" name="Straight Arrow Connector 251"/>
                 <wp:cNvGraphicFramePr/>
                 <a:graphic xmlns:a="http://schemas.openxmlformats.org/drawingml/2006/main">
                   <a:graphicData uri="http://schemas.microsoft.com/office/word/2010/wordprocessingShape">
@@ -960,47 +734,15 @@
               </wp:anchor>
             </w:drawing>
           </mc:Choice>
-          <mc:Fallback xmlns:cr="http://schemas.microsoft.com/office/comments/2020/reactions" xmlns="http://schemas.microsoft.com/office/tasks/2019/documenttasks" xmlns:w16cid="http://schemas.microsoft.com/office/word/2016/wordml/cid" xmlns:w16cex="http://schemas.microsoft.com/office/word/2018/wordml/cex" xmlns:w16="http://schemas.microsoft.com/office/word/2018/wordml" xmlns:dgm="http://schemas.openxmlformats.org/drawingml/2006/diagram" xmlns:lc="http://schemas.openxmlformats.org/drawingml/2006/lockedCanvas" xmlns:c="http://schemas.openxmlformats.org/drawingml/2006/chart" xmlns:pic="http://schemas.openxmlformats.org/drawingml/2006/picture" xmlns:a="http://schemas.openxmlformats.org/drawingml/2006/main" xmlns:sl="http://schemas.openxmlformats.org/schemaLibrary/2006/main">
-            <w:drawing>
-              <wp:anchor allowOverlap="1" behindDoc="0" distB="0" distT="0" distL="114300" distR="114300" hidden="0" layoutInCell="1" locked="0" relativeHeight="0" simplePos="0">
-                <wp:simplePos x="0" y="0"/>
-                <wp:positionH relativeFrom="column">
-                  <wp:posOffset>4368800</wp:posOffset>
-                </wp:positionH>
-                <wp:positionV relativeFrom="paragraph">
-                  <wp:posOffset>88900</wp:posOffset>
-                </wp:positionV>
-                <wp:extent cx="0" cy="19050"/>
-                <wp:effectExtent b="0" l="0" r="0" t="0"/>
-                <wp:wrapNone/>
-                <wp:docPr id="236" name="image7.png"/>
-                <a:graphic>
-                  <a:graphicData uri="http://schemas.openxmlformats.org/drawingml/2006/picture">
-                    <pic:pic>
-                      <pic:nvPicPr>
-                        <pic:cNvPr id="0" name="image7.png"/>
-                        <pic:cNvPicPr preferRelativeResize="0"/>
-                      </pic:nvPicPr>
-                      <pic:blipFill>
-                        <a:blip r:embed="rId7"/>
-                        <a:srcRect/>
-                        <a:stretch>
-                          <a:fillRect/>
-                        </a:stretch>
-                      </pic:blipFill>
-                      <pic:spPr>
-                        <a:xfrm>
-                          <a:off x="0" y="0"/>
-                          <a:ext cx="0" cy="19050"/>
-                        </a:xfrm>
-                        <a:prstGeom prst="rect"/>
-                        <a:ln/>
-                      </pic:spPr>
-                    </pic:pic>
-                  </a:graphicData>
-                </a:graphic>
-              </wp:anchor>
-            </w:drawing>
+          <mc:Fallback xmlns:wpsCustomData="http://www.wps.cn/officeDocument/2013/wpsCustomData">
+            <w:pict>
+              <v:shape id="_x0000_s1026" o:spid="_x0000_s1026" o:spt="32" type="#_x0000_t32" style="position:absolute;left:0pt;margin-left:343pt;margin-top:7pt;height:1.5pt;width:0pt;z-index:0;mso-width-relative:page;mso-height-relative:page;" filled="f" stroked="t" coordsize="21600,21600" o:gfxdata="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">
+                <v:fill on="f" focussize="0,0"/>
+                <v:stroke weight="1.5pt" color="#0070C0" miterlimit="8" joinstyle="miter" startarrowwidth="narrow" startarrowlength="short" endarrowwidth="narrow" endarrowlength="short"/>
+                <v:imagedata o:title=""/>
+                <o:lock v:ext="edit" aspectratio="f"/>
+              </v:shape>
+            </w:pict>
           </mc:Fallback>
         </mc:AlternateContent>
       </w:r>
@@ -1008,12 +750,11 @@
     <w:p/>
     <w:p/>
     <w:p/>
-    <w:p/>
     <w:tbl>
       <w:tblPr>
-        <w:tblStyle w:val="a0"/>
-        <w:tblW w:w="8910" w:type="dxa"/>
-        <w:tblInd w:w="535" w:type="dxa"/>
+        <w:tblStyle w:val="Style22"/>
+        <w:tblW w:w="9024" w:type="dxa"/>
+        <w:tblInd w:w="421" w:type="dxa"/>
         <w:tblBorders>
           <w:top w:val="single" w:sz="4" w:space="0" w:color="000000"/>
           <w:left w:val="single" w:sz="4" w:space="0" w:color="000000"/>
@@ -1023,10 +764,10 @@
           <w:insideV w:val="single" w:sz="4" w:space="0" w:color="000000"/>
         </w:tblBorders>
         <w:tblLayout w:type="fixed"/>
-        <w:tblLook w:val="0400" w:firstRow="0" w:lastRow="0" w:firstColumn="0" w:lastColumn="0" w:noHBand="0" w:noVBand="1"/>
+        <w:tblLook w:val="04A0" w:firstRow="1" w:lastRow="0" w:firstColumn="1" w:lastColumn="0" w:noHBand="0" w:noVBand="1"/>
       </w:tblPr>
       <w:tblGrid>
-        <w:gridCol w:w="5310"/>
+        <w:gridCol w:w="5424"/>
         <w:gridCol w:w="790"/>
         <w:gridCol w:w="1369"/>
         <w:gridCol w:w="1441"/>
@@ -1034,7 +775,7 @@
       <w:tr>
         <w:tc>
           <w:tcPr>
-            <w:tcW w:w="5310" w:type="dxa"/>
+            <w:tcW w:w="5424" w:type="dxa"/>
             <w:shd w:val="clear" w:color="auto" w:fill="0070C0"/>
           </w:tcPr>
           <w:p>
@@ -1042,6 +783,7 @@
               <w:tabs>
                 <w:tab w:val="left" w:pos="1660"/>
               </w:tabs>
+              <w:spacing w:line="240" w:lineRule="auto"/>
               <w:rPr>
                 <w:b/>
                 <w:color w:val="F2F2F2"/>
@@ -1066,6 +808,7 @@
               <w:tabs>
                 <w:tab w:val="left" w:pos="1660"/>
               </w:tabs>
+              <w:spacing w:line="240" w:lineRule="auto"/>
               <w:jc w:val="center"/>
               <w:rPr>
                 <w:b/>
@@ -1091,6 +834,7 @@
               <w:tabs>
                 <w:tab w:val="left" w:pos="1660"/>
               </w:tabs>
+              <w:spacing w:line="240" w:lineRule="auto"/>
               <w:jc w:val="center"/>
               <w:rPr>
                 <w:b/>
@@ -1116,6 +860,7 @@
               <w:tabs>
                 <w:tab w:val="left" w:pos="1660"/>
               </w:tabs>
+              <w:spacing w:line="240" w:lineRule="auto"/>
               <w:jc w:val="center"/>
               <w:rPr>
                 <w:b/>
@@ -1135,7 +880,7 @@
       <w:tr>
         <w:tc>
           <w:tcPr>
-            <w:tcW w:w="5310" w:type="dxa"/>
+            <w:tcW w:w="5424" w:type="dxa"/>
             <w:tcBorders>
               <w:bottom w:val="single" w:sz="4" w:space="0" w:color="000000"/>
             </w:tcBorders>
@@ -1145,21 +890,33 @@
               <w:tabs>
                 <w:tab w:val="left" w:pos="1660"/>
               </w:tabs>
+              <w:spacing w:line="240" w:lineRule="auto"/>
+              <w:rPr>
+                <w:shd w:val="clear" w:color="auto" w:fill="F6B26B"/>
+              </w:rPr>
             </w:pPr>
             <w:r>
-              <w:t>UCV School Tour</w:t>
+              <w:t xml:space="preserve">UCV School Tour </w:t>
             </w:r>
             <w:r>
-              <w:t xml:space="preserve"> ([CITY NAMES])</w:t>
+              <w:t>(</w:t>
             </w:r>
-            <w:bookmarkStart w:id="0" w:name="_GoBack"/>
-            <w:bookmarkEnd w:id="0"/>
+            <w:r>
+              <w:rPr>
+                <w:highlight w:val="yellow"/>
+              </w:rPr>
+              <w:t>[CITY NAMES]</w:t>
+            </w:r>
+            <w:r>
+              <w:t>)</w:t>
+            </w:r>
           </w:p>
           <w:p>
             <w:pPr>
               <w:tabs>
                 <w:tab w:val="left" w:pos="1660"/>
               </w:tabs>
+              <w:spacing w:line="240" w:lineRule="auto"/>
             </w:pPr>
             <w:r>
               <w:t>(Logistics, School Visits, Transport, Catering)</w:t>
@@ -1170,6 +927,7 @@
               <w:tabs>
                 <w:tab w:val="left" w:pos="1660"/>
               </w:tabs>
+              <w:spacing w:line="240" w:lineRule="auto"/>
             </w:pPr>
           </w:p>
         </w:tc>
@@ -1185,6 +943,7 @@
               <w:tabs>
                 <w:tab w:val="left" w:pos="1660"/>
               </w:tabs>
+              <w:spacing w:line="240" w:lineRule="auto"/>
               <w:jc w:val="center"/>
             </w:pPr>
           </w:p>
@@ -1193,6 +952,7 @@
               <w:tabs>
                 <w:tab w:val="left" w:pos="1660"/>
               </w:tabs>
+              <w:spacing w:line="240" w:lineRule="auto"/>
               <w:jc w:val="center"/>
             </w:pPr>
             <w:r>
@@ -1212,6 +972,7 @@
               <w:tabs>
                 <w:tab w:val="left" w:pos="1660"/>
               </w:tabs>
+              <w:spacing w:line="240" w:lineRule="auto"/>
               <w:jc w:val="center"/>
             </w:pPr>
           </w:p>
@@ -1220,6 +981,7 @@
               <w:tabs>
                 <w:tab w:val="left" w:pos="1660"/>
               </w:tabs>
+              <w:spacing w:line="240" w:lineRule="auto"/>
               <w:jc w:val="center"/>
             </w:pPr>
             <w:r>
@@ -1242,6 +1004,7 @@
               <w:tabs>
                 <w:tab w:val="left" w:pos="1660"/>
               </w:tabs>
+              <w:spacing w:line="240" w:lineRule="auto"/>
               <w:jc w:val="center"/>
             </w:pPr>
           </w:p>
@@ -1250,6 +1013,7 @@
               <w:tabs>
                 <w:tab w:val="left" w:pos="1660"/>
               </w:tabs>
+              <w:spacing w:line="240" w:lineRule="auto"/>
               <w:jc w:val="center"/>
             </w:pPr>
             <w:r>
@@ -1264,7 +1028,7 @@
       <w:tr>
         <w:tc>
           <w:tcPr>
-            <w:tcW w:w="5310" w:type="dxa"/>
+            <w:tcW w:w="5424" w:type="dxa"/>
             <w:tcBorders>
               <w:top w:val="nil"/>
               <w:left w:val="nil"/>
@@ -1277,6 +1041,7 @@
               <w:tabs>
                 <w:tab w:val="left" w:pos="1660"/>
               </w:tabs>
+              <w:spacing w:line="240" w:lineRule="auto"/>
             </w:pPr>
           </w:p>
         </w:tc>
@@ -1295,6 +1060,7 @@
               <w:tabs>
                 <w:tab w:val="left" w:pos="1660"/>
               </w:tabs>
+              <w:spacing w:line="240" w:lineRule="auto"/>
               <w:jc w:val="center"/>
             </w:pPr>
           </w:p>
@@ -1311,6 +1077,19 @@
               <w:tabs>
                 <w:tab w:val="left" w:pos="1660"/>
               </w:tabs>
+              <w:spacing w:line="240" w:lineRule="auto"/>
+              <w:jc w:val="center"/>
+              <w:rPr>
+                <w:b/>
+              </w:rPr>
+            </w:pPr>
+          </w:p>
+          <w:p>
+            <w:pPr>
+              <w:tabs>
+                <w:tab w:val="left" w:pos="1660"/>
+              </w:tabs>
+              <w:spacing w:line="240" w:lineRule="auto"/>
               <w:jc w:val="center"/>
               <w:rPr>
                 <w:b/>
@@ -1323,6 +1102,18 @@
               <w:t>Sub Total</w:t>
             </w:r>
           </w:p>
+          <w:p>
+            <w:pPr>
+              <w:tabs>
+                <w:tab w:val="left" w:pos="1660"/>
+              </w:tabs>
+              <w:spacing w:line="240" w:lineRule="auto"/>
+              <w:jc w:val="center"/>
+              <w:rPr>
+                <w:b/>
+              </w:rPr>
+            </w:pPr>
+          </w:p>
         </w:tc>
         <w:tc>
           <w:tcPr>
@@ -1333,6 +1124,16 @@
               <w:tabs>
                 <w:tab w:val="left" w:pos="1660"/>
               </w:tabs>
+              <w:spacing w:line="240" w:lineRule="auto"/>
+              <w:jc w:val="center"/>
+            </w:pPr>
+          </w:p>
+          <w:p>
+            <w:pPr>
+              <w:tabs>
+                <w:tab w:val="left" w:pos="1660"/>
+              </w:tabs>
+              <w:spacing w:line="240" w:lineRule="auto"/>
               <w:jc w:val="center"/>
             </w:pPr>
             <w:r>
@@ -1347,7 +1148,7 @@
       <w:tr>
         <w:tc>
           <w:tcPr>
-            <w:tcW w:w="5310" w:type="dxa"/>
+            <w:tcW w:w="5424" w:type="dxa"/>
             <w:tcBorders>
               <w:top w:val="nil"/>
               <w:left w:val="nil"/>
@@ -1360,6 +1161,7 @@
               <w:tabs>
                 <w:tab w:val="left" w:pos="1660"/>
               </w:tabs>
+              <w:spacing w:line="240" w:lineRule="auto"/>
             </w:pPr>
           </w:p>
         </w:tc>
@@ -1378,6 +1180,7 @@
               <w:tabs>
                 <w:tab w:val="left" w:pos="1660"/>
               </w:tabs>
+              <w:spacing w:line="240" w:lineRule="auto"/>
               <w:jc w:val="center"/>
             </w:pPr>
           </w:p>
@@ -1394,6 +1197,7 @@
               <w:tabs>
                 <w:tab w:val="left" w:pos="1660"/>
               </w:tabs>
+              <w:spacing w:line="240" w:lineRule="auto"/>
               <w:jc w:val="center"/>
               <w:rPr>
                 <w:b/>
@@ -1416,10 +1220,14 @@
               <w:tabs>
                 <w:tab w:val="left" w:pos="1660"/>
               </w:tabs>
+              <w:spacing w:line="240" w:lineRule="auto"/>
               <w:jc w:val="center"/>
             </w:pPr>
             <w:r>
-              <w:t>10%</w:t>
+              <w:t>8</w:t>
+            </w:r>
+            <w:r>
+              <w:t>%</w:t>
             </w:r>
           </w:p>
           <w:p>
@@ -1427,6 +1235,7 @@
               <w:tabs>
                 <w:tab w:val="left" w:pos="1660"/>
               </w:tabs>
+              <w:spacing w:line="240" w:lineRule="auto"/>
               <w:jc w:val="center"/>
             </w:pPr>
           </w:p>
@@ -1435,7 +1244,7 @@
       <w:tr>
         <w:tc>
           <w:tcPr>
-            <w:tcW w:w="5310" w:type="dxa"/>
+            <w:tcW w:w="5424" w:type="dxa"/>
             <w:tcBorders>
               <w:top w:val="nil"/>
               <w:left w:val="nil"/>
@@ -1448,6 +1257,7 @@
               <w:tabs>
                 <w:tab w:val="left" w:pos="1660"/>
               </w:tabs>
+              <w:spacing w:line="240" w:lineRule="auto"/>
             </w:pPr>
           </w:p>
         </w:tc>
@@ -1466,6 +1276,7 @@
               <w:tabs>
                 <w:tab w:val="left" w:pos="1660"/>
               </w:tabs>
+              <w:spacing w:line="240" w:lineRule="auto"/>
               <w:jc w:val="center"/>
             </w:pPr>
           </w:p>
@@ -1482,6 +1293,7 @@
               <w:tabs>
                 <w:tab w:val="left" w:pos="1660"/>
               </w:tabs>
+              <w:spacing w:line="240" w:lineRule="auto"/>
               <w:jc w:val="center"/>
               <w:rPr>
                 <w:b/>
@@ -1504,6 +1316,7 @@
               <w:tabs>
                 <w:tab w:val="left" w:pos="1660"/>
               </w:tabs>
+              <w:spacing w:line="240" w:lineRule="auto"/>
               <w:jc w:val="center"/>
               <w:rPr>
                 <w:b/>
@@ -1513,19 +1326,19 @@
               <w:rPr>
                 <w:b/>
               </w:rPr>
-              <w:t>$</w:t>
+              <w:t>$[FINAL PRICE * 1</w:t>
             </w:r>
             <w:r>
               <w:rPr>
                 <w:b/>
               </w:rPr>
-              <w:t>[FINAL PRICE * 110%]</w:t>
+              <w:t>08</w:t>
             </w:r>
             <w:r>
               <w:rPr>
                 <w:b/>
               </w:rPr>
-              <w:t xml:space="preserve"> (USD)</w:t>
+              <w:t>%] (USD)</w:t>
             </w:r>
           </w:p>
           <w:p>
@@ -1533,6 +1346,7 @@
               <w:tabs>
                 <w:tab w:val="left" w:pos="1660"/>
               </w:tabs>
+              <w:spacing w:line="240" w:lineRule="auto"/>
               <w:jc w:val="center"/>
             </w:pPr>
           </w:p>
@@ -1545,33 +1359,31 @@
           <w:tab w:val="left" w:pos="1660"/>
         </w:tabs>
       </w:pPr>
-      <w:bookmarkStart w:id="1" w:name="_heading=h.gjdgxs" w:colFirst="0" w:colLast="0"/>
-      <w:bookmarkEnd w:id="1"/>
+      <w:bookmarkStart w:id="0" w:name="_heading=h.gjdgxs" w:colFirst="0" w:colLast="0"/>
+      <w:bookmarkEnd w:id="0"/>
     </w:p>
     <w:p>
       <w:pPr>
         <w:spacing w:after="0" w:line="240" w:lineRule="auto"/>
         <w:ind w:firstLine="360"/>
-        <w:textDirection w:val="btLr"/>
       </w:pPr>
       <w:r>
         <w:rPr>
           <w:b/>
           <w:color w:val="000000"/>
           <w:sz w:val="28"/>
+          <w:szCs w:val="28"/>
         </w:rPr>
         <w:t>Bank transfer:</w:t>
       </w:r>
     </w:p>
     <w:p>
       <w:pPr>
-        <w:pStyle w:val="ListParagraph"/>
         <w:numPr>
           <w:ilvl w:val="0"/>
-          <w:numId w:val="2"/>
+          <w:numId w:val="1"/>
         </w:numPr>
         <w:spacing w:after="0" w:line="240" w:lineRule="auto"/>
-        <w:textDirection w:val="btLr"/>
       </w:pPr>
       <w:r>
         <w:rPr>
@@ -1589,13 +1401,11 @@
     </w:p>
     <w:p>
       <w:pPr>
-        <w:pStyle w:val="ListParagraph"/>
         <w:numPr>
           <w:ilvl w:val="0"/>
-          <w:numId w:val="2"/>
+          <w:numId w:val="1"/>
         </w:numPr>
         <w:spacing w:after="0" w:line="240" w:lineRule="auto"/>
-        <w:textDirection w:val="btLr"/>
       </w:pPr>
       <w:r>
         <w:rPr>
@@ -1620,44 +1430,33 @@
     </w:p>
     <w:p>
       <w:pPr>
-        <w:pStyle w:val="ListParagraph"/>
         <w:numPr>
           <w:ilvl w:val="0"/>
-          <w:numId w:val="2"/>
+          <w:numId w:val="1"/>
         </w:numPr>
         <w:spacing w:after="0" w:line="240" w:lineRule="auto"/>
-        <w:textDirection w:val="btLr"/>
       </w:pPr>
       <w:r>
         <w:rPr>
           <w:b/>
           <w:color w:val="000000"/>
         </w:rPr>
-        <w:t>Bank Acc Name</w:t>
-      </w:r>
-      <w:r>
-        <w:rPr>
-          <w:b/>
-          <w:color w:val="000000"/>
-        </w:rPr>
-        <w:t>:</w:t>
+        <w:t>Bank Acc Name:</w:t>
       </w:r>
       <w:r>
         <w:rPr>
           <w:color w:val="000000"/>
         </w:rPr>
-        <w:t xml:space="preserve"> Cong Ty TNHH Universal Connect VN</w:t>
+        <w:t xml:space="preserve"> Cong Ty TNHH Universal Connect VN (UCV)</w:t>
       </w:r>
     </w:p>
     <w:p>
       <w:pPr>
-        <w:pStyle w:val="ListParagraph"/>
         <w:numPr>
           <w:ilvl w:val="0"/>
-          <w:numId w:val="2"/>
+          <w:numId w:val="1"/>
         </w:numPr>
         <w:spacing w:after="0" w:line="240" w:lineRule="auto"/>
-        <w:textDirection w:val="btLr"/>
         <w:rPr>
           <w:color w:val="202124"/>
           <w:highlight w:val="white"/>
@@ -1686,13 +1485,11 @@
     </w:p>
     <w:p>
       <w:pPr>
-        <w:pStyle w:val="ListParagraph"/>
         <w:numPr>
           <w:ilvl w:val="0"/>
-          <w:numId w:val="2"/>
+          <w:numId w:val="1"/>
         </w:numPr>
         <w:spacing w:after="0" w:line="240" w:lineRule="auto"/>
-        <w:textDirection w:val="btLr"/>
       </w:pPr>
       <w:r>
         <w:rPr>
@@ -1704,13 +1501,11 @@
     </w:p>
     <w:p>
       <w:pPr>
-        <w:pStyle w:val="ListParagraph"/>
         <w:numPr>
           <w:ilvl w:val="0"/>
-          <w:numId w:val="2"/>
+          <w:numId w:val="1"/>
         </w:numPr>
         <w:spacing w:after="0" w:line="240" w:lineRule="auto"/>
-        <w:textDirection w:val="btLr"/>
       </w:pPr>
       <w:r>
         <w:rPr>
@@ -1728,13 +1523,11 @@
     </w:p>
     <w:p>
       <w:pPr>
-        <w:pStyle w:val="ListParagraph"/>
         <w:numPr>
           <w:ilvl w:val="0"/>
-          <w:numId w:val="2"/>
+          <w:numId w:val="1"/>
         </w:numPr>
         <w:spacing w:after="0" w:line="240" w:lineRule="auto"/>
-        <w:textDirection w:val="btLr"/>
       </w:pPr>
       <w:r>
         <w:rPr>
@@ -1763,17 +1556,6 @@
           <w:tab w:val="left" w:pos="1660"/>
         </w:tabs>
       </w:pPr>
-    </w:p>
-    <w:p>
-      <w:pPr>
-        <w:spacing w:line="258" w:lineRule="auto"/>
-        <w:ind w:firstLine="360"/>
-        <w:textDirection w:val="btLr"/>
-        <w:rPr>
-          <w:color w:val="000000"/>
-          <w:sz w:val="28"/>
-        </w:rPr>
-      </w:pPr>
       <w:r>
         <w:rPr>
           <w:noProof/>
@@ -1781,18 +1563,156 @@
         <mc:AlternateContent>
           <mc:Choice Requires="wps">
             <w:drawing>
-              <wp:anchor distT="45720" distB="45720" distL="114300" distR="114300" simplePos="0" relativeHeight="251670528" behindDoc="0" locked="0" layoutInCell="1" hidden="0" allowOverlap="1" wp14:anchorId="06B8548E" wp14:editId="689084E7">
+              <wp:anchor distT="45720" distB="45720" distL="114300" distR="114300" simplePos="0" relativeHeight="251671552" behindDoc="0" locked="0" layoutInCell="1" allowOverlap="1" wp14:anchorId="73066286" wp14:editId="16BFB414">
                 <wp:simplePos x="0" y="0"/>
                 <wp:positionH relativeFrom="column">
-                  <wp:posOffset>3987800</wp:posOffset>
+                  <wp:posOffset>9525</wp:posOffset>
                 </wp:positionH>
                 <wp:positionV relativeFrom="paragraph">
-                  <wp:posOffset>5080</wp:posOffset>
+                  <wp:posOffset>35560</wp:posOffset>
                 </wp:positionV>
-                <wp:extent cx="1746250" cy="685800"/>
+                <wp:extent cx="2238375" cy="704850"/>
+                <wp:effectExtent l="0" t="0" r="9525" b="0"/>
+                <wp:wrapSquare wrapText="bothSides"/>
+                <wp:docPr id="316205217" name="Text Box 2"/>
+                <wp:cNvGraphicFramePr>
+                  <a:graphicFrameLocks xmlns:a="http://schemas.openxmlformats.org/drawingml/2006/main"/>
+                </wp:cNvGraphicFramePr>
+                <a:graphic xmlns:a="http://schemas.openxmlformats.org/drawingml/2006/main">
+                  <a:graphicData uri="http://schemas.microsoft.com/office/word/2010/wordprocessingShape">
+                    <wps:wsp>
+                      <wps:cNvSpPr txBox="1">
+                        <a:spLocks noChangeArrowheads="1"/>
+                      </wps:cNvSpPr>
+                      <wps:spPr bwMode="auto">
+                        <a:xfrm>
+                          <a:off x="0" y="0"/>
+                          <a:ext cx="2238375" cy="704850"/>
+                        </a:xfrm>
+                        <a:prstGeom prst="rect">
+                          <a:avLst/>
+                        </a:prstGeom>
+                        <a:solidFill>
+                          <a:srgbClr val="FFFFFF"/>
+                        </a:solidFill>
+                        <a:ln w="9525">
+                          <a:noFill/>
+                          <a:miter lim="800000"/>
+                          <a:headEnd/>
+                          <a:tailEnd/>
+                        </a:ln>
+                      </wps:spPr>
+                      <wps:txbx>
+                        <w:txbxContent>
+                          <w:p>
+                            <w:pPr>
+                              <w:tabs>
+                                <w:tab w:val="left" w:pos="1660"/>
+                              </w:tabs>
+                            </w:pPr>
+                            <w:r>
+                              <w:rPr>
+                                <w:color w:val="000000"/>
+                                <w:sz w:val="28"/>
+                                <w:szCs w:val="28"/>
+                              </w:rPr>
+                              <w:t xml:space="preserve">Thank you for trusting us in </w:t>
+                            </w:r>
+                          </w:p>
+                          <w:p>
+                            <w:pPr>
+                              <w:spacing w:line="258" w:lineRule="auto"/>
+                              <w:ind w:firstLine="360"/>
+                            </w:pPr>
+                            <w:r>
+                              <w:rPr>
+                                <w:color w:val="000000"/>
+                                <w:sz w:val="28"/>
+                                <w:szCs w:val="28"/>
+                              </w:rPr>
+                              <w:t>supporting you!</w:t>
+                            </w:r>
+                          </w:p>
+                          <w:p/>
+                        </w:txbxContent>
+                      </wps:txbx>
+                      <wps:bodyPr rot="0" vert="horz" wrap="square" lIns="91440" tIns="45720" rIns="91440" bIns="45720" anchor="t" anchorCtr="0">
+                        <a:noAutofit/>
+                      </wps:bodyPr>
+                    </wps:wsp>
+                  </a:graphicData>
+                </a:graphic>
+                <wp14:sizeRelH relativeFrom="margin">
+                  <wp14:pctWidth>0</wp14:pctWidth>
+                </wp14:sizeRelH>
+                <wp14:sizeRelV relativeFrom="margin">
+                  <wp14:pctHeight>0</wp14:pctHeight>
+                </wp14:sizeRelV>
+              </wp:anchor>
+            </w:drawing>
+          </mc:Choice>
+          <mc:Fallback>
+            <w:pict>
+              <v:shape w14:anchorId="73066286" id="_x0000_s1030" type="#_x0000_t202" style="position:absolute;margin-left:.75pt;margin-top:2.8pt;width:176.25pt;height:55.5pt;z-index:251671552;visibility:visible;mso-wrap-style:square;mso-width-percent:0;mso-height-percent:0;mso-wrap-distance-left:9pt;mso-wrap-distance-top:3.6pt;mso-wrap-distance-right:9pt;mso-wrap-distance-bottom:3.6pt;mso-position-horizontal:absolute;mso-position-horizontal-relative:text;mso-position-vertical:absolute;mso-position-vertical-relative:text;mso-width-percent:0;mso-height-percent:0;mso-width-relative:margin;mso-height-relative:margin;v-text-anchor:top" o:gfxdata="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" stroked="f">
+                <v:textbox>
+                  <w:txbxContent>
+                    <w:p>
+                      <w:pPr>
+                        <w:tabs>
+                          <w:tab w:val="left" w:pos="1660"/>
+                        </w:tabs>
+                      </w:pPr>
+                      <w:r>
+                        <w:rPr>
+                          <w:color w:val="000000"/>
+                          <w:sz w:val="28"/>
+                          <w:szCs w:val="28"/>
+                        </w:rPr>
+                        <w:t xml:space="preserve">Thank you for trusting us in </w:t>
+                      </w:r>
+                    </w:p>
+                    <w:p>
+                      <w:pPr>
+                        <w:spacing w:line="258" w:lineRule="auto"/>
+                        <w:ind w:firstLine="360"/>
+                      </w:pPr>
+                      <w:r>
+                        <w:rPr>
+                          <w:color w:val="000000"/>
+                          <w:sz w:val="28"/>
+                          <w:szCs w:val="28"/>
+                        </w:rPr>
+                        <w:t>supporting you!</w:t>
+                      </w:r>
+                    </w:p>
+                    <w:p/>
+                  </w:txbxContent>
+                </v:textbox>
+                <w10:wrap type="square"/>
+              </v:shape>
+            </w:pict>
+          </mc:Fallback>
+        </mc:AlternateContent>
+      </w:r>
+      <w:r>
+        <w:rPr>
+          <w:noProof/>
+        </w:rPr>
+        <mc:AlternateContent>
+          <mc:Choice Requires="wps">
+            <w:drawing>
+              <wp:anchor distT="45720" distB="45720" distL="114300" distR="114300" simplePos="0" relativeHeight="251663360" behindDoc="0" locked="0" layoutInCell="1" allowOverlap="1" wp14:anchorId="290958EC" wp14:editId="08B84844">
+                <wp:simplePos x="0" y="0"/>
+                <wp:positionH relativeFrom="column">
+                  <wp:posOffset>3975100</wp:posOffset>
+                </wp:positionH>
+                <wp:positionV relativeFrom="paragraph">
+                  <wp:posOffset>64770</wp:posOffset>
+                </wp:positionV>
+                <wp:extent cx="1755775" cy="695325"/>
                 <wp:effectExtent l="0" t="0" r="0" b="0"/>
-                <wp:wrapSquare wrapText="bothSides" distT="45720" distB="45720" distL="114300" distR="114300"/>
-                <wp:docPr id="231" name="Rectangle 231"/>
+                <wp:wrapSquare wrapText="bothSides"/>
+                <wp:docPr id="246" name="Rectangles 246"/>
                 <wp:cNvGraphicFramePr/>
                 <a:graphic xmlns:a="http://schemas.openxmlformats.org/drawingml/2006/main">
                   <a:graphicData uri="http://schemas.microsoft.com/office/word/2010/wordprocessingShape">
@@ -1801,7 +1721,7 @@
                       <wps:spPr>
                         <a:xfrm>
                           <a:off x="0" y="0"/>
-                          <a:ext cx="1746250" cy="685800"/>
+                          <a:ext cx="1755775" cy="695325"/>
                         </a:xfrm>
                         <a:prstGeom prst="rect">
                           <a:avLst/>
@@ -1819,12 +1739,20 @@
                             <w:pPr>
                               <w:spacing w:after="0" w:line="240" w:lineRule="auto"/>
                               <w:jc w:val="center"/>
-                              <w:textDirection w:val="btLr"/>
+                              <w:rPr>
+                                <w:b/>
+                                <w:bCs/>
+                                <w:sz w:val="28"/>
+                                <w:szCs w:val="28"/>
+                              </w:rPr>
                             </w:pPr>
                             <w:r>
                               <w:rPr>
+                                <w:b/>
+                                <w:bCs/>
                                 <w:color w:val="000000"/>
-                                <w:sz w:val="24"/>
+                                <w:sz w:val="28"/>
+                                <w:szCs w:val="28"/>
                               </w:rPr>
                               <w:t>Bernd Widemann</w:t>
                             </w:r>
@@ -1833,15 +1761,14 @@
                             <w:pPr>
                               <w:spacing w:after="0" w:line="240" w:lineRule="auto"/>
                               <w:jc w:val="center"/>
-                              <w:textDirection w:val="btLr"/>
                             </w:pPr>
-                          </w:p>
-                          <w:p>
-                            <w:pPr>
-                              <w:spacing w:after="0" w:line="240" w:lineRule="auto"/>
-                              <w:jc w:val="center"/>
-                              <w:textDirection w:val="btLr"/>
-                            </w:pPr>
+                            <w:r>
+                              <w:rPr>
+                                <w:color w:val="000000"/>
+                                <w:sz w:val="24"/>
+                              </w:rPr>
+                              <w:t xml:space="preserve">Tour </w:t>
+                            </w:r>
                             <w:r>
                               <w:rPr>
                                 <w:color w:val="000000"/>
@@ -1863,19 +1790,27 @@
           </mc:Choice>
           <mc:Fallback>
             <w:pict>
-              <v:rect w14:anchorId="06B8548E" id="Rectangle 231" o:spid="_x0000_s1031" style="position:absolute;left:0;text-align:left;margin-left:314pt;margin-top:.4pt;width:137.5pt;height:54pt;z-index:251670528;visibility:visible;mso-wrap-style:square;mso-wrap-distance-left:9pt;mso-wrap-distance-top:3.6pt;mso-wrap-distance-right:9pt;mso-wrap-distance-bottom:3.6pt;mso-position-horizontal:absolute;mso-position-horizontal-relative:text;mso-position-vertical:absolute;mso-position-vertical-relative:text;v-text-anchor:top" o:gfxdata="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" stroked="f">
+              <v:rect w14:anchorId="290958EC" id="Rectangles 246" o:spid="_x0000_s1031" style="position:absolute;margin-left:313pt;margin-top:5.1pt;width:138.25pt;height:54.75pt;z-index:251663360;visibility:visible;mso-wrap-style:square;mso-wrap-distance-left:9pt;mso-wrap-distance-top:3.6pt;mso-wrap-distance-right:9pt;mso-wrap-distance-bottom:3.6pt;mso-position-horizontal:absolute;mso-position-horizontal-relative:text;mso-position-vertical:absolute;mso-position-vertical-relative:text;v-text-anchor:top" o:gfxdata="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" stroked="f">
                 <v:textbox inset="2.53958mm,1.2694mm,2.53958mm,1.2694mm">
                   <w:txbxContent>
                     <w:p>
                       <w:pPr>
                         <w:spacing w:after="0" w:line="240" w:lineRule="auto"/>
                         <w:jc w:val="center"/>
-                        <w:textDirection w:val="btLr"/>
+                        <w:rPr>
+                          <w:b/>
+                          <w:bCs/>
+                          <w:sz w:val="28"/>
+                          <w:szCs w:val="28"/>
+                        </w:rPr>
                       </w:pPr>
                       <w:r>
                         <w:rPr>
+                          <w:b/>
+                          <w:bCs/>
                           <w:color w:val="000000"/>
-                          <w:sz w:val="24"/>
+                          <w:sz w:val="28"/>
+                          <w:szCs w:val="28"/>
                         </w:rPr>
                         <w:t>Bernd Widemann</w:t>
                       </w:r>
@@ -1884,15 +1819,14 @@
                       <w:pPr>
                         <w:spacing w:after="0" w:line="240" w:lineRule="auto"/>
                         <w:jc w:val="center"/>
-                        <w:textDirection w:val="btLr"/>
                       </w:pPr>
-                    </w:p>
-                    <w:p>
-                      <w:pPr>
-                        <w:spacing w:after="0" w:line="240" w:lineRule="auto"/>
-                        <w:jc w:val="center"/>
-                        <w:textDirection w:val="btLr"/>
-                      </w:pPr>
+                      <w:r>
+                        <w:rPr>
+                          <w:color w:val="000000"/>
+                          <w:sz w:val="24"/>
+                        </w:rPr>
+                        <w:t xml:space="preserve">Tour </w:t>
+                      </w:r>
                       <w:r>
                         <w:rPr>
                           <w:color w:val="000000"/>
@@ -1909,28 +1843,9 @@
           </mc:Fallback>
         </mc:AlternateContent>
       </w:r>
-      <w:r>
-        <w:rPr>
-          <w:color w:val="000000"/>
-          <w:sz w:val="28"/>
-        </w:rPr>
-        <w:t xml:space="preserve">Thank you for trusting us in </w:t>
-      </w:r>
     </w:p>
-    <w:p>
-      <w:pPr>
-        <w:spacing w:line="258" w:lineRule="auto"/>
-        <w:ind w:firstLine="360"/>
-        <w:textDirection w:val="btLr"/>
-      </w:pPr>
-      <w:r>
-        <w:rPr>
-          <w:color w:val="000000"/>
-          <w:sz w:val="28"/>
-        </w:rPr>
-        <w:t>supporting you!</w:t>
-      </w:r>
-    </w:p>
+    <w:bookmarkStart w:id="1" w:name="_heading=h.7fvyyv453lup" w:colFirst="0" w:colLast="0"/>
+    <w:bookmarkEnd w:id="1"/>
     <w:p>
       <w:pPr>
         <w:tabs>
@@ -1944,10 +1859,91 @@
         <mc:AlternateContent>
           <mc:Choice Requires="wps">
             <w:drawing>
-              <wp:anchor distT="0" distB="0" distL="114300" distR="114300" simplePos="0" relativeHeight="251666432" behindDoc="0" locked="0" layoutInCell="1" hidden="0" allowOverlap="1" wp14:anchorId="70101B50" wp14:editId="34F4C6CC">
+              <wp:anchor distT="0" distB="0" distL="114300" distR="114300" simplePos="0" relativeHeight="251665408" behindDoc="0" locked="0" layoutInCell="1" allowOverlap="1" wp14:anchorId="459476DF" wp14:editId="26537446">
                 <wp:simplePos x="0" y="0"/>
                 <wp:positionH relativeFrom="column">
-                  <wp:posOffset>4140200</wp:posOffset>
+                  <wp:posOffset>-980440</wp:posOffset>
+                </wp:positionH>
+                <wp:positionV relativeFrom="paragraph">
+                  <wp:posOffset>638810</wp:posOffset>
+                </wp:positionV>
+                <wp:extent cx="7842250" cy="660400"/>
+                <wp:effectExtent l="0" t="0" r="0" b="0"/>
+                <wp:wrapNone/>
+                <wp:docPr id="249" name="Rectangles 249"/>
+                <wp:cNvGraphicFramePr/>
+                <a:graphic xmlns:a="http://schemas.openxmlformats.org/drawingml/2006/main">
+                  <a:graphicData uri="http://schemas.microsoft.com/office/word/2010/wordprocessingShape">
+                    <wps:wsp>
+                      <wps:cNvSpPr/>
+                      <wps:spPr>
+                        <a:xfrm>
+                          <a:off x="0" y="0"/>
+                          <a:ext cx="7842250" cy="660400"/>
+                        </a:xfrm>
+                        <a:prstGeom prst="rect">
+                          <a:avLst/>
+                        </a:prstGeom>
+                        <a:solidFill>
+                          <a:srgbClr val="0070C0"/>
+                        </a:solidFill>
+                        <a:ln w="12700" cap="flat" cmpd="sng">
+                          <a:solidFill>
+                            <a:srgbClr val="42719B"/>
+                          </a:solidFill>
+                          <a:prstDash val="solid"/>
+                          <a:miter lim="800000"/>
+                          <a:headEnd type="none" w="sm" len="sm"/>
+                          <a:tailEnd type="none" w="sm" len="sm"/>
+                        </a:ln>
+                      </wps:spPr>
+                      <wps:txbx>
+                        <w:txbxContent>
+                          <w:p>
+                            <w:pPr>
+                              <w:spacing w:after="0" w:line="240" w:lineRule="auto"/>
+                            </w:pPr>
+                          </w:p>
+                        </w:txbxContent>
+                      </wps:txbx>
+                      <wps:bodyPr spcFirstLastPara="1" wrap="square" lIns="91425" tIns="91425" rIns="91425" bIns="91425" anchor="ctr" anchorCtr="0">
+                        <a:noAutofit/>
+                      </wps:bodyPr>
+                    </wps:wsp>
+                  </a:graphicData>
+                </a:graphic>
+              </wp:anchor>
+            </w:drawing>
+          </mc:Choice>
+          <mc:Fallback>
+            <w:pict>
+              <v:rect w14:anchorId="459476DF" id="Rectangles 249" o:spid="_x0000_s1032" style="position:absolute;margin-left:-77.2pt;margin-top:50.3pt;width:617.5pt;height:52pt;z-index:251665408;visibility:visible;mso-wrap-style:square;mso-wrap-distance-left:9pt;mso-wrap-distance-top:0;mso-wrap-distance-right:9pt;mso-wrap-distance-bottom:0;mso-position-horizontal:absolute;mso-position-horizontal-relative:text;mso-position-vertical:absolute;mso-position-vertical-relative:text;v-text-anchor:middle" o:gfxdata="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" fillcolor="#0070c0" strokecolor="#42719b" strokeweight="1pt">
+                <v:stroke startarrowwidth="narrow" startarrowlength="short" endarrowwidth="narrow" endarrowlength="short"/>
+                <v:textbox inset="2.53958mm,2.53958mm,2.53958mm,2.53958mm">
+                  <w:txbxContent>
+                    <w:p>
+                      <w:pPr>
+                        <w:spacing w:after="0" w:line="240" w:lineRule="auto"/>
+                      </w:pPr>
+                    </w:p>
+                  </w:txbxContent>
+                </v:textbox>
+              </v:rect>
+            </w:pict>
+          </mc:Fallback>
+        </mc:AlternateContent>
+      </w:r>
+      <w:r>
+        <w:rPr>
+          <w:noProof/>
+        </w:rPr>
+        <mc:AlternateContent>
+          <mc:Choice Requires="wps">
+            <w:drawing>
+              <wp:anchor distT="0" distB="0" distL="114300" distR="114300" simplePos="0" relativeHeight="251664384" behindDoc="0" locked="0" layoutInCell="1" allowOverlap="1" wp14:anchorId="66E03173" wp14:editId="4621E1C8">
+                <wp:simplePos x="0" y="0"/>
+                <wp:positionH relativeFrom="column">
+                  <wp:posOffset>4127500</wp:posOffset>
                 </wp:positionH>
                 <wp:positionV relativeFrom="paragraph">
                   <wp:posOffset>2565400</wp:posOffset>
@@ -1955,7 +1951,7 @@
                 <wp:extent cx="0" cy="19050"/>
                 <wp:effectExtent l="0" t="0" r="0" b="0"/>
                 <wp:wrapNone/>
-                <wp:docPr id="242" name="Straight Arrow Connector 242"/>
+                <wp:docPr id="250" name="Straight Arrow Connector 250"/>
                 <wp:cNvGraphicFramePr/>
                 <a:graphic xmlns:a="http://schemas.openxmlformats.org/drawingml/2006/main">
                   <a:graphicData uri="http://schemas.microsoft.com/office/word/2010/wordprocessingShape">
@@ -1989,102 +1985,20 @@
           </mc:Choice>
           <mc:Fallback>
             <w:pict>
-              <v:shapetype w14:anchorId="38A4D164" id="_x0000_t32" coordsize="21600,21600" o:spt="32" o:oned="t" path="m,l21600,21600e" filled="f">
+              <v:shapetype w14:anchorId="2CB41914" id="_x0000_t32" coordsize="21600,21600" o:spt="32" o:oned="t" path="m,l21600,21600e" filled="f">
                 <v:path arrowok="t" fillok="f" o:connecttype="none"/>
                 <o:lock v:ext="edit" shapetype="t"/>
               </v:shapetype>
-              <v:shape id="Straight Arrow Connector 242" o:spid="_x0000_s1026" type="#_x0000_t32" style="position:absolute;margin-left:326pt;margin-top:202pt;width:0;height:1.5pt;z-index:251666432;visibility:visible;mso-wrap-style:square;mso-wrap-distance-left:9pt;mso-wrap-distance-top:0;mso-wrap-distance-right:9pt;mso-wrap-distance-bottom:0;mso-position-horizontal:absolute;mso-position-horizontal-relative:text;mso-position-vertical:absolute;mso-position-vertical-relative:text" o:gfxdata="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" strokecolor="#0070c0" strokeweight="1.5pt">
+              <v:shape id="Straight Arrow Connector 250" o:spid="_x0000_s1026" type="#_x0000_t32" style="position:absolute;margin-left:325pt;margin-top:202pt;width:0;height:1.5pt;z-index:251664384;visibility:visible;mso-wrap-style:square;mso-wrap-distance-left:9pt;mso-wrap-distance-top:0;mso-wrap-distance-right:9pt;mso-wrap-distance-bottom:0;mso-position-horizontal:absolute;mso-position-horizontal-relative:text;mso-position-vertical:absolute;mso-position-vertical-relative:text" o:gfxdata="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" strokecolor="#0070c0" strokeweight="1.5pt">
                 <v:stroke startarrowwidth="narrow" startarrowlength="short" endarrowwidth="narrow" endarrowlength="short" joinstyle="miter"/>
               </v:shape>
             </w:pict>
           </mc:Fallback>
         </mc:AlternateContent>
       </w:r>
-      <w:r>
-        <w:rPr>
-          <w:noProof/>
-        </w:rPr>
-        <mc:AlternateContent>
-          <mc:Choice Requires="wps">
-            <w:drawing>
-              <wp:anchor distT="0" distB="0" distL="114300" distR="114300" simplePos="0" relativeHeight="251667456" behindDoc="0" locked="0" layoutInCell="1" hidden="0" allowOverlap="1" wp14:anchorId="2D7B47F8" wp14:editId="6D84AFFC">
-                <wp:simplePos x="0" y="0"/>
-                <wp:positionH relativeFrom="column">
-                  <wp:posOffset>-914399</wp:posOffset>
-                </wp:positionH>
-                <wp:positionV relativeFrom="paragraph">
-                  <wp:posOffset>3454400</wp:posOffset>
-                </wp:positionV>
-                <wp:extent cx="7829550" cy="647700"/>
-                <wp:effectExtent l="0" t="0" r="0" b="0"/>
-                <wp:wrapNone/>
-                <wp:docPr id="238" name="Rectangle 238"/>
-                <wp:cNvGraphicFramePr/>
-                <a:graphic xmlns:a="http://schemas.openxmlformats.org/drawingml/2006/main">
-                  <a:graphicData uri="http://schemas.microsoft.com/office/word/2010/wordprocessingShape">
-                    <wps:wsp>
-                      <wps:cNvSpPr/>
-                      <wps:spPr>
-                        <a:xfrm>
-                          <a:off x="1443925" y="3468850"/>
-                          <a:ext cx="7804150" cy="622300"/>
-                        </a:xfrm>
-                        <a:prstGeom prst="rect">
-                          <a:avLst/>
-                        </a:prstGeom>
-                        <a:solidFill>
-                          <a:srgbClr val="0070C0"/>
-                        </a:solidFill>
-                        <a:ln w="12700" cap="flat" cmpd="sng">
-                          <a:solidFill>
-                            <a:srgbClr val="42719B"/>
-                          </a:solidFill>
-                          <a:prstDash val="solid"/>
-                          <a:miter lim="800000"/>
-                          <a:headEnd type="none" w="sm" len="sm"/>
-                          <a:tailEnd type="none" w="sm" len="sm"/>
-                        </a:ln>
-                      </wps:spPr>
-                      <wps:txbx>
-                        <w:txbxContent>
-                          <w:p>
-                            <w:pPr>
-                              <w:spacing w:after="0" w:line="240" w:lineRule="auto"/>
-                              <w:textDirection w:val="btLr"/>
-                            </w:pPr>
-                          </w:p>
-                        </w:txbxContent>
-                      </wps:txbx>
-                      <wps:bodyPr spcFirstLastPara="1" wrap="square" lIns="91425" tIns="91425" rIns="91425" bIns="91425" anchor="ctr" anchorCtr="0">
-                        <a:noAutofit/>
-                      </wps:bodyPr>
-                    </wps:wsp>
-                  </a:graphicData>
-                </a:graphic>
-              </wp:anchor>
-            </w:drawing>
-          </mc:Choice>
-          <mc:Fallback>
-            <w:pict>
-              <v:rect w14:anchorId="2D7B47F8" id="Rectangle 238" o:spid="_x0000_s1032" style="position:absolute;margin-left:-1in;margin-top:272pt;width:616.5pt;height:51pt;z-index:251667456;visibility:visible;mso-wrap-style:square;mso-wrap-distance-left:9pt;mso-wrap-distance-top:0;mso-wrap-distance-right:9pt;mso-wrap-distance-bottom:0;mso-position-horizontal:absolute;mso-position-horizontal-relative:text;mso-position-vertical:absolute;mso-position-vertical-relative:text;v-text-anchor:middle" o:gfxdata="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" fillcolor="#0070c0" strokecolor="#42719b" strokeweight="1pt">
-                <v:stroke startarrowwidth="narrow" startarrowlength="short" endarrowwidth="narrow" endarrowlength="short"/>
-                <v:textbox inset="2.53958mm,2.53958mm,2.53958mm,2.53958mm">
-                  <w:txbxContent>
-                    <w:p>
-                      <w:pPr>
-                        <w:spacing w:after="0" w:line="240" w:lineRule="auto"/>
-                        <w:textDirection w:val="btLr"/>
-                      </w:pPr>
-                    </w:p>
-                  </w:txbxContent>
-                </v:textbox>
-              </v:rect>
-            </w:pict>
-          </mc:Fallback>
-        </mc:AlternateContent>
-      </w:r>
     </w:p>
     <w:sectPr>
+      <w:headerReference w:type="default" r:id="rId9"/>
       <w:pgSz w:w="12240" w:h="15840"/>
       <w:pgMar w:top="1440" w:right="1440" w:bottom="0" w:left="1440" w:header="720" w:footer="720" w:gutter="0"/>
       <w:pgNumType w:start="1"/>
@@ -2094,138 +2008,129 @@
 </w:document>
 </file>
 
+<file path=word/endnotes.xml><?xml version="1.0" encoding="utf-8"?>
+<w:endnotes xmlns:wpc="http://schemas.microsoft.com/office/word/2010/wordprocessingCanvas" xmlns:cx="http://schemas.microsoft.com/office/drawing/2014/chartex" xmlns:cx1="http://schemas.microsoft.com/office/drawing/2015/9/8/chartex" xmlns:cx2="http://schemas.microsoft.com/office/drawing/2015/10/21/chartex" xmlns:cx3="http://schemas.microsoft.com/office/drawing/2016/5/9/chartex" xmlns:cx4="http://schemas.microsoft.com/office/drawing/2016/5/10/chartex" xmlns:cx5="http://schemas.microsoft.com/office/drawing/2016/5/11/chartex" xmlns:cx6="http://schemas.microsoft.com/office/drawing/2016/5/12/chartex" xmlns:cx7="http://schemas.microsoft.com/office/drawing/2016/5/13/chartex" xmlns:cx8="http://schemas.microsoft.com/office/drawing/2016/5/14/chartex" xmlns:mc="http://schemas.openxmlformats.org/markup-compatibility/2006" xmlns:aink="http://schemas.microsoft.com/office/drawing/2016/ink" xmlns:am3d="http://schemas.microsoft.com/office/drawing/2017/model3d" xmlns:o="urn:schemas-microsoft-com:office:office" xmlns:oel="http://schemas.microsoft.com/office/2019/extlst" xmlns:r="http://schemas.openxmlformats.org/officeDocument/2006/relationships" xmlns:m="http://schemas.openxmlformats.org/officeDocument/2006/math" xmlns:v="urn:schemas-microsoft-com:vml" xmlns:wp14="http://schemas.microsoft.com/office/word/2010/wordprocessingDrawing" xmlns:wp="http://schemas.openxmlformats.org/drawingml/2006/wordprocessingDrawing" xmlns:w10="urn:schemas-microsoft-com:office:word" xmlns:w="http://schemas.openxmlformats.org/wordprocessingml/2006/main" xmlns:w14="http://schemas.microsoft.com/office/word/2010/wordml" xmlns:w15="http://schemas.microsoft.com/office/word/2012/wordml" xmlns:w16cex="http://schemas.microsoft.com/office/word/2018/wordml/cex" xmlns:w16cid="http://schemas.microsoft.com/office/word/2016/wordml/cid" xmlns:w16="http://schemas.microsoft.com/office/word/2018/wordml" xmlns:w16du="http://schemas.microsoft.com/office/word/2023/wordml/word16du" xmlns:w16sdtdh="http://schemas.microsoft.com/office/word/2020/wordml/sdtdatahash" xmlns:w16sdtfl="http://schemas.microsoft.com/office/word/2024/wordml/sdtformatlock" xmlns:w16se="http://schemas.microsoft.com/office/word/2015/wordml/symex" xmlns:wpg="http://schemas.microsoft.com/office/word/2010/wordprocessingGroup" xmlns:wpi="http://schemas.microsoft.com/office/word/2010/wordprocessingInk" xmlns:wne="http://schemas.microsoft.com/office/word/2006/wordml" xmlns:wps="http://schemas.microsoft.com/office/word/2010/wordprocessingShape" mc:Ignorable="w14 w15 w16se w16cid w16 w16cex w16sdtdh w16sdtfl w16du wp14">
+  <w:endnote w:type="separator" w:id="-1">
+    <w:p>
+      <w:pPr>
+        <w:spacing w:after="0" w:line="240" w:lineRule="auto"/>
+      </w:pPr>
+      <w:r>
+        <w:separator/>
+      </w:r>
+    </w:p>
+  </w:endnote>
+  <w:endnote w:type="continuationSeparator" w:id="0">
+    <w:p>
+      <w:pPr>
+        <w:spacing w:after="0" w:line="240" w:lineRule="auto"/>
+      </w:pPr>
+      <w:r>
+        <w:continuationSeparator/>
+      </w:r>
+    </w:p>
+  </w:endnote>
+</w:endnotes>
+</file>
+
+<file path=word/footnotes.xml><?xml version="1.0" encoding="utf-8"?>
+<w:footnotes xmlns:wpc="http://schemas.microsoft.com/office/word/2010/wordprocessingCanvas" xmlns:cx="http://schemas.microsoft.com/office/drawing/2014/chartex" xmlns:cx1="http://schemas.microsoft.com/office/drawing/2015/9/8/chartex" xmlns:cx2="http://schemas.microsoft.com/office/drawing/2015/10/21/chartex" xmlns:cx3="http://schemas.microsoft.com/office/drawing/2016/5/9/chartex" xmlns:cx4="http://schemas.microsoft.com/office/drawing/2016/5/10/chartex" xmlns:cx5="http://schemas.microsoft.com/office/drawing/2016/5/11/chartex" xmlns:cx6="http://schemas.microsoft.com/office/drawing/2016/5/12/chartex" xmlns:cx7="http://schemas.microsoft.com/office/drawing/2016/5/13/chartex" xmlns:cx8="http://schemas.microsoft.com/office/drawing/2016/5/14/chartex" xmlns:mc="http://schemas.openxmlformats.org/markup-compatibility/2006" xmlns:aink="http://schemas.microsoft.com/office/drawing/2016/ink" xmlns:am3d="http://schemas.microsoft.com/office/drawing/2017/model3d" xmlns:o="urn:schemas-microsoft-com:office:office" xmlns:oel="http://schemas.microsoft.com/office/2019/extlst" xmlns:r="http://schemas.openxmlformats.org/officeDocument/2006/relationships" xmlns:m="http://schemas.openxmlformats.org/officeDocument/2006/math" xmlns:v="urn:schemas-microsoft-com:vml" xmlns:wp14="http://schemas.microsoft.com/office/word/2010/wordprocessingDrawing" xmlns:wp="http://schemas.openxmlformats.org/drawingml/2006/wordprocessingDrawing" xmlns:w10="urn:schemas-microsoft-com:office:word" xmlns:w="http://schemas.openxmlformats.org/wordprocessingml/2006/main" xmlns:w14="http://schemas.microsoft.com/office/word/2010/wordml" xmlns:w15="http://schemas.microsoft.com/office/word/2012/wordml" xmlns:w16cex="http://schemas.microsoft.com/office/word/2018/wordml/cex" xmlns:w16cid="http://schemas.microsoft.com/office/word/2016/wordml/cid" xmlns:w16="http://schemas.microsoft.com/office/word/2018/wordml" xmlns:w16du="http://schemas.microsoft.com/office/word/2023/wordml/word16du" xmlns:w16sdtdh="http://schemas.microsoft.com/office/word/2020/wordml/sdtdatahash" xmlns:w16sdtfl="http://schemas.microsoft.com/office/word/2024/wordml/sdtformatlock" xmlns:w16se="http://schemas.microsoft.com/office/word/2015/wordml/symex" xmlns:wpg="http://schemas.microsoft.com/office/word/2010/wordprocessingGroup" xmlns:wpi="http://schemas.microsoft.com/office/word/2010/wordprocessingInk" xmlns:wne="http://schemas.microsoft.com/office/word/2006/wordml" xmlns:wps="http://schemas.microsoft.com/office/word/2010/wordprocessingShape" mc:Ignorable="w14 w15 w16se w16cid w16 w16cex w16sdtdh w16sdtfl w16du wp14">
+  <w:footnote w:type="separator" w:id="-1">
+    <w:p>
+      <w:pPr>
+        <w:spacing w:after="0" w:line="240" w:lineRule="auto"/>
+      </w:pPr>
+      <w:r>
+        <w:separator/>
+      </w:r>
+    </w:p>
+  </w:footnote>
+  <w:footnote w:type="continuationSeparator" w:id="0">
+    <w:p>
+      <w:pPr>
+        <w:spacing w:after="0" w:line="240" w:lineRule="auto"/>
+      </w:pPr>
+      <w:r>
+        <w:continuationSeparator/>
+      </w:r>
+    </w:p>
+  </w:footnote>
+</w:footnotes>
+</file>
+
+<file path=word/header1.xml><?xml version="1.0" encoding="utf-8"?>
+<w:hdr xmlns:wpc="http://schemas.microsoft.com/office/word/2010/wordprocessingCanvas" xmlns:cx="http://schemas.microsoft.com/office/drawing/2014/chartex" xmlns:cx1="http://schemas.microsoft.com/office/drawing/2015/9/8/chartex" xmlns:cx2="http://schemas.microsoft.com/office/drawing/2015/10/21/chartex" xmlns:cx3="http://schemas.microsoft.com/office/drawing/2016/5/9/chartex" xmlns:cx4="http://schemas.microsoft.com/office/drawing/2016/5/10/chartex" xmlns:cx5="http://schemas.microsoft.com/office/drawing/2016/5/11/chartex" xmlns:cx6="http://schemas.microsoft.com/office/drawing/2016/5/12/chartex" xmlns:cx7="http://schemas.microsoft.com/office/drawing/2016/5/13/chartex" xmlns:cx8="http://schemas.microsoft.com/office/drawing/2016/5/14/chartex" xmlns:mc="http://schemas.openxmlformats.org/markup-compatibility/2006" xmlns:aink="http://schemas.microsoft.com/office/drawing/2016/ink" xmlns:am3d="http://schemas.microsoft.com/office/drawing/2017/model3d" xmlns:o="urn:schemas-microsoft-com:office:office" xmlns:oel="http://schemas.microsoft.com/office/2019/extlst" xmlns:r="http://schemas.openxmlformats.org/officeDocument/2006/relationships" xmlns:m="http://schemas.openxmlformats.org/officeDocument/2006/math" xmlns:v="urn:schemas-microsoft-com:vml" xmlns:wp14="http://schemas.microsoft.com/office/word/2010/wordprocessingDrawing" xmlns:wp="http://schemas.openxmlformats.org/drawingml/2006/wordprocessingDrawing" xmlns:w10="urn:schemas-microsoft-com:office:word" xmlns:w="http://schemas.openxmlformats.org/wordprocessingml/2006/main" xmlns:w14="http://schemas.microsoft.com/office/word/2010/wordml" xmlns:w15="http://schemas.microsoft.com/office/word/2012/wordml" xmlns:w16cex="http://schemas.microsoft.com/office/word/2018/wordml/cex" xmlns:w16cid="http://schemas.microsoft.com/office/word/2016/wordml/cid" xmlns:w16="http://schemas.microsoft.com/office/word/2018/wordml" xmlns:w16du="http://schemas.microsoft.com/office/word/2023/wordml/word16du" xmlns:w16sdtdh="http://schemas.microsoft.com/office/word/2020/wordml/sdtdatahash" xmlns:w16sdtfl="http://schemas.microsoft.com/office/word/2024/wordml/sdtformatlock" xmlns:w16se="http://schemas.microsoft.com/office/word/2015/wordml/symex" xmlns:wpg="http://schemas.microsoft.com/office/word/2010/wordprocessingGroup" xmlns:wpi="http://schemas.microsoft.com/office/word/2010/wordprocessingInk" xmlns:wne="http://schemas.microsoft.com/office/word/2006/wordml" xmlns:wps="http://schemas.microsoft.com/office/word/2010/wordprocessingShape" mc:Ignorable="w14 w15 w16se w16cid w16 w16cex w16sdtdh w16sdtfl w16du wp14">
+  <w:p>
+    <w:r>
+      <w:rPr>
+        <w:noProof/>
+      </w:rPr>
+      <w:drawing>
+        <wp:anchor distT="114300" distB="114300" distL="114300" distR="114300" simplePos="0" relativeHeight="251658240" behindDoc="0" locked="0" layoutInCell="1" allowOverlap="1" wp14:anchorId="68D8121B" wp14:editId="7CA8CADB">
+          <wp:simplePos x="0" y="0"/>
+          <wp:positionH relativeFrom="column">
+            <wp:posOffset>4358043</wp:posOffset>
+          </wp:positionH>
+          <wp:positionV relativeFrom="paragraph">
+            <wp:posOffset>400685</wp:posOffset>
+          </wp:positionV>
+          <wp:extent cx="1833880" cy="1219200"/>
+          <wp:effectExtent l="0" t="0" r="0" b="0"/>
+          <wp:wrapNone/>
+          <wp:docPr id="252" name="image1.png"/>
+          <wp:cNvGraphicFramePr/>
+          <a:graphic xmlns:a="http://schemas.openxmlformats.org/drawingml/2006/main">
+            <a:graphicData uri="http://schemas.openxmlformats.org/drawingml/2006/picture">
+              <pic:pic xmlns:pic="http://schemas.openxmlformats.org/drawingml/2006/picture">
+                <pic:nvPicPr>
+                  <pic:cNvPr id="252" name="image1.png"/>
+                  <pic:cNvPicPr preferRelativeResize="0"/>
+                </pic:nvPicPr>
+                <pic:blipFill>
+                  <a:blip r:embed="rId1"/>
+                  <a:srcRect/>
+                  <a:stretch>
+                    <a:fillRect/>
+                  </a:stretch>
+                </pic:blipFill>
+                <pic:spPr>
+                  <a:xfrm>
+                    <a:off x="0" y="0"/>
+                    <a:ext cx="1833880" cy="1219200"/>
+                  </a:xfrm>
+                  <a:prstGeom prst="rect">
+                    <a:avLst/>
+                  </a:prstGeom>
+                </pic:spPr>
+              </pic:pic>
+            </a:graphicData>
+          </a:graphic>
+        </wp:anchor>
+      </w:drawing>
+    </w:r>
+  </w:p>
+</w:hdr>
+</file>
+
 <file path=word/numbering.xml><?xml version="1.0" encoding="utf-8"?>
-<w:numbering xmlns:wpc="http://schemas.microsoft.com/office/word/2010/wordprocessingCanvas" xmlns:cx="http://schemas.microsoft.com/office/drawing/2014/chartex" xmlns:mc="http://schemas.openxmlformats.org/markup-compatibility/2006" xmlns:o="urn:schemas-microsoft-com:office:office" xmlns:r="http://schemas.openxmlformats.org/officeDocument/2006/relationships" xmlns:m="http://schemas.openxmlformats.org/officeDocument/2006/math" xmlns:v="urn:schemas-microsoft-com:vml" xmlns:wp14="http://schemas.microsoft.com/office/word/2010/wordprocessingDrawing" xmlns:wp="http://schemas.openxmlformats.org/drawingml/2006/wordprocessingDrawing" xmlns:w10="urn:schemas-microsoft-com:office:word" xmlns:w="http://schemas.openxmlformats.org/wordprocessingml/2006/main" xmlns:w14="http://schemas.microsoft.com/office/word/2010/wordml" xmlns:w15="http://schemas.microsoft.com/office/word/2012/wordml" xmlns:w16se="http://schemas.microsoft.com/office/word/2015/wordml/symex" xmlns:wpg="http://schemas.microsoft.com/office/word/2010/wordprocessingGroup" xmlns:wpi="http://schemas.microsoft.com/office/word/2010/wordprocessingInk" xmlns:wne="http://schemas.microsoft.com/office/word/2006/wordml" xmlns:wps="http://schemas.microsoft.com/office/word/2010/wordprocessingShape" mc:Ignorable="w14 w15 w16se wp14">
+<w:numbering xmlns:wpc="http://schemas.microsoft.com/office/word/2010/wordprocessingCanvas" xmlns:cx="http://schemas.microsoft.com/office/drawing/2014/chartex" xmlns:cx1="http://schemas.microsoft.com/office/drawing/2015/9/8/chartex" xmlns:cx2="http://schemas.microsoft.com/office/drawing/2015/10/21/chartex" xmlns:cx3="http://schemas.microsoft.com/office/drawing/2016/5/9/chartex" xmlns:cx4="http://schemas.microsoft.com/office/drawing/2016/5/10/chartex" xmlns:cx5="http://schemas.microsoft.com/office/drawing/2016/5/11/chartex" xmlns:cx6="http://schemas.microsoft.com/office/drawing/2016/5/12/chartex" xmlns:cx7="http://schemas.microsoft.com/office/drawing/2016/5/13/chartex" xmlns:cx8="http://schemas.microsoft.com/office/drawing/2016/5/14/chartex" xmlns:mc="http://schemas.openxmlformats.org/markup-compatibility/2006" xmlns:aink="http://schemas.microsoft.com/office/drawing/2016/ink" xmlns:am3d="http://schemas.microsoft.com/office/drawing/2017/model3d" xmlns:o="urn:schemas-microsoft-com:office:office" xmlns:oel="http://schemas.microsoft.com/office/2019/extlst" xmlns:r="http://schemas.openxmlformats.org/officeDocument/2006/relationships" xmlns:m="http://schemas.openxmlformats.org/officeDocument/2006/math" xmlns:v="urn:schemas-microsoft-com:vml" xmlns:wp14="http://schemas.microsoft.com/office/word/2010/wordprocessingDrawing" xmlns:wp="http://schemas.openxmlformats.org/drawingml/2006/wordprocessingDrawing" xmlns:w10="urn:schemas-microsoft-com:office:word" xmlns:w="http://schemas.openxmlformats.org/wordprocessingml/2006/main" xmlns:w14="http://schemas.microsoft.com/office/word/2010/wordml" xmlns:w15="http://schemas.microsoft.com/office/word/2012/wordml" xmlns:w16cex="http://schemas.microsoft.com/office/word/2018/wordml/cex" xmlns:w16cid="http://schemas.microsoft.com/office/word/2016/wordml/cid" xmlns:w16="http://schemas.microsoft.com/office/word/2018/wordml" xmlns:w16du="http://schemas.microsoft.com/office/word/2023/wordml/word16du" xmlns:w16sdtdh="http://schemas.microsoft.com/office/word/2020/wordml/sdtdatahash" xmlns:w16sdtfl="http://schemas.microsoft.com/office/word/2024/wordml/sdtformatlock" xmlns:w16se="http://schemas.microsoft.com/office/word/2015/wordml/symex" xmlns:wpg="http://schemas.microsoft.com/office/word/2010/wordprocessingGroup" xmlns:wpi="http://schemas.microsoft.com/office/word/2010/wordprocessingInk" xmlns:wne="http://schemas.microsoft.com/office/word/2006/wordml" xmlns:wps="http://schemas.microsoft.com/office/word/2010/wordprocessingShape" mc:Ignorable="w14 w15 w16se w16cid w16 w16cex w16sdtdh w16sdtfl w16du wp14">
   <w:abstractNum w:abstractNumId="0" w15:restartNumberingAfterBreak="0">
-    <w:nsid w:val="06E76B5A"/>
-    <w:multiLevelType w:val="hybridMultilevel"/>
-    <w:tmpl w:val="4E6A9442"/>
-    <w:lvl w:ilvl="0" w:tplc="04090001">
+    <w:nsid w:val="65CD0074"/>
+    <w:multiLevelType w:val="multilevel"/>
+    <w:tmpl w:val="65CD0074"/>
+    <w:lvl w:ilvl="0">
       <w:start w:val="1"/>
       <w:numFmt w:val="bullet"/>
-      <w:lvlText w:val=""/>
-      <w:lvlJc w:val="left"/>
-      <w:pPr>
-        <w:ind w:left="1800" w:hanging="360"/>
-      </w:pPr>
-      <w:rPr>
-        <w:rFonts w:ascii="Symbol" w:hAnsi="Symbol" w:hint="default"/>
-      </w:rPr>
-    </w:lvl>
-    <w:lvl w:ilvl="1" w:tplc="04090003" w:tentative="1">
-      <w:start w:val="1"/>
-      <w:numFmt w:val="bullet"/>
-      <w:lvlText w:val="o"/>
-      <w:lvlJc w:val="left"/>
-      <w:pPr>
-        <w:ind w:left="2520" w:hanging="360"/>
-      </w:pPr>
-      <w:rPr>
-        <w:rFonts w:ascii="Courier New" w:hAnsi="Courier New" w:cs="Courier New" w:hint="default"/>
-      </w:rPr>
-    </w:lvl>
-    <w:lvl w:ilvl="2" w:tplc="04090005" w:tentative="1">
-      <w:start w:val="1"/>
-      <w:numFmt w:val="bullet"/>
-      <w:lvlText w:val=""/>
-      <w:lvlJc w:val="left"/>
-      <w:pPr>
-        <w:ind w:left="3240" w:hanging="360"/>
-      </w:pPr>
-      <w:rPr>
-        <w:rFonts w:ascii="Wingdings" w:hAnsi="Wingdings" w:hint="default"/>
-      </w:rPr>
-    </w:lvl>
-    <w:lvl w:ilvl="3" w:tplc="04090001" w:tentative="1">
-      <w:start w:val="1"/>
-      <w:numFmt w:val="bullet"/>
-      <w:lvlText w:val=""/>
-      <w:lvlJc w:val="left"/>
-      <w:pPr>
-        <w:ind w:left="3960" w:hanging="360"/>
-      </w:pPr>
-      <w:rPr>
-        <w:rFonts w:ascii="Symbol" w:hAnsi="Symbol" w:hint="default"/>
-      </w:rPr>
-    </w:lvl>
-    <w:lvl w:ilvl="4" w:tplc="04090003" w:tentative="1">
-      <w:start w:val="1"/>
-      <w:numFmt w:val="bullet"/>
-      <w:lvlText w:val="o"/>
-      <w:lvlJc w:val="left"/>
-      <w:pPr>
-        <w:ind w:left="4680" w:hanging="360"/>
-      </w:pPr>
-      <w:rPr>
-        <w:rFonts w:ascii="Courier New" w:hAnsi="Courier New" w:cs="Courier New" w:hint="default"/>
-      </w:rPr>
-    </w:lvl>
-    <w:lvl w:ilvl="5" w:tplc="04090005" w:tentative="1">
-      <w:start w:val="1"/>
-      <w:numFmt w:val="bullet"/>
-      <w:lvlText w:val=""/>
-      <w:lvlJc w:val="left"/>
-      <w:pPr>
-        <w:ind w:left="5400" w:hanging="360"/>
-      </w:pPr>
-      <w:rPr>
-        <w:rFonts w:ascii="Wingdings" w:hAnsi="Wingdings" w:hint="default"/>
-      </w:rPr>
-    </w:lvl>
-    <w:lvl w:ilvl="6" w:tplc="04090001" w:tentative="1">
-      <w:start w:val="1"/>
-      <w:numFmt w:val="bullet"/>
-      <w:lvlText w:val=""/>
-      <w:lvlJc w:val="left"/>
-      <w:pPr>
-        <w:ind w:left="6120" w:hanging="360"/>
-      </w:pPr>
-      <w:rPr>
-        <w:rFonts w:ascii="Symbol" w:hAnsi="Symbol" w:hint="default"/>
-      </w:rPr>
-    </w:lvl>
-    <w:lvl w:ilvl="7" w:tplc="04090003" w:tentative="1">
-      <w:start w:val="1"/>
-      <w:numFmt w:val="bullet"/>
-      <w:lvlText w:val="o"/>
-      <w:lvlJc w:val="left"/>
-      <w:pPr>
-        <w:ind w:left="6840" w:hanging="360"/>
-      </w:pPr>
-      <w:rPr>
-        <w:rFonts w:ascii="Courier New" w:hAnsi="Courier New" w:cs="Courier New" w:hint="default"/>
-      </w:rPr>
-    </w:lvl>
-    <w:lvl w:ilvl="8" w:tplc="04090005" w:tentative="1">
-      <w:start w:val="1"/>
-      <w:numFmt w:val="bullet"/>
-      <w:lvlText w:val=""/>
-      <w:lvlJc w:val="left"/>
-      <w:pPr>
-        <w:ind w:left="7560" w:hanging="360"/>
-      </w:pPr>
-      <w:rPr>
-        <w:rFonts w:ascii="Wingdings" w:hAnsi="Wingdings" w:hint="default"/>
-      </w:rPr>
-    </w:lvl>
-  </w:abstractNum>
-  <w:abstractNum w:abstractNumId="1" w15:restartNumberingAfterBreak="0">
-    <w:nsid w:val="632727CA"/>
-    <w:multiLevelType w:val="hybridMultilevel"/>
-    <w:tmpl w:val="BBAE990C"/>
-    <w:lvl w:ilvl="0" w:tplc="04090001">
-      <w:start w:val="1"/>
-      <w:numFmt w:val="bullet"/>
-      <w:lvlText w:val=""/>
+      <w:lvlText w:val="●"/>
       <w:lvlJc w:val="left"/>
       <w:pPr>
         <w:ind w:left="1080" w:hanging="360"/>
       </w:pPr>
       <w:rPr>
-        <w:rFonts w:ascii="Symbol" w:hAnsi="Symbol" w:hint="default"/>
+        <w:rFonts w:ascii="Noto Sans Symbols" w:eastAsia="Noto Sans Symbols" w:hAnsi="Noto Sans Symbols" w:cs="Noto Sans Symbols"/>
       </w:rPr>
     </w:lvl>
-    <w:lvl w:ilvl="1" w:tplc="04090003" w:tentative="1">
+    <w:lvl w:ilvl="1">
       <w:start w:val="1"/>
       <w:numFmt w:val="bullet"/>
       <w:lvlText w:val="o"/>
@@ -2234,34 +2139,34 @@
         <w:ind w:left="1800" w:hanging="360"/>
       </w:pPr>
       <w:rPr>
-        <w:rFonts w:ascii="Courier New" w:hAnsi="Courier New" w:cs="Courier New" w:hint="default"/>
+        <w:rFonts w:ascii="Courier New" w:eastAsia="Courier New" w:hAnsi="Courier New" w:cs="Courier New"/>
       </w:rPr>
     </w:lvl>
-    <w:lvl w:ilvl="2" w:tplc="04090005" w:tentative="1">
+    <w:lvl w:ilvl="2">
       <w:start w:val="1"/>
       <w:numFmt w:val="bullet"/>
-      <w:lvlText w:val=""/>
+      <w:lvlText w:val="▪"/>
       <w:lvlJc w:val="left"/>
       <w:pPr>
         <w:ind w:left="2520" w:hanging="360"/>
       </w:pPr>
       <w:rPr>
-        <w:rFonts w:ascii="Wingdings" w:hAnsi="Wingdings" w:hint="default"/>
+        <w:rFonts w:ascii="Noto Sans Symbols" w:eastAsia="Noto Sans Symbols" w:hAnsi="Noto Sans Symbols" w:cs="Noto Sans Symbols"/>
       </w:rPr>
     </w:lvl>
-    <w:lvl w:ilvl="3" w:tplc="04090001" w:tentative="1">
+    <w:lvl w:ilvl="3">
       <w:start w:val="1"/>
       <w:numFmt w:val="bullet"/>
-      <w:lvlText w:val=""/>
+      <w:lvlText w:val="●"/>
       <w:lvlJc w:val="left"/>
       <w:pPr>
         <w:ind w:left="3240" w:hanging="360"/>
       </w:pPr>
       <w:rPr>
-        <w:rFonts w:ascii="Symbol" w:hAnsi="Symbol" w:hint="default"/>
+        <w:rFonts w:ascii="Noto Sans Symbols" w:eastAsia="Noto Sans Symbols" w:hAnsi="Noto Sans Symbols" w:cs="Noto Sans Symbols"/>
       </w:rPr>
     </w:lvl>
-    <w:lvl w:ilvl="4" w:tplc="04090003" w:tentative="1">
+    <w:lvl w:ilvl="4">
       <w:start w:val="1"/>
       <w:numFmt w:val="bullet"/>
       <w:lvlText w:val="o"/>
@@ -2270,34 +2175,34 @@
         <w:ind w:left="3960" w:hanging="360"/>
       </w:pPr>
       <w:rPr>
-        <w:rFonts w:ascii="Courier New" w:hAnsi="Courier New" w:cs="Courier New" w:hint="default"/>
+        <w:rFonts w:ascii="Courier New" w:eastAsia="Courier New" w:hAnsi="Courier New" w:cs="Courier New"/>
       </w:rPr>
     </w:lvl>
-    <w:lvl w:ilvl="5" w:tplc="04090005" w:tentative="1">
+    <w:lvl w:ilvl="5">
       <w:start w:val="1"/>
       <w:numFmt w:val="bullet"/>
-      <w:lvlText w:val=""/>
+      <w:lvlText w:val="▪"/>
       <w:lvlJc w:val="left"/>
       <w:pPr>
         <w:ind w:left="4680" w:hanging="360"/>
       </w:pPr>
       <w:rPr>
-        <w:rFonts w:ascii="Wingdings" w:hAnsi="Wingdings" w:hint="default"/>
+        <w:rFonts w:ascii="Noto Sans Symbols" w:eastAsia="Noto Sans Symbols" w:hAnsi="Noto Sans Symbols" w:cs="Noto Sans Symbols"/>
       </w:rPr>
     </w:lvl>
-    <w:lvl w:ilvl="6" w:tplc="04090001" w:tentative="1">
+    <w:lvl w:ilvl="6">
       <w:start w:val="1"/>
       <w:numFmt w:val="bullet"/>
-      <w:lvlText w:val=""/>
+      <w:lvlText w:val="●"/>
       <w:lvlJc w:val="left"/>
       <w:pPr>
         <w:ind w:left="5400" w:hanging="360"/>
       </w:pPr>
       <w:rPr>
-        <w:rFonts w:ascii="Symbol" w:hAnsi="Symbol" w:hint="default"/>
+        <w:rFonts w:ascii="Noto Sans Symbols" w:eastAsia="Noto Sans Symbols" w:hAnsi="Noto Sans Symbols" w:cs="Noto Sans Symbols"/>
       </w:rPr>
     </w:lvl>
-    <w:lvl w:ilvl="7" w:tplc="04090003" w:tentative="1">
+    <w:lvl w:ilvl="7">
       <w:start w:val="1"/>
       <w:numFmt w:val="bullet"/>
       <w:lvlText w:val="o"/>
@@ -2306,160 +2211,63 @@
         <w:ind w:left="6120" w:hanging="360"/>
       </w:pPr>
       <w:rPr>
-        <w:rFonts w:ascii="Courier New" w:hAnsi="Courier New" w:cs="Courier New" w:hint="default"/>
+        <w:rFonts w:ascii="Courier New" w:eastAsia="Courier New" w:hAnsi="Courier New" w:cs="Courier New"/>
       </w:rPr>
     </w:lvl>
-    <w:lvl w:ilvl="8" w:tplc="04090005" w:tentative="1">
+    <w:lvl w:ilvl="8">
       <w:start w:val="1"/>
       <w:numFmt w:val="bullet"/>
-      <w:lvlText w:val=""/>
+      <w:lvlText w:val="▪"/>
       <w:lvlJc w:val="left"/>
       <w:pPr>
         <w:ind w:left="6840" w:hanging="360"/>
       </w:pPr>
       <w:rPr>
-        <w:rFonts w:ascii="Wingdings" w:hAnsi="Wingdings" w:hint="default"/>
+        <w:rFonts w:ascii="Noto Sans Symbols" w:eastAsia="Noto Sans Symbols" w:hAnsi="Noto Sans Symbols" w:cs="Noto Sans Symbols"/>
       </w:rPr>
     </w:lvl>
   </w:abstractNum>
-  <w:num w:numId="1">
+  <w:num w:numId="1" w16cid:durableId="2017802746">
     <w:abstractNumId w:val="0"/>
-  </w:num>
-  <w:num w:numId="2">
-    <w:abstractNumId w:val="1"/>
   </w:num>
 </w:numbering>
 </file>
 
 <file path=word/styles.xml><?xml version="1.0" encoding="utf-8"?>
-<w:styles xmlns:mc="http://schemas.openxmlformats.org/markup-compatibility/2006" xmlns:r="http://schemas.openxmlformats.org/officeDocument/2006/relationships" xmlns:w="http://schemas.openxmlformats.org/wordprocessingml/2006/main" xmlns:w14="http://schemas.microsoft.com/office/word/2010/wordml" xmlns:w15="http://schemas.microsoft.com/office/word/2012/wordml" xmlns:w16se="http://schemas.microsoft.com/office/word/2015/wordml/symex" mc:Ignorable="w14 w15 w16se">
+<w:styles xmlns:mc="http://schemas.openxmlformats.org/markup-compatibility/2006" xmlns:r="http://schemas.openxmlformats.org/officeDocument/2006/relationships" xmlns:w="http://schemas.openxmlformats.org/wordprocessingml/2006/main" xmlns:w14="http://schemas.microsoft.com/office/word/2010/wordml" xmlns:w15="http://schemas.microsoft.com/office/word/2012/wordml" xmlns:w16cex="http://schemas.microsoft.com/office/word/2018/wordml/cex" xmlns:w16cid="http://schemas.microsoft.com/office/word/2016/wordml/cid" xmlns:w16="http://schemas.microsoft.com/office/word/2018/wordml" xmlns:w16du="http://schemas.microsoft.com/office/word/2023/wordml/word16du" xmlns:w16sdtdh="http://schemas.microsoft.com/office/word/2020/wordml/sdtdatahash" xmlns:w16sdtfl="http://schemas.microsoft.com/office/word/2024/wordml/sdtformatlock" xmlns:w16se="http://schemas.microsoft.com/office/word/2015/wordml/symex" mc:Ignorable="w14 w15 w16se w16cid w16 w16cex w16sdtdh w16sdtfl w16du">
   <w:docDefaults>
     <w:rPrDefault>
       <w:rPr>
         <w:rFonts w:ascii="Calibri" w:eastAsia="Calibri" w:hAnsi="Calibri" w:cs="Calibri"/>
-        <w:sz w:val="22"/>
-        <w:szCs w:val="22"/>
         <w:lang w:val="en-US" w:eastAsia="en-US" w:bidi="ar-SA"/>
       </w:rPr>
     </w:rPrDefault>
     <w:pPrDefault>
       <w:pPr>
-        <w:spacing w:after="160" w:line="259" w:lineRule="auto"/>
+        <w:spacing w:after="160" w:line="278" w:lineRule="auto"/>
       </w:pPr>
     </w:pPrDefault>
   </w:docDefaults>
-  <w:latentStyles w:defLockedState="0" w:defUIPriority="99" w:defSemiHidden="0" w:defUnhideWhenUsed="0" w:defQFormat="0" w:count="371">
-    <w:lsdException w:name="Normal" w:uiPriority="0" w:qFormat="1"/>
-    <w:lsdException w:name="heading 1" w:uiPriority="9" w:qFormat="1"/>
-    <w:lsdException w:name="heading 2" w:semiHidden="1" w:uiPriority="9" w:unhideWhenUsed="1" w:qFormat="1"/>
-    <w:lsdException w:name="heading 3" w:semiHidden="1" w:uiPriority="9" w:unhideWhenUsed="1" w:qFormat="1"/>
-    <w:lsdException w:name="heading 4" w:semiHidden="1" w:uiPriority="9" w:unhideWhenUsed="1" w:qFormat="1"/>
-    <w:lsdException w:name="heading 5" w:semiHidden="1" w:uiPriority="9" w:unhideWhenUsed="1" w:qFormat="1"/>
-    <w:lsdException w:name="heading 6" w:semiHidden="1" w:uiPriority="9" w:unhideWhenUsed="1" w:qFormat="1"/>
-    <w:lsdException w:name="heading 7" w:semiHidden="1" w:uiPriority="9" w:unhideWhenUsed="1" w:qFormat="1"/>
-    <w:lsdException w:name="heading 8" w:semiHidden="1" w:uiPriority="9" w:unhideWhenUsed="1" w:qFormat="1"/>
-    <w:lsdException w:name="heading 9" w:semiHidden="1" w:uiPriority="9" w:unhideWhenUsed="1" w:qFormat="1"/>
-    <w:lsdException w:name="index 1" w:semiHidden="1" w:unhideWhenUsed="1"/>
-    <w:lsdException w:name="index 2" w:semiHidden="1" w:unhideWhenUsed="1"/>
-    <w:lsdException w:name="index 3" w:semiHidden="1" w:unhideWhenUsed="1"/>
-    <w:lsdException w:name="index 4" w:semiHidden="1" w:unhideWhenUsed="1"/>
-    <w:lsdException w:name="index 5" w:semiHidden="1" w:unhideWhenUsed="1"/>
-    <w:lsdException w:name="index 6" w:semiHidden="1" w:unhideWhenUsed="1"/>
-    <w:lsdException w:name="index 7" w:semiHidden="1" w:unhideWhenUsed="1"/>
-    <w:lsdException w:name="index 8" w:semiHidden="1" w:unhideWhenUsed="1"/>
-    <w:lsdException w:name="index 9" w:semiHidden="1" w:unhideWhenUsed="1"/>
-    <w:lsdException w:name="toc 1" w:semiHidden="1" w:uiPriority="39" w:unhideWhenUsed="1"/>
-    <w:lsdException w:name="toc 2" w:semiHidden="1" w:uiPriority="39" w:unhideWhenUsed="1"/>
-    <w:lsdException w:name="toc 3" w:semiHidden="1" w:uiPriority="39" w:unhideWhenUsed="1"/>
-    <w:lsdException w:name="toc 4" w:semiHidden="1" w:uiPriority="39" w:unhideWhenUsed="1"/>
-    <w:lsdException w:name="toc 5" w:semiHidden="1" w:uiPriority="39" w:unhideWhenUsed="1"/>
-    <w:lsdException w:name="toc 6" w:semiHidden="1" w:uiPriority="39" w:unhideWhenUsed="1"/>
-    <w:lsdException w:name="toc 7" w:semiHidden="1" w:uiPriority="39" w:unhideWhenUsed="1"/>
-    <w:lsdException w:name="toc 8" w:semiHidden="1" w:uiPriority="39" w:unhideWhenUsed="1"/>
-    <w:lsdException w:name="toc 9" w:semiHidden="1" w:uiPriority="39" w:unhideWhenUsed="1"/>
-    <w:lsdException w:name="Normal Indent" w:semiHidden="1" w:unhideWhenUsed="1"/>
-    <w:lsdException w:name="footnote text" w:semiHidden="1" w:unhideWhenUsed="1"/>
-    <w:lsdException w:name="annotation text" w:semiHidden="1" w:unhideWhenUsed="1"/>
-    <w:lsdException w:name="header" w:semiHidden="1" w:unhideWhenUsed="1"/>
-    <w:lsdException w:name="footer" w:semiHidden="1" w:unhideWhenUsed="1"/>
-    <w:lsdException w:name="index heading" w:semiHidden="1" w:unhideWhenUsed="1"/>
-    <w:lsdException w:name="caption" w:semiHidden="1" w:uiPriority="35" w:unhideWhenUsed="1" w:qFormat="1"/>
-    <w:lsdException w:name="table of figures" w:semiHidden="1" w:unhideWhenUsed="1"/>
-    <w:lsdException w:name="envelope address" w:semiHidden="1" w:unhideWhenUsed="1"/>
-    <w:lsdException w:name="envelope return" w:semiHidden="1" w:unhideWhenUsed="1"/>
-    <w:lsdException w:name="footnote reference" w:semiHidden="1" w:unhideWhenUsed="1"/>
-    <w:lsdException w:name="annotation reference" w:semiHidden="1" w:unhideWhenUsed="1"/>
-    <w:lsdException w:name="line number" w:semiHidden="1" w:unhideWhenUsed="1"/>
-    <w:lsdException w:name="page number" w:semiHidden="1" w:unhideWhenUsed="1"/>
-    <w:lsdException w:name="endnote reference" w:semiHidden="1" w:unhideWhenUsed="1"/>
-    <w:lsdException w:name="endnote text" w:semiHidden="1" w:unhideWhenUsed="1"/>
-    <w:lsdException w:name="table of authorities" w:semiHidden="1" w:unhideWhenUsed="1"/>
-    <w:lsdException w:name="macro" w:semiHidden="1" w:unhideWhenUsed="1"/>
-    <w:lsdException w:name="toa heading" w:semiHidden="1" w:unhideWhenUsed="1"/>
-    <w:lsdException w:name="List" w:semiHidden="1" w:unhideWhenUsed="1"/>
-    <w:lsdException w:name="List Bullet" w:semiHidden="1" w:unhideWhenUsed="1"/>
-    <w:lsdException w:name="List Number" w:semiHidden="1" w:unhideWhenUsed="1"/>
-    <w:lsdException w:name="List 2" w:semiHidden="1" w:unhideWhenUsed="1"/>
-    <w:lsdException w:name="List 3" w:semiHidden="1" w:unhideWhenUsed="1"/>
-    <w:lsdException w:name="List 4" w:semiHidden="1" w:unhideWhenUsed="1"/>
-    <w:lsdException w:name="List 5" w:semiHidden="1" w:unhideWhenUsed="1"/>
-    <w:lsdException w:name="List Bullet 2" w:semiHidden="1" w:unhideWhenUsed="1"/>
-    <w:lsdException w:name="List Bullet 3" w:semiHidden="1" w:unhideWhenUsed="1"/>
-    <w:lsdException w:name="List Bullet 4" w:semiHidden="1" w:unhideWhenUsed="1"/>
-    <w:lsdException w:name="List Bullet 5" w:semiHidden="1" w:unhideWhenUsed="1"/>
-    <w:lsdException w:name="List Number 2" w:semiHidden="1" w:unhideWhenUsed="1"/>
-    <w:lsdException w:name="List Number 3" w:semiHidden="1" w:unhideWhenUsed="1"/>
-    <w:lsdException w:name="List Number 4" w:semiHidden="1" w:unhideWhenUsed="1"/>
-    <w:lsdException w:name="List Number 5" w:semiHidden="1" w:unhideWhenUsed="1"/>
-    <w:lsdException w:name="Title" w:uiPriority="10" w:qFormat="1"/>
-    <w:lsdException w:name="Closing" w:semiHidden="1" w:unhideWhenUsed="1"/>
-    <w:lsdException w:name="Signature" w:semiHidden="1" w:unhideWhenUsed="1"/>
-    <w:lsdException w:name="Default Paragraph Font" w:semiHidden="1" w:uiPriority="1" w:unhideWhenUsed="1"/>
-    <w:lsdException w:name="Body Text" w:semiHidden="1" w:unhideWhenUsed="1"/>
-    <w:lsdException w:name="Body Text Indent" w:semiHidden="1" w:unhideWhenUsed="1"/>
-    <w:lsdException w:name="List Continue" w:semiHidden="1" w:unhideWhenUsed="1"/>
-    <w:lsdException w:name="List Continue 2" w:semiHidden="1" w:unhideWhenUsed="1"/>
-    <w:lsdException w:name="List Continue 3" w:semiHidden="1" w:unhideWhenUsed="1"/>
-    <w:lsdException w:name="List Continue 4" w:semiHidden="1" w:unhideWhenUsed="1"/>
-    <w:lsdException w:name="List Continue 5" w:semiHidden="1" w:unhideWhenUsed="1"/>
-    <w:lsdException w:name="Message Header" w:semiHidden="1" w:unhideWhenUsed="1"/>
-    <w:lsdException w:name="Subtitle" w:uiPriority="11" w:qFormat="1"/>
-    <w:lsdException w:name="Salutation" w:semiHidden="1" w:unhideWhenUsed="1"/>
-    <w:lsdException w:name="Date" w:semiHidden="1" w:unhideWhenUsed="1"/>
-    <w:lsdException w:name="Body Text First Indent" w:semiHidden="1" w:unhideWhenUsed="1"/>
-    <w:lsdException w:name="Body Text First Indent 2" w:semiHidden="1" w:unhideWhenUsed="1"/>
-    <w:lsdException w:name="Note Heading" w:semiHidden="1" w:unhideWhenUsed="1"/>
-    <w:lsdException w:name="Body Text 2" w:semiHidden="1" w:unhideWhenUsed="1"/>
-    <w:lsdException w:name="Body Text 3" w:semiHidden="1" w:unhideWhenUsed="1"/>
-    <w:lsdException w:name="Body Text Indent 2" w:semiHidden="1" w:unhideWhenUsed="1"/>
-    <w:lsdException w:name="Body Text Indent 3" w:semiHidden="1" w:unhideWhenUsed="1"/>
-    <w:lsdException w:name="Block Text" w:semiHidden="1" w:unhideWhenUsed="1"/>
-    <w:lsdException w:name="Hyperlink" w:semiHidden="1" w:unhideWhenUsed="1"/>
-    <w:lsdException w:name="FollowedHyperlink" w:semiHidden="1" w:unhideWhenUsed="1"/>
-    <w:lsdException w:name="Strong" w:uiPriority="22" w:qFormat="1"/>
-    <w:lsdException w:name="Emphasis" w:uiPriority="20" w:qFormat="1"/>
-    <w:lsdException w:name="Document Map" w:semiHidden="1" w:unhideWhenUsed="1"/>
-    <w:lsdException w:name="Plain Text" w:semiHidden="1" w:unhideWhenUsed="1"/>
-    <w:lsdException w:name="E-mail Signature" w:semiHidden="1" w:unhideWhenUsed="1"/>
-    <w:lsdException w:name="HTML Top of Form" w:semiHidden="1" w:unhideWhenUsed="1"/>
-    <w:lsdException w:name="HTML Bottom of Form" w:semiHidden="1" w:unhideWhenUsed="1"/>
-    <w:lsdException w:name="Normal (Web)" w:semiHidden="1" w:unhideWhenUsed="1"/>
-    <w:lsdException w:name="HTML Acronym" w:semiHidden="1" w:unhideWhenUsed="1"/>
-    <w:lsdException w:name="HTML Address" w:semiHidden="1" w:unhideWhenUsed="1"/>
-    <w:lsdException w:name="HTML Cite" w:semiHidden="1" w:unhideWhenUsed="1"/>
-    <w:lsdException w:name="HTML Code" w:semiHidden="1" w:unhideWhenUsed="1"/>
-    <w:lsdException w:name="HTML Definition" w:semiHidden="1" w:unhideWhenUsed="1"/>
-    <w:lsdException w:name="HTML Keyboard" w:semiHidden="1" w:unhideWhenUsed="1"/>
-    <w:lsdException w:name="HTML Preformatted" w:semiHidden="1" w:unhideWhenUsed="1"/>
-    <w:lsdException w:name="HTML Sample" w:semiHidden="1" w:unhideWhenUsed="1"/>
-    <w:lsdException w:name="HTML Typewriter" w:semiHidden="1" w:unhideWhenUsed="1"/>
-    <w:lsdException w:name="HTML Variable" w:semiHidden="1" w:unhideWhenUsed="1"/>
-    <w:lsdException w:name="Normal Table" w:semiHidden="1" w:unhideWhenUsed="1"/>
-    <w:lsdException w:name="annotation subject" w:semiHidden="1" w:unhideWhenUsed="1"/>
-    <w:lsdException w:name="No List" w:semiHidden="1" w:unhideWhenUsed="1"/>
-    <w:lsdException w:name="Outline List 1" w:semiHidden="1" w:unhideWhenUsed="1"/>
-    <w:lsdException w:name="Outline List 2" w:semiHidden="1" w:unhideWhenUsed="1"/>
-    <w:lsdException w:name="Outline List 3" w:semiHidden="1" w:unhideWhenUsed="1"/>
+  <w:latentStyles w:defLockedState="0" w:defUIPriority="0" w:defSemiHidden="0" w:defUnhideWhenUsed="0" w:defQFormat="0" w:count="376">
+    <w:lsdException w:name="heading 3" w:qFormat="1"/>
+    <w:lsdException w:name="heading 7" w:semiHidden="1" w:unhideWhenUsed="1" w:qFormat="1"/>
+    <w:lsdException w:name="heading 8" w:semiHidden="1" w:unhideWhenUsed="1" w:qFormat="1"/>
+    <w:lsdException w:name="heading 9" w:semiHidden="1" w:unhideWhenUsed="1" w:qFormat="1"/>
+    <w:lsdException w:name="header" w:uiPriority="99" w:unhideWhenUsed="1"/>
+    <w:lsdException w:name="footer" w:uiPriority="99" w:unhideWhenUsed="1"/>
+    <w:lsdException w:name="caption" w:semiHidden="1" w:unhideWhenUsed="1" w:qFormat="1"/>
+    <w:lsdException w:name="Title" w:qFormat="1"/>
+    <w:lsdException w:name="Default Paragraph Font" w:uiPriority="1" w:unhideWhenUsed="1" w:qFormat="1"/>
+    <w:lsdException w:name="Strong" w:qFormat="1"/>
+    <w:lsdException w:name="Emphasis" w:qFormat="1"/>
+    <w:lsdException w:name="HTML Top of Form" w:semiHidden="1" w:uiPriority="99" w:unhideWhenUsed="1"/>
+    <w:lsdException w:name="HTML Bottom of Form" w:semiHidden="1" w:uiPriority="99" w:unhideWhenUsed="1"/>
+    <w:lsdException w:name="Normal (Web)" w:semiHidden="1" w:uiPriority="99" w:unhideWhenUsed="1" w:qFormat="1"/>
+    <w:lsdException w:name="Normal Table" w:semiHidden="1" w:uiPriority="99" w:unhideWhenUsed="1"/>
+    <w:lsdException w:name="No List" w:semiHidden="1" w:uiPriority="99" w:unhideWhenUsed="1"/>
+    <w:lsdException w:name="Outline List 1" w:semiHidden="1" w:uiPriority="99" w:unhideWhenUsed="1"/>
+    <w:lsdException w:name="Outline List 2" w:semiHidden="1" w:uiPriority="99" w:unhideWhenUsed="1"/>
+    <w:lsdException w:name="Outline List 3" w:semiHidden="1" w:uiPriority="99" w:unhideWhenUsed="1"/>
     <w:lsdException w:name="Table Simple 1" w:semiHidden="1" w:unhideWhenUsed="1"/>
     <w:lsdException w:name="Table Simple 2" w:semiHidden="1" w:unhideWhenUsed="1"/>
     <w:lsdException w:name="Table Simple 3" w:semiHidden="1" w:unhideWhenUsed="1"/>
@@ -2502,11 +2310,10 @@
     <w:lsdException w:name="Table Web 1" w:semiHidden="1" w:unhideWhenUsed="1"/>
     <w:lsdException w:name="Table Web 2" w:semiHidden="1" w:unhideWhenUsed="1"/>
     <w:lsdException w:name="Table Web 3" w:semiHidden="1" w:unhideWhenUsed="1"/>
-    <w:lsdException w:name="Balloon Text" w:semiHidden="1" w:unhideWhenUsed="1"/>
-    <w:lsdException w:name="Table Grid" w:uiPriority="39"/>
+    <w:lsdException w:name="Table Grid" w:uiPriority="39" w:qFormat="1"/>
     <w:lsdException w:name="Table Theme" w:semiHidden="1" w:unhideWhenUsed="1"/>
-    <w:lsdException w:name="Placeholder Text" w:semiHidden="1"/>
-    <w:lsdException w:name="No Spacing" w:uiPriority="1" w:qFormat="1"/>
+    <w:lsdException w:name="Placeholder Text" w:semiHidden="1" w:uiPriority="99" w:unhideWhenUsed="1"/>
+    <w:lsdException w:name="No Spacing" w:semiHidden="1" w:uiPriority="99" w:unhideWhenUsed="1"/>
     <w:lsdException w:name="Light Shading" w:uiPriority="60"/>
     <w:lsdException w:name="Light List" w:uiPriority="61"/>
     <w:lsdException w:name="Light Grid" w:uiPriority="62"/>
@@ -2527,10 +2334,10 @@
     <w:lsdException w:name="Medium Shading 1 Accent 1" w:uiPriority="63"/>
     <w:lsdException w:name="Medium Shading 2 Accent 1" w:uiPriority="64"/>
     <w:lsdException w:name="Medium List 1 Accent 1" w:uiPriority="65"/>
-    <w:lsdException w:name="Revision" w:semiHidden="1"/>
+    <w:lsdException w:name="Revision" w:semiHidden="1" w:uiPriority="99" w:unhideWhenUsed="1"/>
     <w:lsdException w:name="List Paragraph" w:uiPriority="34" w:qFormat="1"/>
-    <w:lsdException w:name="Quote" w:uiPriority="29" w:qFormat="1"/>
-    <w:lsdException w:name="Intense Quote" w:uiPriority="30" w:qFormat="1"/>
+    <w:lsdException w:name="Quote" w:semiHidden="1" w:uiPriority="99" w:unhideWhenUsed="1"/>
+    <w:lsdException w:name="Intense Quote" w:semiHidden="1" w:uiPriority="99" w:unhideWhenUsed="1"/>
     <w:lsdException w:name="Medium List 2 Accent 1" w:uiPriority="66"/>
     <w:lsdException w:name="Medium Grid 1 Accent 1" w:uiPriority="67"/>
     <w:lsdException w:name="Medium Grid 2 Accent 1" w:uiPriority="68"/>
@@ -2720,10 +2527,22 @@
     <w:lsdException w:name="List Table 5 Dark Accent 6" w:uiPriority="50"/>
     <w:lsdException w:name="List Table 6 Colorful Accent 6" w:uiPriority="51"/>
     <w:lsdException w:name="List Table 7 Colorful Accent 6" w:uiPriority="52"/>
+    <w:lsdException w:name="Mention" w:semiHidden="1" w:uiPriority="99" w:unhideWhenUsed="1"/>
+    <w:lsdException w:name="Smart Hyperlink" w:semiHidden="1" w:uiPriority="99" w:unhideWhenUsed="1"/>
+    <w:lsdException w:name="Hashtag" w:semiHidden="1" w:uiPriority="99" w:unhideWhenUsed="1"/>
+    <w:lsdException w:name="Unresolved Mention" w:semiHidden="1" w:uiPriority="99" w:unhideWhenUsed="1"/>
+    <w:lsdException w:name="Smart Link" w:semiHidden="1" w:uiPriority="99" w:unhideWhenUsed="1"/>
   </w:latentStyles>
   <w:style w:type="paragraph" w:default="1" w:styleId="Normal">
     <w:name w:val="Normal"/>
-    <w:qFormat/>
+    <w:pPr>
+      <w:spacing w:line="259" w:lineRule="auto"/>
+    </w:pPr>
+    <w:rPr>
+      <w:sz w:val="22"/>
+      <w:szCs w:val="22"/>
+      <w:lang w:val="en"/>
+    </w:rPr>
   </w:style>
   <w:style w:type="paragraph" w:styleId="Heading1">
     <w:name w:val="heading 1"/>
@@ -2761,6 +2580,7 @@
     <w:name w:val="heading 3"/>
     <w:basedOn w:val="Normal"/>
     <w:next w:val="Normal"/>
+    <w:qFormat/>
     <w:pPr>
       <w:keepNext/>
       <w:keepLines/>
@@ -2846,20 +2666,33 @@
     <w:semiHidden/>
     <w:unhideWhenUsed/>
   </w:style>
-  <w:style w:type="paragraph" w:styleId="Title">
-    <w:name w:val="Title"/>
+  <w:style w:type="paragraph" w:styleId="Footer">
+    <w:name w:val="footer"/>
     <w:basedOn w:val="Normal"/>
-    <w:next w:val="Normal"/>
+    <w:link w:val="FooterChar"/>
+    <w:uiPriority w:val="99"/>
+    <w:unhideWhenUsed/>
     <w:pPr>
-      <w:keepNext/>
-      <w:keepLines/>
-      <w:spacing w:before="480" w:after="120"/>
+      <w:tabs>
+        <w:tab w:val="center" w:pos="4680"/>
+        <w:tab w:val="right" w:pos="9360"/>
+      </w:tabs>
+      <w:spacing w:after="0" w:line="240" w:lineRule="auto"/>
     </w:pPr>
-    <w:rPr>
-      <w:b/>
-      <w:sz w:val="72"/>
-      <w:szCs w:val="72"/>
-    </w:rPr>
+  </w:style>
+  <w:style w:type="paragraph" w:styleId="Header">
+    <w:name w:val="header"/>
+    <w:basedOn w:val="Normal"/>
+    <w:link w:val="HeaderChar"/>
+    <w:uiPriority w:val="99"/>
+    <w:unhideWhenUsed/>
+    <w:pPr>
+      <w:tabs>
+        <w:tab w:val="center" w:pos="4680"/>
+        <w:tab w:val="right" w:pos="9360"/>
+      </w:tabs>
+      <w:spacing w:after="0" w:line="240" w:lineRule="auto"/>
+    </w:pPr>
   </w:style>
   <w:style w:type="paragraph" w:styleId="NormalWeb">
     <w:name w:val="Normal (Web)"/>
@@ -2867,7 +2700,7 @@
     <w:uiPriority w:val="99"/>
     <w:semiHidden/>
     <w:unhideWhenUsed/>
-    <w:rsid w:val="00276DCA"/>
+    <w:qFormat/>
     <w:pPr>
       <w:spacing w:before="100" w:beforeAutospacing="1" w:after="100" w:afterAutospacing="1" w:line="240" w:lineRule="auto"/>
     </w:pPr>
@@ -2876,80 +2709,6 @@
       <w:sz w:val="24"/>
       <w:szCs w:val="24"/>
     </w:rPr>
-  </w:style>
-  <w:style w:type="table" w:styleId="TableGrid">
-    <w:name w:val="Table Grid"/>
-    <w:basedOn w:val="TableNormal"/>
-    <w:uiPriority w:val="39"/>
-    <w:rsid w:val="009709C6"/>
-    <w:pPr>
-      <w:spacing w:after="0" w:line="240" w:lineRule="auto"/>
-    </w:pPr>
-    <w:tblPr>
-      <w:tblBorders>
-        <w:top w:val="single" w:sz="4" w:space="0" w:color="auto"/>
-        <w:left w:val="single" w:sz="4" w:space="0" w:color="auto"/>
-        <w:bottom w:val="single" w:sz="4" w:space="0" w:color="auto"/>
-        <w:right w:val="single" w:sz="4" w:space="0" w:color="auto"/>
-        <w:insideH w:val="single" w:sz="4" w:space="0" w:color="auto"/>
-        <w:insideV w:val="single" w:sz="4" w:space="0" w:color="auto"/>
-      </w:tblBorders>
-    </w:tblPr>
-  </w:style>
-  <w:style w:type="paragraph" w:styleId="ListParagraph">
-    <w:name w:val="List Paragraph"/>
-    <w:basedOn w:val="Normal"/>
-    <w:uiPriority w:val="34"/>
-    <w:qFormat/>
-    <w:rsid w:val="006612BB"/>
-    <w:pPr>
-      <w:ind w:left="720"/>
-      <w:contextualSpacing/>
-    </w:pPr>
-  </w:style>
-  <w:style w:type="paragraph" w:styleId="Header">
-    <w:name w:val="header"/>
-    <w:basedOn w:val="Normal"/>
-    <w:link w:val="HeaderChar"/>
-    <w:uiPriority w:val="99"/>
-    <w:unhideWhenUsed/>
-    <w:rsid w:val="006612BB"/>
-    <w:pPr>
-      <w:tabs>
-        <w:tab w:val="center" w:pos="4680"/>
-        <w:tab w:val="right" w:pos="9360"/>
-      </w:tabs>
-      <w:spacing w:after="0" w:line="240" w:lineRule="auto"/>
-    </w:pPr>
-  </w:style>
-  <w:style w:type="character" w:customStyle="1" w:styleId="HeaderChar">
-    <w:name w:val="Header Char"/>
-    <w:basedOn w:val="DefaultParagraphFont"/>
-    <w:link w:val="Header"/>
-    <w:uiPriority w:val="99"/>
-    <w:rsid w:val="006612BB"/>
-  </w:style>
-  <w:style w:type="paragraph" w:styleId="Footer">
-    <w:name w:val="footer"/>
-    <w:basedOn w:val="Normal"/>
-    <w:link w:val="FooterChar"/>
-    <w:uiPriority w:val="99"/>
-    <w:unhideWhenUsed/>
-    <w:rsid w:val="006612BB"/>
-    <w:pPr>
-      <w:tabs>
-        <w:tab w:val="center" w:pos="4680"/>
-        <w:tab w:val="right" w:pos="9360"/>
-      </w:tabs>
-      <w:spacing w:after="0" w:line="240" w:lineRule="auto"/>
-    </w:pPr>
-  </w:style>
-  <w:style w:type="character" w:customStyle="1" w:styleId="FooterChar">
-    <w:name w:val="Footer Char"/>
-    <w:basedOn w:val="DefaultParagraphFont"/>
-    <w:link w:val="Footer"/>
-    <w:uiPriority w:val="99"/>
-    <w:rsid w:val="006612BB"/>
   </w:style>
   <w:style w:type="paragraph" w:styleId="Subtitle">
     <w:name w:val="Subtitle"/>
@@ -2968,24 +2727,113 @@
       <w:szCs w:val="48"/>
     </w:rPr>
   </w:style>
-  <w:style w:type="table" w:customStyle="1" w:styleId="a">
-    <w:basedOn w:val="TableNormal"/>
+  <w:style w:type="paragraph" w:styleId="Title">
+    <w:name w:val="Title"/>
+    <w:basedOn w:val="Normal"/>
+    <w:next w:val="Normal"/>
+    <w:qFormat/>
+    <w:pPr>
+      <w:keepNext/>
+      <w:keepLines/>
+      <w:spacing w:before="480" w:after="120"/>
+    </w:pPr>
+    <w:rPr>
+      <w:b/>
+      <w:sz w:val="72"/>
+      <w:szCs w:val="72"/>
+    </w:rPr>
+  </w:style>
+  <w:style w:type="table" w:styleId="TableGrid">
+    <w:name w:val="Table Grid"/>
+    <w:basedOn w:val="TableNormal0"/>
+    <w:uiPriority w:val="39"/>
+    <w:qFormat/>
     <w:pPr>
       <w:spacing w:after="0" w:line="240" w:lineRule="auto"/>
     </w:pPr>
     <w:tblPr>
-      <w:tblStyleRowBandSize w:val="1"/>
-      <w:tblStyleColBandSize w:val="1"/>
+      <w:tblBorders>
+        <w:top w:val="single" w:sz="4" w:space="0" w:color="auto"/>
+        <w:left w:val="single" w:sz="4" w:space="0" w:color="auto"/>
+        <w:bottom w:val="single" w:sz="4" w:space="0" w:color="auto"/>
+        <w:right w:val="single" w:sz="4" w:space="0" w:color="auto"/>
+        <w:insideH w:val="single" w:sz="4" w:space="0" w:color="auto"/>
+        <w:insideV w:val="single" w:sz="4" w:space="0" w:color="auto"/>
+      </w:tblBorders>
     </w:tblPr>
   </w:style>
-  <w:style w:type="table" w:customStyle="1" w:styleId="a0">
-    <w:basedOn w:val="TableNormal"/>
+  <w:style w:type="table" w:customStyle="1" w:styleId="TableNormal0">
+    <w:name w:val="TableNormal"/>
+    <w:tblPr>
+      <w:tblCellMar>
+        <w:top w:w="100" w:type="dxa"/>
+        <w:left w:w="100" w:type="dxa"/>
+        <w:bottom w:w="100" w:type="dxa"/>
+        <w:right w:w="100" w:type="dxa"/>
+      </w:tblCellMar>
+    </w:tblPr>
+  </w:style>
+  <w:style w:type="paragraph" w:styleId="ListParagraph">
+    <w:name w:val="List Paragraph"/>
+    <w:basedOn w:val="Normal"/>
+    <w:uiPriority w:val="34"/>
+    <w:qFormat/>
+    <w:pPr>
+      <w:ind w:left="720"/>
+      <w:contextualSpacing/>
+    </w:pPr>
+  </w:style>
+  <w:style w:type="character" w:customStyle="1" w:styleId="HeaderChar">
+    <w:name w:val="Header Char"/>
+    <w:basedOn w:val="DefaultParagraphFont"/>
+    <w:link w:val="Header"/>
+    <w:uiPriority w:val="99"/>
+    <w:qFormat/>
+  </w:style>
+  <w:style w:type="character" w:customStyle="1" w:styleId="FooterChar">
+    <w:name w:val="Footer Char"/>
+    <w:basedOn w:val="DefaultParagraphFont"/>
+    <w:link w:val="Footer"/>
+    <w:uiPriority w:val="99"/>
+    <w:qFormat/>
+  </w:style>
+  <w:style w:type="table" w:customStyle="1" w:styleId="Style18">
+    <w:name w:val="_Style 18"/>
+    <w:basedOn w:val="TableNormal0"/>
+    <w:qFormat/>
+    <w:pPr>
+      <w:spacing w:after="0" w:line="240" w:lineRule="auto"/>
+    </w:pPr>
+    <w:tblPr/>
+  </w:style>
+  <w:style w:type="table" w:customStyle="1" w:styleId="Style19">
+    <w:name w:val="_Style 19"/>
+    <w:basedOn w:val="TableNormal0"/>
+    <w:pPr>
+      <w:spacing w:after="0" w:line="240" w:lineRule="auto"/>
+    </w:pPr>
+    <w:tblPr/>
+  </w:style>
+  <w:style w:type="table" w:customStyle="1" w:styleId="Style21">
+    <w:name w:val="_Style 21"/>
+    <w:basedOn w:val="TableNormal0"/>
+    <w:qFormat/>
+    <w:tblPr/>
+  </w:style>
+  <w:style w:type="table" w:customStyle="1" w:styleId="Style22">
+    <w:name w:val="_Style 22"/>
+    <w:basedOn w:val="TableNormal0"/>
+    <w:qFormat/>
     <w:pPr>
       <w:spacing w:after="0" w:line="240" w:lineRule="auto"/>
     </w:pPr>
     <w:tblPr>
-      <w:tblStyleRowBandSize w:val="1"/>
-      <w:tblStyleColBandSize w:val="1"/>
+      <w:tblCellMar>
+        <w:top w:w="0" w:type="dxa"/>
+        <w:left w:w="108" w:type="dxa"/>
+        <w:bottom w:w="0" w:type="dxa"/>
+        <w:right w:w="108" w:type="dxa"/>
+      </w:tblCellMar>
     </w:tblPr>
   </w:style>
 </w:styles>
@@ -3034,7 +2882,7 @@
     </a:clrScheme>
     <a:fontScheme name="Office">
       <a:majorFont>
-        <a:latin typeface="Calibri Light" panose="020F0302020204030204"/>
+        <a:latin typeface="Calibri Light"/>
         <a:ea typeface=""/>
         <a:cs typeface=""/>
         <a:font script="Jpan" typeface="ＭＳ ゴシック"/>
@@ -3069,7 +2917,7 @@
         <a:font script="Geor" typeface="Sylfaen"/>
       </a:majorFont>
       <a:minorFont>
-        <a:latin typeface="Calibri" panose="020F0502020204030204"/>
+        <a:latin typeface="Calibri"/>
         <a:ea typeface=""/>
         <a:cs typeface=""/>
         <a:font script="Jpan" typeface="ＭＳ 明朝"/>
@@ -3244,18 +3092,24 @@
   </a:themeElements>
   <a:objectDefaults/>
   <a:extraClrSchemeLst/>
-  <a:extLst>
-    <a:ext uri="{05A4C25C-085E-4340-85A3-A5531E510DB2}">
-      <thm15:themeFamily xmlns:thm15="http://schemas.microsoft.com/office/thememl/2012/main" name="Office Theme" id="{62F939B6-93AF-4DB8-9C6B-D6C7DFDC589F}" vid="{4A3C46E8-61CC-4603-A589-7422A47A8E4A}"/>
-    </a:ext>
-  </a:extLst>
 </a:theme>
 </file>
 
 <file path=customXml/item1.xml><?xml version="1.0" encoding="utf-8"?>
 <go:gDocsCustomXmlDataStorage xmlns:go="http://customooxmlschemas.google.com/" xmlns:r="http://schemas.openxmlformats.org/officeDocument/2006/relationships" uri="GoogleDocsCustomDataVersion2">
-  <go:docsCustomData xmlns:go="http://customooxmlschemas.google.com/" roundtripDataSignature="AMtx7mg2Zy5R7qJDj1z1SaIx+ObFG1qKYQ==">CgMxLjAyCGguZ2pkZ3hzOAByITFqNWRLdE9faTJDdjJvcTBnTVJ4STN5M0RldW9zQ3NtUA==</go:docsCustomData>
+  <go:docsCustomData xmlns:go="http://customooxmlschemas.google.com/" roundtripDataSignature="AMtx7mjNjfh5PL8Typ4BMGt4lduMWoTknA==">CgMxLjAaHwoBMBIaChgICVIUChJ0YWJsZS4yaXpqb2Vxa21lMzAyCGguZ2pkZ3hzMg5oLjdmdnl5djQ1M2x1cDgAciExd1ZySkJUU1VBZnBwM01MVFVISUFERnZNYlpLX29WT3k=</go:docsCustomData>
 </go:gDocsCustomXmlDataStorage>
+</file>
+
+<file path=customXml/item2.xml><?xml version="1.0" encoding="utf-8"?>
+<s:customData xmlns="http://www.wps.cn/officeDocument/2013/wpsCustomData" xmlns:s="http://www.wps.cn/officeDocument/2013/wpsCustomData">
+  <customSectProps>
+    <customSectPr/>
+  </customSectProps>
+  <customShpExts>
+    <customShpInfo spid="_x0000_s1026" textRotate="1"/>
+  </customShpExts>
+</s:customData>
 </file>
 
 <file path=customXml/itemProps1.xml><?xml version="1.0" encoding="utf-8"?>
@@ -3265,4 +3119,12 @@
     <ds:schemaRef ds:uri="http://schemas.openxmlformats.org/officeDocument/2006/relationships"/>
   </ds:schemaRefs>
 </ds:datastoreItem>
+</file>
+
+<file path=customXml/itemProps2.xml><?xml version="1.0" encoding="utf-8"?>
+<ds:datastoreItem xmlns:ds="http://schemas.openxmlformats.org/officeDocument/2006/customXml" ds:itemID="{B1977F7D-205B-4081-913C-38D41E755F92}">
+  <ds:schemaRefs>
+    <ds:schemaRef ds:uri="http://www.wps.cn/officeDocument/2013/wpsCustomData"/>
+  </ds:schemaRefs>
+</ds:datastoreItem>
 </file>
</xml_diff>